<commit_message>
Results page and thank-you page redesigned; charts after the feedback
Results page: "What your results show" (what the first parts and the six
scenarios measured, in lay words), three score boxes colored by family
(value alignment VCI/VCI_all, stability Stability/Stability_all with
"Not tested", performance), the four values before and after, the
last-step card, and every scenario as a compact card that keeps every
detail of the old boxes. The charts button is gone.

Thank-you page: the charts in five colored tab cards (JourneyTabs), after
the feedback, so no feedback answer can follow a look at them. The check
circle sets its own colors (a nested Chakra gradient inherited the card's
and hid the check in light mode).

analysis.results_page loses its chart fields (SHAPE_VERSION
2026-09-29-results-redesign). D66 and J9 rewritten, J11 extended, J12 new;
8 deliberate breaks, 8 caught. Docs, audit R21 and the checklist updated.

Co-Authored-By: Claude Opus 5.5 <noreply@anthropic.com>
</commit_message>
<xml_diff>
--- a/docs/VRDS_Accuracy_Checklist.docx
+++ b/docs/VRDS_Accuracy_Checklist.docx
@@ -41,7 +41,7 @@
           <w:color w:val="595959"/>
           <w:sz w:val="20"/>
         </w:rPr>
-        <w:t>For Waseem and Claude  ·  29 September 2026  ·  code at commit a6b2675 on Dev-Prod-branch-Edit_9_23</w:t>
+        <w:t>For Waseem and Claude  ·  29 September 2026  ·  code at commit 477a7c0 on Dev-Prod-branch-Edit_9_23</w:t>
       </w:r>
     </w:p>
     <w:p>
@@ -60,7 +60,7 @@
         <w:rPr>
           <w:color w:val="595959"/>
         </w:rPr>
-        <w:t xml:space="preserve">  (run 29 September 2026 at 18:15, when this file was made).</w:t>
+        <w:t xml:space="preserve">  (run 29 September 2026 at 20:28, when this file was made).</w:t>
       </w:r>
     </w:p>
     <w:p>
@@ -211,7 +211,7 @@
                 <w:color w:val="262626"/>
                 <w:sz w:val="19"/>
               </w:rPr>
-              <w:t>2026-09-29-stability-all</w:t>
+              <w:t>2026-09-29-results-redesign</w:t>
             </w:r>
           </w:p>
         </w:tc>
@@ -3529,7 +3529,7 @@
                 <w:color w:val="262626"/>
                 <w:sz w:val="19"/>
               </w:rPr>
-              <w:t>"Would you approve the policy?" before any voice and after each, with confidence first and last, appears on the charts page in the words the participant saw.</w:t>
+              <w:t>"Would you approve the policy?" before any voice and after each, with confidence first and last, appears in the charts (the thank-you page's "Your first answers" tab) in the words the participant saw.</w:t>
             </w:r>
           </w:p>
         </w:tc>
@@ -4019,7 +4019,7 @@
                 <w:color w:val="262626"/>
                 <w:sz w:val="19"/>
               </w:rPr>
-              <w:t>Stability's own rule over all six, on the running values: the four decisions count exactly as Stability does, the wish and the veil when the final choice was not one of the two best fits. It is never above Stability. Shown beside Stability on the results page.</w:t>
+              <w:t>Stability's own rule over all six, on the running values: the four decisions count exactly as Stability does, the wish and the veil when the final choice was not one of the two best fits. It is never above Stability. Shown beside Stability in the results page's stability box.</w:t>
             </w:r>
           </w:p>
         </w:tc>
@@ -5229,7 +5229,7 @@
                 <w:color w:val="262626"/>
                 <w:sz w:val="19"/>
               </w:rPr>
-              <w:t>analysis.results_page: the card, the bottom bar, or the bottom of the results or charts page, and whether the charts were opened first.</w:t>
+              <w:t>analysis.results_page: the card under the scores, the bottom bar, or the button at the bottom of the results page, with every move and its time. No chart fields: the charts come after the feedback.</w:t>
             </w:r>
           </w:p>
         </w:tc>
@@ -5787,7 +5787,187 @@
                 <w:color w:val="262626"/>
                 <w:sz w:val="19"/>
               </w:rPr>
-              <w:t>The charts page matches the database.</w:t>
+              <w:t>The results page speaks plainly and keeps every detail.</w:t>
+            </w:r>
+          </w:p>
+        </w:tc>
+        <w:tc>
+          <w:tcPr>
+            <w:tcW w:type="dxa" w:w="4968"/>
+            <w:vAlign w:val="center"/>
+          </w:tcPr>
+          <w:p>
+            <w:pPr>
+              <w:spacing w:after="20" w:before="20"/>
+            </w:pPr>
+            <w:r/>
+            <w:r>
+              <w:rPr>
+                <w:b w:val="0"/>
+                <w:i w:val="0"/>
+                <w:color w:val="262626"/>
+                <w:sz w:val="19"/>
+              </w:rPr>
+              <w:t>"What your results show", three colored score boxes (alignment, stability, performance) with "Not tested" where nothing was tested, and every scenario as a compact card with its choice, label, Fit and reflection badges. No block numbers, "CVR" or "MPF".</w:t>
+            </w:r>
+          </w:p>
+        </w:tc>
+        <w:tc>
+          <w:tcPr>
+            <w:tcW w:type="dxa" w:w="1800"/>
+            <w:vAlign w:val="center"/>
+          </w:tcPr>
+          <w:p>
+            <w:pPr>
+              <w:spacing w:after="20" w:before="20"/>
+            </w:pPr>
+            <w:r/>
+            <w:r>
+              <w:rPr>
+                <w:b w:val="0"/>
+                <w:i w:val="0"/>
+                <w:color w:val="595959"/>
+                <w:sz w:val="17"/>
+              </w:rPr>
+              <w:t>validate:journey (J11, J12)</w:t>
+            </w:r>
+          </w:p>
+        </w:tc>
+      </w:tr>
+      <w:tr>
+        <w:trPr>
+          <w:cantSplit w:val="true"/>
+        </w:trPr>
+        <w:tc>
+          <w:tcPr>
+            <w:tcW w:type="dxa" w:w="504"/>
+            <w:vAlign w:val="center"/>
+            <w:shd w:val="clear" w:color="auto" w:fill="E8F5EC"/>
+          </w:tcPr>
+          <w:p>
+            <w:pPr>
+              <w:spacing w:after="20" w:before="20"/>
+            </w:pPr>
+            <w:r/>
+            <w:r>
+              <w:rPr>
+                <w:b/>
+                <w:i w:val="0"/>
+                <w:color w:val="1B7A3E"/>
+                <w:sz w:val="22"/>
+              </w:rPr>
+              <w:t>✔</w:t>
+            </w:r>
+          </w:p>
+        </w:tc>
+        <w:tc>
+          <w:tcPr>
+            <w:tcW w:type="dxa" w:w="2808"/>
+            <w:vAlign w:val="center"/>
+          </w:tcPr>
+          <w:p>
+            <w:pPr>
+              <w:spacing w:after="20" w:before="20"/>
+            </w:pPr>
+            <w:r/>
+            <w:r>
+              <w:rPr>
+                <w:b/>
+                <w:i w:val="0"/>
+                <w:color w:val="262626"/>
+                <w:sz w:val="19"/>
+              </w:rPr>
+              <w:t>The charts come after the feedback, in five tabs.</w:t>
+            </w:r>
+          </w:p>
+        </w:tc>
+        <w:tc>
+          <w:tcPr>
+            <w:tcW w:type="dxa" w:w="4968"/>
+            <w:vAlign w:val="center"/>
+          </w:tcPr>
+          <w:p>
+            <w:pPr>
+              <w:spacing w:after="20" w:before="20"/>
+            </w:pPr>
+            <w:r/>
+            <w:r>
+              <w:rPr>
+                <w:b w:val="0"/>
+                <w:i w:val="0"/>
+                <w:color w:val="262626"/>
+                <w:sz w:val="19"/>
+              </w:rPr>
+              <w:t>They are on the thank-you page only, and every chart sits in exactly one tab, so none can be lost.</w:t>
+            </w:r>
+          </w:p>
+        </w:tc>
+        <w:tc>
+          <w:tcPr>
+            <w:tcW w:type="dxa" w:w="1800"/>
+            <w:vAlign w:val="center"/>
+          </w:tcPr>
+          <w:p>
+            <w:pPr>
+              <w:spacing w:after="20" w:before="20"/>
+            </w:pPr>
+            <w:r/>
+            <w:r>
+              <w:rPr>
+                <w:b w:val="0"/>
+                <w:i w:val="0"/>
+                <w:color w:val="595959"/>
+                <w:sz w:val="17"/>
+              </w:rPr>
+              <w:t>validate:journey (J12)</w:t>
+            </w:r>
+          </w:p>
+        </w:tc>
+      </w:tr>
+      <w:tr>
+        <w:trPr>
+          <w:cantSplit w:val="true"/>
+        </w:trPr>
+        <w:tc>
+          <w:tcPr>
+            <w:tcW w:type="dxa" w:w="504"/>
+            <w:vAlign w:val="center"/>
+            <w:shd w:val="clear" w:color="auto" w:fill="E8F5EC"/>
+          </w:tcPr>
+          <w:p>
+            <w:pPr>
+              <w:spacing w:after="20" w:before="20"/>
+            </w:pPr>
+            <w:r/>
+            <w:r>
+              <w:rPr>
+                <w:b/>
+                <w:i w:val="0"/>
+                <w:color w:val="1B7A3E"/>
+                <w:sz w:val="22"/>
+              </w:rPr>
+              <w:t>✔</w:t>
+            </w:r>
+          </w:p>
+        </w:tc>
+        <w:tc>
+          <w:tcPr>
+            <w:tcW w:type="dxa" w:w="2808"/>
+            <w:vAlign w:val="center"/>
+          </w:tcPr>
+          <w:p>
+            <w:pPr>
+              <w:spacing w:after="20" w:before="20"/>
+            </w:pPr>
+            <w:r/>
+            <w:r>
+              <w:rPr>
+                <w:b/>
+                <w:i w:val="0"/>
+                <w:color w:val="262626"/>
+                <w:sz w:val="19"/>
+              </w:rPr>
+              <w:t>The charts match the database.</w:t>
             </w:r>
           </w:p>
         </w:tc>
@@ -8236,7 +8416,7 @@
                 <w:color w:val="595959"/>
                 <w:sz w:val="17"/>
               </w:rPr>
-              <w:t>12</w:t>
+              <w:t>14</w:t>
             </w:r>
           </w:p>
         </w:tc>
@@ -8325,7 +8505,7 @@
                 <w:color w:val="595959"/>
                 <w:sz w:val="17"/>
               </w:rPr>
-              <w:t>14</w:t>
+              <w:t>17</w:t>
             </w:r>
           </w:p>
         </w:tc>
@@ -9283,7 +9463,7 @@
                 <w:color w:val="595959"/>
                 <w:sz w:val="17"/>
               </w:rPr>
-              <w:t>[PASS] K1  the committed tables are exactly what the recipe produces (200000 draws, 3.3s)</w:t>
+              <w:t>[PASS] K1  the committed tables are exactly what the recipe produces (200000 draws, 3.4s)</w:t>
             </w:r>
           </w:p>
         </w:tc>
@@ -9304,7 +9484,7 @@
                 <w:color w:val="595959"/>
                 <w:sz w:val="17"/>
               </w:rPr>
-              <w:t>5</w:t>
+              <w:t>6</w:t>
             </w:r>
           </w:p>
         </w:tc>
@@ -9393,7 +9573,7 @@
                 <w:color w:val="595959"/>
                 <w:sz w:val="17"/>
               </w:rPr>
-              <w:t>7</w:t>
+              <w:t>8</w:t>
             </w:r>
           </w:p>
         </w:tc>
@@ -9482,7 +9662,7 @@
                 <w:color w:val="595959"/>
                 <w:sz w:val="17"/>
               </w:rPr>
-              <w:t>12</w:t>
+              <w:t>13</w:t>
             </w:r>
           </w:p>
         </w:tc>
@@ -10016,7 +10196,7 @@
                 <w:color w:val="595959"/>
                 <w:sz w:val="17"/>
               </w:rPr>
-              <w:t>5</w:t>
+              <w:t>6</w:t>
             </w:r>
           </w:p>
         </w:tc>
@@ -10173,7 +10353,7 @@
                 <w:color w:val="595959"/>
                 <w:sz w:val="17"/>
               </w:rPr>
-              <w:t>✓ built in 865ms</w:t>
+              <w:t>✓ built in 958ms</w:t>
             </w:r>
           </w:p>
         </w:tc>

</xml_diff>

<commit_message>
Scenario 6: no performance chart in the Compare overlay
Its four rules all score 50 on every measure and scenario 6 shows no
performance numbers anywhere, so the chart drew four identical flat
shapes (the researcher's request). The values chart stays alone and
centred; the overlay's words say "one chart". M11 extended; one
deliberate break caught. Docs, audit log and checklist updated.

Co-Authored-By: Claude Opus 5.5 <noreply@anthropic.com>
</commit_message>
<xml_diff>
--- a/docs/VRDS_Accuracy_Checklist.docx
+++ b/docs/VRDS_Accuracy_Checklist.docx
@@ -41,7 +41,7 @@
           <w:color w:val="595959"/>
           <w:sz w:val="20"/>
         </w:rPr>
-        <w:t>For Waseem and Claude  ·  29 September 2026  ·  code at commit 477a7c0 on Dev-Prod-branch-Edit_9_23</w:t>
+        <w:t>For Waseem and Claude  ·  29 September 2026  ·  code at commit 41b1765 on Dev-Prod-branch-Edit_9_23</w:t>
       </w:r>
     </w:p>
     <w:p>
@@ -60,7 +60,7 @@
         <w:rPr>
           <w:color w:val="595959"/>
         </w:rPr>
-        <w:t xml:space="preserve">  (run 29 September 2026 at 20:28, when this file was made).</w:t>
+        <w:t xml:space="preserve">  (run 29 September 2026 at 20:48, when this file was made).</w:t>
       </w:r>
     </w:p>
     <w:p>
@@ -5607,7 +5607,7 @@
                 <w:color w:val="262626"/>
                 <w:sz w:val="19"/>
               </w:rPr>
-              <w:t>Scenario 6 has no MCF and no "Your values in this scenario" panel.</w:t>
+              <w:t>Scenario 6 has no MCF, no "Your values in this scenario" panel, and no performance chart.</w:t>
             </w:r>
           </w:p>
         </w:tc>
@@ -5628,7 +5628,7 @@
                 <w:color w:val="262626"/>
                 <w:sz w:val="19"/>
               </w:rPr>
-              <w:t>So the prediction test cannot become "pick your value".</w:t>
+              <w:t>So the prediction test cannot become "pick your value"; and its rules all score 50, so a performance chart would show four identical flat shapes.</w:t>
             </w:r>
           </w:p>
         </w:tc>
@@ -8416,7 +8416,7 @@
                 <w:color w:val="595959"/>
                 <w:sz w:val="17"/>
               </w:rPr>
-              <w:t>14</w:t>
+              <w:t>16</w:t>
             </w:r>
           </w:p>
         </w:tc>
@@ -8505,7 +8505,7 @@
                 <w:color w:val="595959"/>
                 <w:sz w:val="17"/>
               </w:rPr>
-              <w:t>17</w:t>
+              <w:t>18</w:t>
             </w:r>
           </w:p>
         </w:tc>
@@ -9484,7 +9484,7 @@
                 <w:color w:val="595959"/>
                 <w:sz w:val="17"/>
               </w:rPr>
-              <w:t>6</w:t>
+              <w:t>5</w:t>
             </w:r>
           </w:p>
         </w:tc>
@@ -9662,7 +9662,7 @@
                 <w:color w:val="595959"/>
                 <w:sz w:val="17"/>
               </w:rPr>
-              <w:t>13</w:t>
+              <w:t>12</w:t>
             </w:r>
           </w:p>
         </w:tc>
@@ -10196,7 +10196,7 @@
                 <w:color w:val="595959"/>
                 <w:sz w:val="17"/>
               </w:rPr>
-              <w:t>6</w:t>
+              <w:t>5</w:t>
             </w:r>
           </w:p>
         </w:tc>
@@ -10353,7 +10353,7 @@
                 <w:color w:val="595959"/>
                 <w:sz w:val="17"/>
               </w:rPr>
-              <w:t>✓ built in 958ms</w:t>
+              <w:t>✓ built in 878ms</w:t>
             </w:r>
           </w:p>
         </w:tc>

</xml_diff>

<commit_message>
The country question on "A little about you"
A fourth, required question, "Country": one box where a few typed letters
narrow a list of 243 inhabited countries and territories, best matches
first (names starting with the letters, then names with a word that does,
then other names such as UK, USA, KSA, Holland; accents and capitals never
matter), the typed letters in bold, each row with its ISO code, and
"Prefer not to say" always last (Chakra Combobox: keyboard and screen
readers work). Stored as country and country_code beside age and gender;
the server sets them only when sent, so a resume that does not know the
country never erases it. validate:session C9; 6 deliberate breaks, 6
caught; checked live in the browser and on a second copy of the server.

Also records the researcher's answer on the attention checks: all
completed sessions are analysed; a miss affects the gift card only.

Co-Authored-By: Claude Opus 5.5 <noreply@anthropic.com>
</commit_message>
<xml_diff>
--- a/docs/VRDS_Accuracy_Checklist.docx
+++ b/docs/VRDS_Accuracy_Checklist.docx
@@ -41,7 +41,7 @@
           <w:color w:val="595959"/>
           <w:sz w:val="20"/>
         </w:rPr>
-        <w:t>For Waseem and Claude  ·  29 September 2026  ·  code at commit ea20282 on Dev-Prod-branch-Edit_9_23</w:t>
+        <w:t>For Waseem and Claude  ·  30 September 2026  ·  code at commit 8d92630 on Dev-Prod-branch-Edit_9_23</w:t>
       </w:r>
     </w:p>
     <w:p>
@@ -60,7 +60,7 @@
         <w:rPr>
           <w:color w:val="595959"/>
         </w:rPr>
-        <w:t xml:space="preserve">  (run 29 September 2026 at 21:44, when this file was made).</w:t>
+        <w:t xml:space="preserve">  (run 30 September 2026 at 08:27, when this file was made).</w:t>
       </w:r>
     </w:p>
     <w:p>
@@ -6950,6 +6950,96 @@
                 <w:sz w:val="17"/>
               </w:rPr>
               <w:t>validate:attention (T6, T7)</w:t>
+            </w:r>
+          </w:p>
+        </w:tc>
+      </w:tr>
+      <w:tr>
+        <w:trPr>
+          <w:cantSplit w:val="true"/>
+        </w:trPr>
+        <w:tc>
+          <w:tcPr>
+            <w:tcW w:type="dxa" w:w="504"/>
+            <w:vAlign w:val="center"/>
+            <w:shd w:val="clear" w:color="auto" w:fill="E8F5EC"/>
+          </w:tcPr>
+          <w:p>
+            <w:pPr>
+              <w:spacing w:after="20" w:before="20"/>
+            </w:pPr>
+            <w:r/>
+            <w:r>
+              <w:rPr>
+                <w:b/>
+                <w:i w:val="0"/>
+                <w:color w:val="1B7A3E"/>
+                <w:sz w:val="22"/>
+              </w:rPr>
+              <w:t>✔</w:t>
+            </w:r>
+          </w:p>
+        </w:tc>
+        <w:tc>
+          <w:tcPr>
+            <w:tcW w:type="dxa" w:w="2808"/>
+            <w:vAlign w:val="center"/>
+          </w:tcPr>
+          <w:p>
+            <w:pPr>
+              <w:spacing w:after="20" w:before="20"/>
+            </w:pPr>
+            <w:r/>
+            <w:r>
+              <w:rPr>
+                <w:b/>
+                <w:i w:val="0"/>
+                <w:color w:val="262626"/>
+                <w:sz w:val="19"/>
+              </w:rPr>
+              <w:t>The country question finds a country from a few letters, and keeps it.</w:t>
+            </w:r>
+          </w:p>
+        </w:tc>
+        <w:tc>
+          <w:tcPr>
+            <w:tcW w:type="dxa" w:w="4968"/>
+            <w:vAlign w:val="center"/>
+          </w:tcPr>
+          <w:p>
+            <w:pPr>
+              <w:spacing w:after="20" w:before="20"/>
+            </w:pPr>
+            <w:r/>
+            <w:r>
+              <w:rPr>
+                <w:b w:val="0"/>
+                <w:i w:val="0"/>
+                <w:color w:val="262626"/>
+                <w:sz w:val="19"/>
+              </w:rPr>
+              <w:t>Names starting with the letters come first, then names with a word that starts with them, and other names work (UK, USA, KSA, Holland; accents do not matter). Saved as country and country_code beside age and gender; a resume that does not know it never erases it (tested live on a second copy of the server).</w:t>
+            </w:r>
+          </w:p>
+        </w:tc>
+        <w:tc>
+          <w:tcPr>
+            <w:tcW w:type="dxa" w:w="1800"/>
+            <w:vAlign w:val="center"/>
+          </w:tcPr>
+          <w:p>
+            <w:pPr>
+              <w:spacing w:after="20" w:before="20"/>
+            </w:pPr>
+            <w:r/>
+            <w:r>
+              <w:rPr>
+                <w:b w:val="0"/>
+                <w:i w:val="0"/>
+                <w:color w:val="595959"/>
+                <w:sz w:val="17"/>
+              </w:rPr>
+              <w:t>validate:session (C9)</w:t>
             </w:r>
           </w:p>
         </w:tc>
@@ -8221,75 +8311,6 @@
                 <w:color w:val="262626"/>
                 <w:sz w:val="19"/>
               </w:rPr>
-              <w:t>Does a missed attention check also leave somebody out of the analysis?</w:t>
-            </w:r>
-          </w:p>
-        </w:tc>
-        <w:tc>
-          <w:tcPr>
-            <w:tcW w:type="dxa" w:w="5904"/>
-            <w:vAlign w:val="center"/>
-          </w:tcPr>
-          <w:p>
-            <w:pPr>
-              <w:spacing w:after="20" w:before="20"/>
-            </w:pPr>
-            <w:r/>
-            <w:r>
-              <w:rPr>
-                <w:b w:val="0"/>
-                <w:i w:val="0"/>
-                <w:color w:val="262626"/>
-                <w:sz w:val="19"/>
-              </w:rPr>
-              <w:t>Your Q3-A: the checks decide the gift card only for now. Decide the analysis rule in the freeze note before the data is opened.</w:t>
-            </w:r>
-          </w:p>
-        </w:tc>
-        <w:tc>
-          <w:tcPr>
-            <w:tcW w:type="dxa" w:w="1584"/>
-            <w:vAlign w:val="center"/>
-          </w:tcPr>
-          <w:p>
-            <w:pPr>
-              <w:spacing w:after="20" w:before="20"/>
-            </w:pPr>
-            <w:r/>
-            <w:r>
-              <w:rPr>
-                <w:b w:val="0"/>
-                <w:i w:val="0"/>
-                <w:color w:val="595959"/>
-                <w:sz w:val="19"/>
-              </w:rPr>
-              <w:t>Before the data is opened</w:t>
-            </w:r>
-          </w:p>
-        </w:tc>
-      </w:tr>
-      <w:tr>
-        <w:trPr>
-          <w:cantSplit w:val="true"/>
-        </w:trPr>
-        <w:tc>
-          <w:tcPr>
-            <w:tcW w:type="dxa" w:w="2592"/>
-            <w:vAlign w:val="center"/>
-            <w:shd w:val="clear" w:color="auto" w:fill="FFF4E0"/>
-          </w:tcPr>
-          <w:p>
-            <w:pPr>
-              <w:spacing w:after="20" w:before="20"/>
-            </w:pPr>
-            <w:r/>
-            <w:r>
-              <w:rPr>
-                <w:b/>
-                <w:i w:val="0"/>
-                <w:color w:val="262626"/>
-                <w:sz w:val="19"/>
-              </w:rPr>
               <w:t>The one-browser rule is only as strong as the email-and-age check</w:t>
             </w:r>
           </w:p>
@@ -9314,7 +9335,7 @@
                 <w:color w:val="595959"/>
                 <w:sz w:val="17"/>
               </w:rPr>
-              <w:t>13</w:t>
+              <w:t>12</w:t>
             </w:r>
           </w:p>
         </w:tc>
@@ -9403,7 +9424,7 @@
                 <w:color w:val="595959"/>
                 <w:sz w:val="17"/>
               </w:rPr>
-              <w:t>14</w:t>
+              <w:t>15</w:t>
             </w:r>
           </w:p>
         </w:tc>
@@ -10293,7 +10314,7 @@
                 <w:color w:val="595959"/>
                 <w:sz w:val="17"/>
               </w:rPr>
-              <w:t>10</w:t>
+              <w:t>9</w:t>
             </w:r>
           </w:p>
         </w:tc>
@@ -10827,7 +10848,7 @@
                 <w:color w:val="595959"/>
                 <w:sz w:val="17"/>
               </w:rPr>
-              <w:t>7</w:t>
+              <w:t>8</w:t>
             </w:r>
           </w:p>
         </w:tc>
@@ -11094,7 +11115,7 @@
                 <w:color w:val="595959"/>
                 <w:sz w:val="17"/>
               </w:rPr>
-              <w:t>7</w:t>
+              <w:t>8</w:t>
             </w:r>
           </w:p>
         </w:tc>
@@ -11183,7 +11204,7 @@
                 <w:color w:val="595959"/>
                 <w:sz w:val="17"/>
               </w:rPr>
-              <w:t>5</w:t>
+              <w:t>6</w:t>
             </w:r>
           </w:p>
         </w:tc>
@@ -11340,7 +11361,7 @@
                 <w:color w:val="595959"/>
                 <w:sz w:val="17"/>
               </w:rPr>
-              <w:t>✓ built in 752ms</w:t>
+              <w:t>✓ built in 804ms</w:t>
             </w:r>
           </w:p>
         </w:tc>

</xml_diff>

<commit_message>
The value line moves in scenarios 5 and 6
"How your four values shifted along the way" was always flat in S5 and
S6, whatever was chosen: it drew the study's own values, which by design
never move on the wish or the rule. It now draws the running values stored
on every result (the ones behind VCI_all and Stability_all): the study's
values through scenario 4, then moved by the wish and the rule (the best
fit moves nothing). valueJourney (block5Journey.ts) gives one "after" to
the line, the radar's after shape and the results page's before/after
card; the radar caption names Stability_all and no longer says the two
shapes differ only a little. No score or stored number changes; the
participant-facing "after" is documented as distinct from
analysis.value_profile_after_block5. J13; 4 deliberate breaks, 4 caught.
Checked live on a test run.

Co-Authored-By: Claude Opus 5.5 <noreply@anthropic.com>
</commit_message>
<xml_diff>
--- a/docs/VRDS_Accuracy_Checklist.docx
+++ b/docs/VRDS_Accuracy_Checklist.docx
@@ -41,7 +41,7 @@
           <w:color w:val="595959"/>
           <w:sz w:val="20"/>
         </w:rPr>
-        <w:t>For Waseem and Claude  ·  30 September 2026  ·  code at commit 8d92630 on Dev-Prod-branch-Edit_9_23</w:t>
+        <w:t>For Waseem and Claude  ·  30 September 2026  ·  code at commit 9f837c6 on Dev-Prod-branch-Edit_9_23</w:t>
       </w:r>
     </w:p>
     <w:p>
@@ -60,7 +60,7 @@
         <w:rPr>
           <w:color w:val="595959"/>
         </w:rPr>
-        <w:t xml:space="preserve">  (run 30 September 2026 at 08:27, when this file was made).</w:t>
+        <w:t xml:space="preserve">  (run 30 September 2026 at 08:50, when this file was made).</w:t>
       </w:r>
     </w:p>
     <w:p>
@@ -6010,6 +6010,96 @@
                 <w:sz w:val="17"/>
               </w:rPr>
               <w:t>validate:journey (J12)</w:t>
+            </w:r>
+          </w:p>
+        </w:tc>
+      </w:tr>
+      <w:tr>
+        <w:trPr>
+          <w:cantSplit w:val="true"/>
+        </w:trPr>
+        <w:tc>
+          <w:tcPr>
+            <w:tcW w:type="dxa" w:w="504"/>
+            <w:vAlign w:val="center"/>
+            <w:shd w:val="clear" w:color="auto" w:fill="E8F5EC"/>
+          </w:tcPr>
+          <w:p>
+            <w:pPr>
+              <w:spacing w:after="20" w:before="20"/>
+            </w:pPr>
+            <w:r/>
+            <w:r>
+              <w:rPr>
+                <w:b/>
+                <w:i w:val="0"/>
+                <w:color w:val="1B7A3E"/>
+                <w:sz w:val="22"/>
+              </w:rPr>
+              <w:t>✔</w:t>
+            </w:r>
+          </w:p>
+        </w:tc>
+        <w:tc>
+          <w:tcPr>
+            <w:tcW w:type="dxa" w:w="2808"/>
+            <w:vAlign w:val="center"/>
+          </w:tcPr>
+          <w:p>
+            <w:pPr>
+              <w:spacing w:after="20" w:before="20"/>
+            </w:pPr>
+            <w:r/>
+            <w:r>
+              <w:rPr>
+                <w:b/>
+                <w:i w:val="0"/>
+                <w:color w:val="262626"/>
+                <w:sz w:val="19"/>
+              </w:rPr>
+              <w:t>The value line moves where the choices moved the values, in all six scenarios.</w:t>
+            </w:r>
+          </w:p>
+        </w:tc>
+        <w:tc>
+          <w:tcPr>
+            <w:tcW w:type="dxa" w:w="4968"/>
+            <w:vAlign w:val="center"/>
+          </w:tcPr>
+          <w:p>
+            <w:pPr>
+              <w:spacing w:after="20" w:before="20"/>
+            </w:pPr>
+            <w:r/>
+            <w:r>
+              <w:rPr>
+                <w:b w:val="0"/>
+                <w:i w:val="0"/>
+                <w:color w:val="262626"/>
+                <w:sz w:val="19"/>
+              </w:rPr>
+              <w:t>It follows the running values (the ones behind VCI_all and Stability_all), so the wish and the rule move it too; the best fit moves nothing. The line, the radar and the results page's before/after card show one and the same after.</w:t>
+            </w:r>
+          </w:p>
+        </w:tc>
+        <w:tc>
+          <w:tcPr>
+            <w:tcW w:type="dxa" w:w="1800"/>
+            <w:vAlign w:val="center"/>
+          </w:tcPr>
+          <w:p>
+            <w:pPr>
+              <w:spacing w:after="20" w:before="20"/>
+            </w:pPr>
+            <w:r/>
+            <w:r>
+              <w:rPr>
+                <w:b w:val="0"/>
+                <w:i w:val="0"/>
+                <w:color w:val="595959"/>
+                <w:sz w:val="17"/>
+              </w:rPr>
+              <w:t>validate:journey (J13)</w:t>
             </w:r>
           </w:p>
         </w:tc>
@@ -9424,7 +9514,7 @@
                 <w:color w:val="595959"/>
                 <w:sz w:val="17"/>
               </w:rPr>
-              <w:t>15</w:t>
+              <w:t>14</w:t>
             </w:r>
           </w:p>
         </w:tc>
@@ -10581,7 +10671,7 @@
                 <w:color w:val="595959"/>
                 <w:sz w:val="17"/>
               </w:rPr>
-              <w:t>13</w:t>
+              <w:t>12</w:t>
             </w:r>
           </w:p>
         </w:tc>
@@ -10670,7 +10760,7 @@
                 <w:color w:val="595959"/>
                 <w:sz w:val="17"/>
               </w:rPr>
-              <w:t>10</w:t>
+              <w:t>9</w:t>
             </w:r>
           </w:p>
         </w:tc>
@@ -10848,7 +10938,7 @@
                 <w:color w:val="595959"/>
                 <w:sz w:val="17"/>
               </w:rPr>
-              <w:t>8</w:t>
+              <w:t>7</w:t>
             </w:r>
           </w:p>
         </w:tc>
@@ -11115,7 +11205,7 @@
                 <w:color w:val="595959"/>
                 <w:sz w:val="17"/>
               </w:rPr>
-              <w:t>8</w:t>
+              <w:t>7</w:t>
             </w:r>
           </w:p>
         </w:tc>
@@ -11204,7 +11294,7 @@
                 <w:color w:val="595959"/>
                 <w:sz w:val="17"/>
               </w:rPr>
-              <w:t>6</w:t>
+              <w:t>5</w:t>
             </w:r>
           </w:p>
         </w:tc>
@@ -11361,7 +11451,7 @@
                 <w:color w:val="595959"/>
                 <w:sz w:val="17"/>
               </w:rPr>
-              <w:t>✓ built in 804ms</w:t>
+              <w:t>✓ built in 763ms</w:t>
             </w:r>
           </w:p>
         </w:tc>

</xml_diff>

<commit_message>
The profile after every Block 5 scenario, in one place in the database
analysis.value_profile_by_scenario (buildValueProfileByScenario): the
participant's profile, all seven values, after every scenario, tracked like
VCI_all (the study's values through scenario 4, then also moved by the wish
and the rule), with the order of the four, what moved it in words, the
moves, and a self-check. Built only from what was already saved: the
running values (rebuilt for a record without them) and the study's
snapshots of directness, context and stakeholder, which the running rule
never moves. major_info_and_scores.profile_by_scenario and profile_now now
follow it; the study's own list is study_profile_by_scenario. Database
only: nothing in the study or on screen changes. Corrected a stale note
that said the other three values were not snapshotted per scenario.
D68; 6 deliberate breaks, 6 caught.

Co-Authored-By: Claude Opus 5.5 <noreply@anthropic.com>
</commit_message>
<xml_diff>
--- a/docs/VRDS_Accuracy_Checklist.docx
+++ b/docs/VRDS_Accuracy_Checklist.docx
@@ -41,7 +41,7 @@
           <w:color w:val="595959"/>
           <w:sz w:val="20"/>
         </w:rPr>
-        <w:t>For Waseem and Claude  ·  30 September 2026  ·  code at commit 9f837c6 on Dev-Prod-branch-Edit_9_23</w:t>
+        <w:t>For Waseem and Claude  ·  30 September 2026  ·  code at commit a60a7e6 on Dev-Prod-branch-Edit_9_23</w:t>
       </w:r>
     </w:p>
     <w:p>
@@ -60,7 +60,7 @@
         <w:rPr>
           <w:color w:val="595959"/>
         </w:rPr>
-        <w:t xml:space="preserve">  (run 30 September 2026 at 08:50, when this file was made).</w:t>
+        <w:t xml:space="preserve">  (run 30 September 2026 at 09:36, when this file was made).</w:t>
       </w:r>
     </w:p>
     <w:p>
@@ -211,7 +211,7 @@
                 <w:color w:val="262626"/>
                 <w:sz w:val="19"/>
               </w:rPr>
-              <w:t>2026-09-29-attention-checks</w:t>
+              <w:t>2026-09-30-value-profile-by-scenario</w:t>
             </w:r>
           </w:p>
         </w:tc>
@@ -5161,6 +5161,96 @@
                 <w:sz w:val="17"/>
               </w:rPr>
               <w:t>validate:dbshape (D49)</w:t>
+            </w:r>
+          </w:p>
+        </w:tc>
+      </w:tr>
+      <w:tr>
+        <w:trPr>
+          <w:cantSplit w:val="true"/>
+        </w:trPr>
+        <w:tc>
+          <w:tcPr>
+            <w:tcW w:type="dxa" w:w="504"/>
+            <w:vAlign w:val="center"/>
+            <w:shd w:val="clear" w:color="auto" w:fill="E8F5EC"/>
+          </w:tcPr>
+          <w:p>
+            <w:pPr>
+              <w:spacing w:after="20" w:before="20"/>
+            </w:pPr>
+            <w:r/>
+            <w:r>
+              <w:rPr>
+                <w:b/>
+                <w:i w:val="0"/>
+                <w:color w:val="1B7A3E"/>
+                <w:sz w:val="22"/>
+              </w:rPr>
+              <w:t>✔</w:t>
+            </w:r>
+          </w:p>
+        </w:tc>
+        <w:tc>
+          <w:tcPr>
+            <w:tcW w:type="dxa" w:w="2808"/>
+            <w:vAlign w:val="center"/>
+          </w:tcPr>
+          <w:p>
+            <w:pPr>
+              <w:spacing w:after="20" w:before="20"/>
+            </w:pPr>
+            <w:r/>
+            <w:r>
+              <w:rPr>
+                <w:b/>
+                <w:i w:val="0"/>
+                <w:color w:val="262626"/>
+                <w:sz w:val="19"/>
+              </w:rPr>
+              <w:t>The profile after every scenario is stored in one place.</w:t>
+            </w:r>
+          </w:p>
+        </w:tc>
+        <w:tc>
+          <w:tcPr>
+            <w:tcW w:type="dxa" w:w="4968"/>
+            <w:vAlign w:val="center"/>
+          </w:tcPr>
+          <w:p>
+            <w:pPr>
+              <w:spacing w:after="20" w:before="20"/>
+            </w:pPr>
+            <w:r/>
+            <w:r>
+              <w:rPr>
+                <w:b w:val="0"/>
+                <w:i w:val="0"/>
+                <w:color w:val="262626"/>
+                <w:sz w:val="19"/>
+              </w:rPr>
+              <w:t>analysis.value_profile_by_scenario: all seven values after each Block 5 scenario, tracked like VCI_all, with the order of the four and what moved them; built from what was already saved, with a self-check. The study's own list is kept as study_profile_by_scenario.</w:t>
+            </w:r>
+          </w:p>
+        </w:tc>
+        <w:tc>
+          <w:tcPr>
+            <w:tcW w:type="dxa" w:w="1800"/>
+            <w:vAlign w:val="center"/>
+          </w:tcPr>
+          <w:p>
+            <w:pPr>
+              <w:spacing w:after="20" w:before="20"/>
+            </w:pPr>
+            <w:r/>
+            <w:r>
+              <w:rPr>
+                <w:b w:val="0"/>
+                <w:i w:val="0"/>
+                <w:color w:val="595959"/>
+                <w:sz w:val="17"/>
+              </w:rPr>
+              <w:t>validate:dbshape (D68)</w:t>
             </w:r>
           </w:p>
         </w:tc>
@@ -11116,7 +11206,7 @@
                 <w:color w:val="595959"/>
                 <w:sz w:val="17"/>
               </w:rPr>
-              <w:t>8</w:t>
+              <w:t>7</w:t>
             </w:r>
           </w:p>
         </w:tc>
@@ -11451,7 +11541,7 @@
                 <w:color w:val="595959"/>
                 <w:sz w:val="17"/>
               </w:rPr>
-              <w:t>✓ built in 763ms</w:t>
+              <w:t>✓ built in 770ms</w:t>
             </w:r>
           </w:p>
         </w:tc>

</xml_diff>

<commit_message>
Accuracy checklist rebuilt: the refresh-in-the-pause row is fixed
The "A refresh on the Block 2 or Block 3 finished screen" row leaves the
open list; "A refresh in the pause after a block never restarts that
block" (C10) joins the checked items. Every check ran and passed.

Co-Authored-By: Claude Opus 5.5 <noreply@anthropic.com>
</commit_message>
<xml_diff>
--- a/docs/VRDS_Accuracy_Checklist.docx
+++ b/docs/VRDS_Accuracy_Checklist.docx
@@ -41,7 +41,7 @@
           <w:color w:val="595959"/>
           <w:sz w:val="20"/>
         </w:rPr>
-        <w:t>For Waseem and Claude  ·  30 September 2026  ·  code at commit a60a7e6 on Dev-Prod-branch-Edit_9_23</w:t>
+        <w:t>For Waseem and Claude  ·  30 September 2026  ·  code at commit 03479fa on Dev-Prod-branch-Edit_9_23</w:t>
       </w:r>
     </w:p>
     <w:p>
@@ -60,7 +60,7 @@
         <w:rPr>
           <w:color w:val="595959"/>
         </w:rPr>
-        <w:t xml:space="preserve">  (run 30 September 2026 at 09:36, when this file was made).</w:t>
+        <w:t xml:space="preserve">  (run 30 September 2026 at 10:03, when this file was made).</w:t>
       </w:r>
     </w:p>
     <w:p>
@@ -1711,6 +1711,96 @@
                 <w:sz w:val="19"/>
               </w:rPr>
               <w:t>Checked by</w:t>
+            </w:r>
+          </w:p>
+        </w:tc>
+      </w:tr>
+      <w:tr>
+        <w:trPr>
+          <w:cantSplit w:val="true"/>
+        </w:trPr>
+        <w:tc>
+          <w:tcPr>
+            <w:tcW w:type="dxa" w:w="504"/>
+            <w:vAlign w:val="center"/>
+            <w:shd w:val="clear" w:color="auto" w:fill="E8F5EC"/>
+          </w:tcPr>
+          <w:p>
+            <w:pPr>
+              <w:spacing w:after="20" w:before="20"/>
+            </w:pPr>
+            <w:r/>
+            <w:r>
+              <w:rPr>
+                <w:b/>
+                <w:i w:val="0"/>
+                <w:color w:val="1B7A3E"/>
+                <w:sz w:val="22"/>
+              </w:rPr>
+              <w:t>✔</w:t>
+            </w:r>
+          </w:p>
+        </w:tc>
+        <w:tc>
+          <w:tcPr>
+            <w:tcW w:type="dxa" w:w="2808"/>
+            <w:vAlign w:val="center"/>
+          </w:tcPr>
+          <w:p>
+            <w:pPr>
+              <w:spacing w:after="20" w:before="20"/>
+            </w:pPr>
+            <w:r/>
+            <w:r>
+              <w:rPr>
+                <w:b/>
+                <w:i w:val="0"/>
+                <w:color w:val="262626"/>
+                <w:sz w:val="19"/>
+              </w:rPr>
+              <w:t>A refresh in the pause after a block never restarts that block.</w:t>
+            </w:r>
+          </w:p>
+        </w:tc>
+        <w:tc>
+          <w:tcPr>
+            <w:tcW w:type="dxa" w:w="4968"/>
+            <w:vAlign w:val="center"/>
+          </w:tcPr>
+          <w:p>
+            <w:pPr>
+              <w:spacing w:after="20" w:before="20"/>
+            </w:pPr>
+            <w:r/>
+            <w:r>
+              <w:rPr>
+                <w:b w:val="0"/>
+                <w:i w:val="0"/>
+                <w:color w:val="262626"/>
+                <w:sz w:val="19"/>
+              </w:rPr>
+              <w:t>The pause is saved as the part it leads to the moment it starts, in the browser and on the server, so a refresh, a closed tab or a crash there opens the next part. This covers every block, Block 5 included. Tested live after Block 4.</w:t>
+            </w:r>
+          </w:p>
+        </w:tc>
+        <w:tc>
+          <w:tcPr>
+            <w:tcW w:type="dxa" w:w="1800"/>
+            <w:vAlign w:val="center"/>
+          </w:tcPr>
+          <w:p>
+            <w:pPr>
+              <w:spacing w:after="20" w:before="20"/>
+            </w:pPr>
+            <w:r/>
+            <w:r>
+              <w:rPr>
+                <w:b w:val="0"/>
+                <w:i w:val="0"/>
+                <w:color w:val="595959"/>
+                <w:sz w:val="17"/>
+              </w:rPr>
+              <w:t>validate:session (C10)</w:t>
             </w:r>
           </w:p>
         </w:tc>
@@ -8560,75 +8650,6 @@
                 <w:color w:val="262626"/>
                 <w:sz w:val="19"/>
               </w:rPr>
-              <w:t>A refresh on the Block 2 or Block 3 finished screen</w:t>
-            </w:r>
-          </w:p>
-        </w:tc>
-        <w:tc>
-          <w:tcPr>
-            <w:tcW w:type="dxa" w:w="5904"/>
-            <w:vAlign w:val="center"/>
-          </w:tcPr>
-          <w:p>
-            <w:pPr>
-              <w:spacing w:after="20" w:before="20"/>
-            </w:pPr>
-            <w:r/>
-            <w:r>
-              <w:rPr>
-                <w:b w:val="0"/>
-                <w:i w:val="0"/>
-                <w:color w:val="262626"/>
-                <w:sz w:val="19"/>
-              </w:rPr>
-              <w:t>Each block removes its progress when it finishes and shows a finished screen before moving on. A refresh on that screen starts the block again (its results are already saved and would be answered again). Older than this work; rare.</w:t>
-            </w:r>
-          </w:p>
-        </w:tc>
-        <w:tc>
-          <w:tcPr>
-            <w:tcW w:type="dxa" w:w="1584"/>
-            <w:vAlign w:val="center"/>
-          </w:tcPr>
-          <w:p>
-            <w:pPr>
-              <w:spacing w:after="20" w:before="20"/>
-            </w:pPr>
-            <w:r/>
-            <w:r>
-              <w:rPr>
-                <w:b w:val="0"/>
-                <w:i w:val="0"/>
-                <w:color w:val="595959"/>
-                <w:sz w:val="19"/>
-              </w:rPr>
-              <w:t>Your choice</w:t>
-            </w:r>
-          </w:p>
-        </w:tc>
-      </w:tr>
-      <w:tr>
-        <w:trPr>
-          <w:cantSplit w:val="true"/>
-        </w:trPr>
-        <w:tc>
-          <w:tcPr>
-            <w:tcW w:type="dxa" w:w="2592"/>
-            <w:vAlign w:val="center"/>
-            <w:shd w:val="clear" w:color="auto" w:fill="FFF4E0"/>
-          </w:tcPr>
-          <w:p>
-            <w:pPr>
-              <w:spacing w:after="20" w:before="20"/>
-            </w:pPr>
-            <w:r/>
-            <w:r>
-              <w:rPr>
-                <w:b/>
-                <w:i w:val="0"/>
-                <w:color w:val="262626"/>
-                <w:sz w:val="19"/>
-              </w:rPr>
               <w:t>Decisions still open (for you and your advisor)</w:t>
             </w:r>
           </w:p>
@@ -10761,7 +10782,7 @@
                 <w:color w:val="595959"/>
                 <w:sz w:val="17"/>
               </w:rPr>
-              <w:t>12</w:t>
+              <w:t>13</w:t>
             </w:r>
           </w:p>
         </w:tc>
@@ -11028,7 +11049,7 @@
                 <w:color w:val="595959"/>
                 <w:sz w:val="17"/>
               </w:rPr>
-              <w:t>7</w:t>
+              <w:t>6</w:t>
             </w:r>
           </w:p>
         </w:tc>
@@ -11206,7 +11227,7 @@
                 <w:color w:val="595959"/>
                 <w:sz w:val="17"/>
               </w:rPr>
-              <w:t>7</w:t>
+              <w:t>8</w:t>
             </w:r>
           </w:p>
         </w:tc>
@@ -11541,7 +11562,7 @@
                 <w:color w:val="595959"/>
                 <w:sz w:val="17"/>
               </w:rPr>
-              <w:t>✓ built in 770ms</w:t>
+              <w:t>✓ built in 780ms</w:t>
             </w:r>
           </w:p>
         </w:tc>

</xml_diff>

<commit_message>
Accuracy checklist rebuilt: the four conditions and the landing page
27 of 27 checks pass on 17e4c9f, including the new validate:conditions.

Co-Authored-By: Claude Opus 5.5 <noreply@anthropic.com>
</commit_message>
<xml_diff>
--- a/docs/VRDS_Accuracy_Checklist.docx
+++ b/docs/VRDS_Accuracy_Checklist.docx
@@ -41,7 +41,7 @@
           <w:color w:val="595959"/>
           <w:sz w:val="20"/>
         </w:rPr>
-        <w:t>For Waseem and Claude  ·  30 September 2026  ·  code at commit 7cd08df on Dev-Prod-branch-Edit_9_23</w:t>
+        <w:t>For Waseem and Claude  ·  01 October 2026  ·  code at commit 17e4c9f on Prolific-branch-Edit_10_1</w:t>
       </w:r>
     </w:p>
     <w:p>
@@ -54,13 +54,13 @@
           <w:color w:val="1B7A3E"/>
           <w:sz w:val="24"/>
         </w:rPr>
-        <w:t>All 26 checks passed</w:t>
+        <w:t>All 27 checks passed</w:t>
       </w:r>
       <w:r>
         <w:rPr>
           <w:color w:val="595959"/>
         </w:rPr>
-        <w:t xml:space="preserve">  (run 30 September 2026 at 11:24, when this file was made).</w:t>
+        <w:t xml:space="preserve">  (run 01 October 2026 at 10:55, when this file was made).</w:t>
       </w:r>
     </w:p>
     <w:p>
@@ -211,7 +211,7 @@
                 <w:color w:val="262626"/>
                 <w:sz w:val="19"/>
               </w:rPr>
-              <w:t>2026-09-30-value-profile-by-scenario</w:t>
+              <w:t>2026-10-01-conditions</w:t>
             </w:r>
           </w:p>
         </w:tc>
@@ -2791,6 +2791,496 @@
                 <w:sz w:val="17"/>
               </w:rPr>
               <w:t>.env is git-ignored</w:t>
+            </w:r>
+          </w:p>
+        </w:tc>
+      </w:tr>
+    </w:tbl>
+    <w:p>
+      <w:pPr>
+        <w:keepNext/>
+        <w:spacing w:after="80" w:before="280"/>
+      </w:pPr>
+      <w:r>
+        <w:rPr>
+          <w:b/>
+          <w:i w:val="0"/>
+          <w:color w:val="1F3864"/>
+          <w:sz w:val="28"/>
+        </w:rPr>
+        <w:t>2b. The four conditions and the landing page</w:t>
+      </w:r>
+    </w:p>
+    <w:tbl>
+      <w:tblPr>
+        <w:tblW w:type="auto" w:w="0"/>
+        <w:jc w:val="center"/>
+        <w:tblLayout w:type="fixed"/>
+        <w:tblLook w:firstColumn="1" w:firstRow="1" w:lastColumn="0" w:lastRow="0" w:noHBand="0" w:noVBand="1" w:val="04A0"/>
+        <w:tblBorders>
+          <w:top w:val="single" w:sz="4" w:space="0" w:color="BFBFBF"/>
+          <w:left w:val="single" w:sz="4" w:space="0" w:color="BFBFBF"/>
+          <w:bottom w:val="single" w:sz="4" w:space="0" w:color="BFBFBF"/>
+          <w:right w:val="single" w:sz="4" w:space="0" w:color="BFBFBF"/>
+          <w:insideH w:val="single" w:sz="4" w:space="0" w:color="BFBFBF"/>
+          <w:insideV w:val="single" w:sz="4" w:space="0" w:color="BFBFBF"/>
+        </w:tblBorders>
+      </w:tblPr>
+      <w:tblGrid>
+        <w:gridCol w:w="504"/>
+        <w:gridCol w:w="2808"/>
+        <w:gridCol w:w="4968"/>
+        <w:gridCol w:w="1800"/>
+      </w:tblGrid>
+      <w:tr>
+        <w:trPr>
+          <w:cantSplit w:val="true"/>
+          <w:tblHeader w:val="true"/>
+        </w:trPr>
+        <w:tc>
+          <w:tcPr>
+            <w:tcW w:type="dxa" w:w="504"/>
+            <w:vAlign w:val="center"/>
+            <w:shd w:val="clear" w:color="auto" w:fill="DCE6F1"/>
+          </w:tcPr>
+          <w:p>
+            <w:pPr>
+              <w:spacing w:after="20" w:before="20"/>
+            </w:pPr>
+            <w:r/>
+            <w:r>
+              <w:rPr>
+                <w:b/>
+                <w:i w:val="0"/>
+                <w:color w:val="1F3864"/>
+                <w:sz w:val="19"/>
+              </w:rPr>
+            </w:r>
+          </w:p>
+        </w:tc>
+        <w:tc>
+          <w:tcPr>
+            <w:tcW w:type="dxa" w:w="2808"/>
+            <w:vAlign w:val="center"/>
+            <w:shd w:val="clear" w:color="auto" w:fill="DCE6F1"/>
+          </w:tcPr>
+          <w:p>
+            <w:pPr>
+              <w:spacing w:after="20" w:before="20"/>
+            </w:pPr>
+            <w:r/>
+            <w:r>
+              <w:rPr>
+                <w:b/>
+                <w:i w:val="0"/>
+                <w:color w:val="1F3864"/>
+                <w:sz w:val="19"/>
+              </w:rPr>
+              <w:t>What is accurate now</w:t>
+            </w:r>
+          </w:p>
+        </w:tc>
+        <w:tc>
+          <w:tcPr>
+            <w:tcW w:type="dxa" w:w="4968"/>
+            <w:vAlign w:val="center"/>
+            <w:shd w:val="clear" w:color="auto" w:fill="DCE6F1"/>
+          </w:tcPr>
+          <w:p>
+            <w:pPr>
+              <w:spacing w:after="20" w:before="20"/>
+            </w:pPr>
+            <w:r/>
+            <w:r>
+              <w:rPr>
+                <w:b/>
+                <w:i w:val="0"/>
+                <w:color w:val="1F3864"/>
+                <w:sz w:val="19"/>
+              </w:rPr>
+              <w:t>Why you can trust it</w:t>
+            </w:r>
+          </w:p>
+        </w:tc>
+        <w:tc>
+          <w:tcPr>
+            <w:tcW w:type="dxa" w:w="1800"/>
+            <w:vAlign w:val="center"/>
+            <w:shd w:val="clear" w:color="auto" w:fill="DCE6F1"/>
+          </w:tcPr>
+          <w:p>
+            <w:pPr>
+              <w:spacing w:after="20" w:before="20"/>
+            </w:pPr>
+            <w:r/>
+            <w:r>
+              <w:rPr>
+                <w:b/>
+                <w:i w:val="0"/>
+                <w:color w:val="1F3864"/>
+                <w:sz w:val="19"/>
+              </w:rPr>
+              <w:t>Checked by</w:t>
+            </w:r>
+          </w:p>
+        </w:tc>
+      </w:tr>
+      <w:tr>
+        <w:trPr>
+          <w:cantSplit w:val="true"/>
+        </w:trPr>
+        <w:tc>
+          <w:tcPr>
+            <w:tcW w:type="dxa" w:w="504"/>
+            <w:vAlign w:val="center"/>
+            <w:shd w:val="clear" w:color="auto" w:fill="E8F5EC"/>
+          </w:tcPr>
+          <w:p>
+            <w:pPr>
+              <w:spacing w:after="20" w:before="20"/>
+            </w:pPr>
+            <w:r/>
+            <w:r>
+              <w:rPr>
+                <w:b/>
+                <w:i w:val="0"/>
+                <w:color w:val="1B7A3E"/>
+                <w:sz w:val="22"/>
+              </w:rPr>
+              <w:t>✔</w:t>
+            </w:r>
+          </w:p>
+        </w:tc>
+        <w:tc>
+          <w:tcPr>
+            <w:tcW w:type="dxa" w:w="2808"/>
+            <w:vAlign w:val="center"/>
+          </w:tcPr>
+          <w:p>
+            <w:pPr>
+              <w:spacing w:after="20" w:before="20"/>
+            </w:pPr>
+            <w:r/>
+            <w:r>
+              <w:rPr>
+                <w:b/>
+                <w:i w:val="0"/>
+                <w:color w:val="262626"/>
+                <w:sz w:val="19"/>
+              </w:rPr>
+              <w:t>Each new participant gets the condition with the fewest people.</w:t>
+            </w:r>
+          </w:p>
+        </w:tc>
+        <w:tc>
+          <w:tcPr>
+            <w:tcW w:type="dxa" w:w="4968"/>
+            <w:vAlign w:val="center"/>
+          </w:tcPr>
+          <w:p>
+            <w:pPr>
+              <w:spacing w:after="20" w:before="20"/>
+            </w:pPr>
+            <w:r/>
+            <w:r>
+              <w:rPr>
+                <w:b w:val="0"/>
+                <w:i w:val="0"/>
+                <w:color w:val="262626"/>
+                <w:sz w:val="19"/>
+              </w:rPr>
+              <w:t>The landing page asks the server, which counts finished people, people still working in the last 2 hours and people who arrived in the last 30 minutes (your Q1-B), and gives the fewest; a tie is broken at random. 40 pretend people arriving in the same moment end up 10 in each; live, 8 visitors gave 2 in each.</w:t>
+            </w:r>
+          </w:p>
+        </w:tc>
+        <w:tc>
+          <w:tcPr>
+            <w:tcW w:type="dxa" w:w="1800"/>
+            <w:vAlign w:val="center"/>
+          </w:tcPr>
+          <w:p>
+            <w:pPr>
+              <w:spacing w:after="20" w:before="20"/>
+            </w:pPr>
+            <w:r/>
+            <w:r>
+              <w:rPr>
+                <w:b w:val="0"/>
+                <w:i w:val="0"/>
+                <w:color w:val="595959"/>
+                <w:sz w:val="17"/>
+              </w:rPr>
+              <w:t>validate:conditions (N2, N3, N4)</w:t>
+            </w:r>
+          </w:p>
+        </w:tc>
+      </w:tr>
+      <w:tr>
+        <w:trPr>
+          <w:cantSplit w:val="true"/>
+        </w:trPr>
+        <w:tc>
+          <w:tcPr>
+            <w:tcW w:type="dxa" w:w="504"/>
+            <w:vAlign w:val="center"/>
+            <w:shd w:val="clear" w:color="auto" w:fill="E8F5EC"/>
+          </w:tcPr>
+          <w:p>
+            <w:pPr>
+              <w:spacing w:after="20" w:before="20"/>
+            </w:pPr>
+            <w:r/>
+            <w:r>
+              <w:rPr>
+                <w:b/>
+                <w:i w:val="0"/>
+                <w:color w:val="1B7A3E"/>
+                <w:sz w:val="22"/>
+              </w:rPr>
+              <w:t>✔</w:t>
+            </w:r>
+          </w:p>
+        </w:tc>
+        <w:tc>
+          <w:tcPr>
+            <w:tcW w:type="dxa" w:w="2808"/>
+            <w:vAlign w:val="center"/>
+          </w:tcPr>
+          <w:p>
+            <w:pPr>
+              <w:spacing w:after="20" w:before="20"/>
+            </w:pPr>
+            <w:r/>
+            <w:r>
+              <w:rPr>
+                <w:b/>
+                <w:i w:val="0"/>
+                <w:color w:val="262626"/>
+                <w:sz w:val="19"/>
+              </w:rPr>
+              <w:t>A condition is saved once and never changes.</w:t>
+            </w:r>
+          </w:p>
+        </w:tc>
+        <w:tc>
+          <w:tcPr>
+            <w:tcW w:type="dxa" w:w="4968"/>
+            <w:vAlign w:val="center"/>
+          </w:tcPr>
+          <w:p>
+            <w:pPr>
+              <w:spacing w:after="20" w:before="20"/>
+            </w:pPr>
+            <w:r/>
+            <w:r>
+              <w:rPr>
+                <w:b w:val="0"/>
+                <w:i w:val="0"/>
+                <w:color w:val="262626"/>
+                <w:sz w:val="19"/>
+              </w:rPr>
+              <w:t>Saved beside the demographic answers (Condition number, Condition type) and on the participant record, which the server sets only when it has none. A returning participant gets their own back, on any computer; an address naming another condition is corrected.</w:t>
+            </w:r>
+          </w:p>
+        </w:tc>
+        <w:tc>
+          <w:tcPr>
+            <w:tcW w:type="dxa" w:w="1800"/>
+            <w:vAlign w:val="center"/>
+          </w:tcPr>
+          <w:p>
+            <w:pPr>
+              <w:spacing w:after="20" w:before="20"/>
+            </w:pPr>
+            <w:r/>
+            <w:r>
+              <w:rPr>
+                <w:b w:val="0"/>
+                <w:i w:val="0"/>
+                <w:color w:val="595959"/>
+                <w:sz w:val="17"/>
+              </w:rPr>
+              <w:t>validate:conditions (N6, N8, N9)</w:t>
+            </w:r>
+          </w:p>
+        </w:tc>
+      </w:tr>
+      <w:tr>
+        <w:trPr>
+          <w:cantSplit w:val="true"/>
+        </w:trPr>
+        <w:tc>
+          <w:tcPr>
+            <w:tcW w:type="dxa" w:w="504"/>
+            <w:vAlign w:val="center"/>
+            <w:shd w:val="clear" w:color="auto" w:fill="E8F5EC"/>
+          </w:tcPr>
+          <w:p>
+            <w:pPr>
+              <w:spacing w:after="20" w:before="20"/>
+            </w:pPr>
+            <w:r/>
+            <w:r>
+              <w:rPr>
+                <w:b/>
+                <w:i w:val="0"/>
+                <w:color w:val="1B7A3E"/>
+                <w:sz w:val="22"/>
+              </w:rPr>
+              <w:t>✔</w:t>
+            </w:r>
+          </w:p>
+        </w:tc>
+        <w:tc>
+          <w:tcPr>
+            <w:tcW w:type="dxa" w:w="2808"/>
+            <w:vAlign w:val="center"/>
+          </w:tcPr>
+          <w:p>
+            <w:pPr>
+              <w:spacing w:after="20" w:before="20"/>
+            </w:pPr>
+            <w:r/>
+            <w:r>
+              <w:rPr>
+                <w:b/>
+                <w:i w:val="0"/>
+                <w:color w:val="262626"/>
+                <w:sz w:val="19"/>
+              </w:rPr>
+              <w:t>You can see and test each condition.</w:t>
+            </w:r>
+          </w:p>
+        </w:tc>
+        <w:tc>
+          <w:tcPr>
+            <w:tcW w:type="dxa" w:w="4968"/>
+            <w:vAlign w:val="center"/>
+          </w:tcPr>
+          <w:p>
+            <w:pPr>
+              <w:spacing w:after="20" w:before="20"/>
+            </w:pPr>
+            <w:r/>
+            <w:r>
+              <w:rPr>
+                <w:b w:val="0"/>
+                <w:i w:val="0"/>
+                <w:color w:val="262626"/>
+                <w:sz w:val="19"/>
+              </w:rPr>
+              <w:t>The address shows the condition (?condition=CVR_APA, CVR_Only, APA_Only, Baseline). Opening one of those addresses yourself gives that condition and is never counted (your Q2-yes); /api/conditions/report shows the counts (Q3-yes).</w:t>
+            </w:r>
+          </w:p>
+        </w:tc>
+        <w:tc>
+          <w:tcPr>
+            <w:tcW w:type="dxa" w:w="1800"/>
+            <w:vAlign w:val="center"/>
+          </w:tcPr>
+          <w:p>
+            <w:pPr>
+              <w:spacing w:after="20" w:before="20"/>
+            </w:pPr>
+            <w:r/>
+            <w:r>
+              <w:rPr>
+                <w:b w:val="0"/>
+                <w:i w:val="0"/>
+                <w:color w:val="595959"/>
+                <w:sz w:val="17"/>
+              </w:rPr>
+              <w:t>validate:conditions (N3, N7)</w:t>
+            </w:r>
+          </w:p>
+        </w:tc>
+      </w:tr>
+      <w:tr>
+        <w:trPr>
+          <w:cantSplit w:val="true"/>
+        </w:trPr>
+        <w:tc>
+          <w:tcPr>
+            <w:tcW w:type="dxa" w:w="504"/>
+            <w:vAlign w:val="center"/>
+            <w:shd w:val="clear" w:color="auto" w:fill="E8F5EC"/>
+          </w:tcPr>
+          <w:p>
+            <w:pPr>
+              <w:spacing w:after="20" w:before="20"/>
+            </w:pPr>
+            <w:r/>
+            <w:r>
+              <w:rPr>
+                <w:b/>
+                <w:i w:val="0"/>
+                <w:color w:val="1B7A3E"/>
+                <w:sz w:val="22"/>
+              </w:rPr>
+              <w:t>✔</w:t>
+            </w:r>
+          </w:p>
+        </w:tc>
+        <w:tc>
+          <w:tcPr>
+            <w:tcW w:type="dxa" w:w="2808"/>
+            <w:vAlign w:val="center"/>
+          </w:tcPr>
+          <w:p>
+            <w:pPr>
+              <w:spacing w:after="20" w:before="20"/>
+            </w:pPr>
+            <w:r/>
+            <w:r>
+              <w:rPr>
+                <w:b/>
+                <w:i w:val="0"/>
+                <w:color w:val="262626"/>
+                <w:sz w:val="19"/>
+              </w:rPr>
+              <w:t>All four conditions still run the same study.</w:t>
+            </w:r>
+          </w:p>
+        </w:tc>
+        <w:tc>
+          <w:tcPr>
+            <w:tcW w:type="dxa" w:w="4968"/>
+            <w:vAlign w:val="center"/>
+          </w:tcPr>
+          <w:p>
+            <w:pPr>
+              <w:spacing w:after="20" w:before="20"/>
+            </w:pPr>
+            <w:r/>
+            <w:r>
+              <w:rPr>
+                <w:b w:val="0"/>
+                <w:i w:val="0"/>
+                <w:color w:val="262626"/>
+                <w:sz w:val="19"/>
+              </w:rPr>
+              <w:t>What each condition does differently is built one task at a time, when you ask. Until then nothing in Block 5 differs.</w:t>
+            </w:r>
+          </w:p>
+        </w:tc>
+        <w:tc>
+          <w:tcPr>
+            <w:tcW w:type="dxa" w:w="1800"/>
+            <w:vAlign w:val="center"/>
+          </w:tcPr>
+          <w:p>
+            <w:pPr>
+              <w:spacing w:after="20" w:before="20"/>
+            </w:pPr>
+            <w:r/>
+            <w:r>
+              <w:rPr>
+                <w:b w:val="0"/>
+                <w:i w:val="0"/>
+                <w:color w:val="595959"/>
+                <w:sz w:val="17"/>
+              </w:rPr>
+              <w:t>validate:conditions, build (N9)</w:t>
             </w:r>
           </w:p>
         </w:tc>
@@ -10583,7 +11073,7 @@
                 <w:color w:val="595959"/>
                 <w:sz w:val="17"/>
               </w:rPr>
-              <w:t>[PASS] K1  the committed tables are exactly what the recipe produces (200000 draws, 3.4s)</w:t>
+              <w:t>[PASS] K1  the committed tables are exactly what the recipe produces (200000 draws, 3.3s)</w:t>
             </w:r>
           </w:p>
         </w:tc>
@@ -10782,7 +11272,7 @@
                 <w:color w:val="595959"/>
                 <w:sz w:val="17"/>
               </w:rPr>
-              <w:t>13</w:t>
+              <w:t>12</w:t>
             </w:r>
           </w:p>
         </w:tc>
@@ -10871,7 +11361,7 @@
                 <w:color w:val="595959"/>
                 <w:sz w:val="17"/>
               </w:rPr>
-              <w:t>10</w:t>
+              <w:t>11</w:t>
             </w:r>
           </w:p>
         </w:tc>
@@ -11049,7 +11539,7 @@
                 <w:color w:val="595959"/>
                 <w:sz w:val="17"/>
               </w:rPr>
-              <w:t>7</w:t>
+              <w:t>8</w:t>
             </w:r>
           </w:p>
         </w:tc>
@@ -11227,7 +11717,7 @@
                 <w:color w:val="595959"/>
                 <w:sz w:val="17"/>
               </w:rPr>
-              <w:t>9</w:t>
+              <w:t>10</w:t>
             </w:r>
           </w:p>
         </w:tc>
@@ -11316,7 +11806,7 @@
                 <w:color w:val="595959"/>
                 <w:sz w:val="17"/>
               </w:rPr>
-              <w:t>16</w:t>
+              <w:t>8</w:t>
             </w:r>
           </w:p>
         </w:tc>
@@ -11342,7 +11832,7 @@
                 <w:color w:val="262626"/>
                 <w:sz w:val="18"/>
               </w:rPr>
-              <w:t>validate:mcf</w:t>
+              <w:t>validate:conditions</w:t>
             </w:r>
           </w:p>
         </w:tc>
@@ -11384,7 +11874,7 @@
                 <w:color w:val="595959"/>
                 <w:sz w:val="17"/>
               </w:rPr>
-              <w:t>ALL MCF GATES PASSED</w:t>
+              <w:t>ALL CONDITION GATES PASSED</w:t>
             </w:r>
           </w:p>
         </w:tc>
@@ -11405,7 +11895,7 @@
                 <w:color w:val="595959"/>
                 <w:sz w:val="17"/>
               </w:rPr>
-              <w:t>8</w:t>
+              <w:t>11</w:t>
             </w:r>
           </w:p>
         </w:tc>
@@ -11431,7 +11921,7 @@
                 <w:color w:val="262626"/>
                 <w:sz w:val="18"/>
               </w:rPr>
-              <w:t>validate:prediction</w:t>
+              <w:t>validate:mcf</w:t>
             </w:r>
           </w:p>
         </w:tc>
@@ -11473,7 +11963,7 @@
                 <w:color w:val="595959"/>
                 <w:sz w:val="17"/>
               </w:rPr>
-              <w:t>ALL PREDICTION GATES PASSED</w:t>
+              <w:t>ALL MCF GATES PASSED</w:t>
             </w:r>
           </w:p>
         </w:tc>
@@ -11494,7 +11984,7 @@
                 <w:color w:val="595959"/>
                 <w:sz w:val="17"/>
               </w:rPr>
-              <w:t>2</w:t>
+              <w:t>5</w:t>
             </w:r>
           </w:p>
         </w:tc>
@@ -11520,7 +12010,7 @@
                 <w:color w:val="262626"/>
                 <w:sz w:val="18"/>
               </w:rPr>
-              <w:t>build</w:t>
+              <w:t>validate:prediction</w:t>
             </w:r>
           </w:p>
         </w:tc>
@@ -11562,7 +12052,7 @@
                 <w:color w:val="595959"/>
                 <w:sz w:val="17"/>
               </w:rPr>
-              <w:t>✓ built in 4.61s</w:t>
+              <w:t>ALL PREDICTION GATES PASSED</w:t>
             </w:r>
           </w:p>
         </w:tc>
@@ -11583,7 +12073,96 @@
                 <w:color w:val="595959"/>
                 <w:sz w:val="17"/>
               </w:rPr>
-              <w:t>6</w:t>
+              <w:t>2</w:t>
+            </w:r>
+          </w:p>
+        </w:tc>
+      </w:tr>
+      <w:tr>
+        <w:trPr>
+          <w:cantSplit w:val="true"/>
+        </w:trPr>
+        <w:tc>
+          <w:tcPr>
+            <w:tcW w:type="dxa" w:w="2160"/>
+            <w:vAlign w:val="center"/>
+          </w:tcPr>
+          <w:p>
+            <w:pPr>
+              <w:spacing w:after="20" w:before="20"/>
+            </w:pPr>
+            <w:r/>
+            <w:r>
+              <w:rPr>
+                <w:b/>
+                <w:i w:val="0"/>
+                <w:color w:val="262626"/>
+                <w:sz w:val="18"/>
+              </w:rPr>
+              <w:t>build</w:t>
+            </w:r>
+          </w:p>
+        </w:tc>
+        <w:tc>
+          <w:tcPr>
+            <w:tcW w:type="dxa" w:w="1152"/>
+            <w:vAlign w:val="center"/>
+          </w:tcPr>
+          <w:p>
+            <w:pPr>
+              <w:spacing w:after="20" w:before="20"/>
+            </w:pPr>
+            <w:r/>
+            <w:r>
+              <w:rPr>
+                <w:b/>
+                <w:i w:val="0"/>
+                <w:color w:val="1B7A3E"/>
+                <w:sz w:val="18"/>
+              </w:rPr>
+              <w:t>passed</w:t>
+            </w:r>
+          </w:p>
+        </w:tc>
+        <w:tc>
+          <w:tcPr>
+            <w:tcW w:type="dxa" w:w="5760"/>
+            <w:vAlign w:val="center"/>
+          </w:tcPr>
+          <w:p>
+            <w:pPr>
+              <w:spacing w:after="20" w:before="20"/>
+            </w:pPr>
+            <w:r/>
+            <w:r>
+              <w:rPr>
+                <w:b w:val="0"/>
+                <w:i w:val="0"/>
+                <w:color w:val="595959"/>
+                <w:sz w:val="17"/>
+              </w:rPr>
+              <w:t>✓ built in 954ms</w:t>
+            </w:r>
+          </w:p>
+        </w:tc>
+        <w:tc>
+          <w:tcPr>
+            <w:tcW w:type="dxa" w:w="1008"/>
+            <w:vAlign w:val="center"/>
+          </w:tcPr>
+          <w:p>
+            <w:pPr>
+              <w:spacing w:after="20" w:before="20"/>
+            </w:pPr>
+            <w:r/>
+            <w:r>
+              <w:rPr>
+                <w:b w:val="0"/>
+                <w:i w:val="0"/>
+                <w:color w:val="595959"/>
+                <w:sz w:val="17"/>
+              </w:rPr>
+              <w:t>2</w:t>
             </w:r>
           </w:p>
         </w:tc>

</xml_diff>

<commit_message>
Accuracy checklist rebuilt: CVR_Only's CVR Rejection page
27 of 27 checks pass on 7e8803a.

Co-Authored-By: Claude Opus 5.5 <noreply@anthropic.com>
</commit_message>
<xml_diff>
--- a/docs/VRDS_Accuracy_Checklist.docx
+++ b/docs/VRDS_Accuracy_Checklist.docx
@@ -41,7 +41,7 @@
           <w:color w:val="595959"/>
           <w:sz w:val="20"/>
         </w:rPr>
-        <w:t>For Waseem and Claude  ·  01 October 2026  ·  code at commit 17e4c9f on Prolific-branch-Edit_10_1</w:t>
+        <w:t>For Waseem and Claude  ·  01 October 2026  ·  code at commit 7e8803a on Prolific-branch-Edit_10_1</w:t>
       </w:r>
     </w:p>
     <w:p>
@@ -60,7 +60,7 @@
         <w:rPr>
           <w:color w:val="595959"/>
         </w:rPr>
-        <w:t xml:space="preserve">  (run 01 October 2026 at 10:55, when this file was made).</w:t>
+        <w:t xml:space="preserve">  (run 01 October 2026 at 17:13, when this file was made).</w:t>
       </w:r>
     </w:p>
     <w:p>
@@ -211,7 +211,7 @@
                 <w:color w:val="262626"/>
                 <w:sz w:val="19"/>
               </w:rPr>
-              <w:t>2026-10-01-conditions</w:t>
+              <w:t>2026-10-01-cvr-rejection-page</w:t>
             </w:r>
           </w:p>
         </w:tc>
@@ -3238,7 +3238,7 @@
                 <w:color w:val="262626"/>
                 <w:sz w:val="19"/>
               </w:rPr>
-              <w:t>All four conditions still run the same study.</w:t>
+              <w:t>Each condition's difference is built one task at a time.</w:t>
             </w:r>
           </w:p>
         </w:tc>
@@ -3259,7 +3259,7 @@
                 <w:color w:val="262626"/>
                 <w:sz w:val="19"/>
               </w:rPr>
-              <w:t>What each condition does differently is built one task at a time, when you ask. Until then nothing in Block 5 differs.</w:t>
+              <w:t>Built so far: CVR_Only's CVR Rejection page. The other three conditions run the same study as before.</w:t>
             </w:r>
           </w:p>
         </w:tc>
@@ -3280,7 +3280,97 @@
                 <w:color w:val="595959"/>
                 <w:sz w:val="17"/>
               </w:rPr>
-              <w:t>validate:conditions, build (N9)</w:t>
+              <w:t>validate:conditions, build (N9, N12)</w:t>
+            </w:r>
+          </w:p>
+        </w:tc>
+      </w:tr>
+      <w:tr>
+        <w:trPr>
+          <w:cantSplit w:val="true"/>
+        </w:trPr>
+        <w:tc>
+          <w:tcPr>
+            <w:tcW w:type="dxa" w:w="504"/>
+            <w:vAlign w:val="center"/>
+            <w:shd w:val="clear" w:color="auto" w:fill="E8F5EC"/>
+          </w:tcPr>
+          <w:p>
+            <w:pPr>
+              <w:spacing w:after="20" w:before="20"/>
+            </w:pPr>
+            <w:r/>
+            <w:r>
+              <w:rPr>
+                <w:b/>
+                <w:i w:val="0"/>
+                <w:color w:val="1B7A3E"/>
+                <w:sz w:val="22"/>
+              </w:rPr>
+              <w:t>✔</w:t>
+            </w:r>
+          </w:p>
+        </w:tc>
+        <w:tc>
+          <w:tcPr>
+            <w:tcW w:type="dxa" w:w="2808"/>
+            <w:vAlign w:val="center"/>
+          </w:tcPr>
+          <w:p>
+            <w:pPr>
+              <w:spacing w:after="20" w:before="20"/>
+            </w:pPr>
+            <w:r/>
+            <w:r>
+              <w:rPr>
+                <w:b/>
+                <w:i w:val="0"/>
+                <w:color w:val="262626"/>
+                <w:sz w:val="19"/>
+              </w:rPr>
+              <w:t>CVR_Only: a refusal opens the CVR Rejection page, not the APA page.</w:t>
+            </w:r>
+          </w:p>
+        </w:tc>
+        <w:tc>
+          <w:tcPr>
+            <w:tcW w:type="dxa" w:w="4968"/>
+            <w:vAlign w:val="center"/>
+          </w:tcPr>
+          <w:p>
+            <w:pPr>
+              <w:spacing w:after="20" w:before="20"/>
+            </w:pPr>
+            <w:r/>
+            <w:r>
+              <w:rPr>
+                <w:b w:val="0"/>
+                <w:i w:val="0"/>
+                <w:color w:val="262626"/>
+                <w:sz w:val="19"/>
+              </w:rPr>
+              <w:t>"A closer look at your choice": the same explanation (the two situations, how far the option fell short), no question, no APA logo, one button back to all the options. On its first visit in a scenario it moves the person-speaking score +25 or -25 and, when both views were seen, the last view +20, inside the scenario; the four values never move. Every visit and move is saved, apart from the APA numbers. Checked live, and condition 1 still opens the APA page.</w:t>
+            </w:r>
+          </w:p>
+        </w:tc>
+        <w:tc>
+          <w:tcPr>
+            <w:tcW w:type="dxa" w:w="1800"/>
+            <w:vAlign w:val="center"/>
+          </w:tcPr>
+          <w:p>
+            <w:pPr>
+              <w:spacing w:after="20" w:before="20"/>
+            </w:pPr>
+            <w:r/>
+            <w:r>
+              <w:rPr>
+                <w:b w:val="0"/>
+                <w:i w:val="0"/>
+                <w:color w:val="595959"/>
+                <w:sz w:val="17"/>
+              </w:rPr>
+              <w:t>validate:conditions (N11, N12, N13)</w:t>
             </w:r>
           </w:p>
         </w:tc>
@@ -10026,7 +10116,7 @@
                 <w:color w:val="595959"/>
                 <w:sz w:val="17"/>
               </w:rPr>
-              <w:t>13</w:t>
+              <w:t>11</w:t>
             </w:r>
           </w:p>
         </w:tc>
@@ -10115,7 +10205,7 @@
                 <w:color w:val="595959"/>
                 <w:sz w:val="17"/>
               </w:rPr>
-              <w:t>15</w:t>
+              <w:t>13</w:t>
             </w:r>
           </w:p>
         </w:tc>
@@ -11183,7 +11273,7 @@
                 <w:color w:val="595959"/>
                 <w:sz w:val="17"/>
               </w:rPr>
-              <w:t>8</w:t>
+              <w:t>7</w:t>
             </w:r>
           </w:p>
         </w:tc>
@@ -11361,7 +11451,7 @@
                 <w:color w:val="595959"/>
                 <w:sz w:val="17"/>
               </w:rPr>
-              <w:t>11</w:t>
+              <w:t>9</w:t>
             </w:r>
           </w:p>
         </w:tc>
@@ -11539,7 +11629,7 @@
                 <w:color w:val="595959"/>
                 <w:sz w:val="17"/>
               </w:rPr>
-              <w:t>8</w:t>
+              <w:t>7</w:t>
             </w:r>
           </w:p>
         </w:tc>
@@ -11717,7 +11807,7 @@
                 <w:color w:val="595959"/>
                 <w:sz w:val="17"/>
               </w:rPr>
-              <w:t>10</w:t>
+              <w:t>7</w:t>
             </w:r>
           </w:p>
         </w:tc>
@@ -11806,7 +11896,7 @@
                 <w:color w:val="595959"/>
                 <w:sz w:val="17"/>
               </w:rPr>
-              <w:t>8</w:t>
+              <w:t>7</w:t>
             </w:r>
           </w:p>
         </w:tc>
@@ -12141,7 +12231,7 @@
                 <w:color w:val="595959"/>
                 <w:sz w:val="17"/>
               </w:rPr>
-              <w:t>✓ built in 954ms</w:t>
+              <w:t>✓ built in 874ms</w:t>
             </w:r>
           </w:p>
         </w:tc>

</xml_diff>

<commit_message>
Accuracy checklist rebuilt: APA_Only
27 of 27 checks pass on bf5b7a6.

Co-Authored-By: Claude Opus 5.5 <noreply@anthropic.com>
</commit_message>
<xml_diff>
--- a/docs/VRDS_Accuracy_Checklist.docx
+++ b/docs/VRDS_Accuracy_Checklist.docx
@@ -41,7 +41,7 @@
           <w:color w:val="595959"/>
           <w:sz w:val="20"/>
         </w:rPr>
-        <w:t>For Waseem and Claude  ·  01 October 2026  ·  code at commit 7e8803a on Prolific-branch-Edit_10_1</w:t>
+        <w:t>For Waseem and Claude  ·  01 October 2026  ·  code at commit bf5b7a6 on Prolific-branch-Edit_10_1</w:t>
       </w:r>
     </w:p>
     <w:p>
@@ -60,7 +60,7 @@
         <w:rPr>
           <w:color w:val="595959"/>
         </w:rPr>
-        <w:t xml:space="preserve">  (run 01 October 2026 at 17:13, when this file was made).</w:t>
+        <w:t xml:space="preserve">  (run 01 October 2026 at 19:24, when this file was made).</w:t>
       </w:r>
     </w:p>
     <w:p>
@@ -211,7 +211,7 @@
                 <w:color w:val="262626"/>
                 <w:sz w:val="19"/>
               </w:rPr>
-              <w:t>2026-10-01-cvr-rejection-page</w:t>
+              <w:t>2026-10-01-apa-only</w:t>
             </w:r>
           </w:p>
         </w:tc>
@@ -3259,7 +3259,7 @@
                 <w:color w:val="262626"/>
                 <w:sz w:val="19"/>
               </w:rPr>
-              <w:t>Built so far: CVR_Only's CVR Rejection page. The other three conditions run the same study as before.</w:t>
+              <w:t>Built so far: CVR_Only's CVR Rejection page and APA_Only's straight-to-APA flow. Baseline still runs the same study as CVR+APA.</w:t>
             </w:r>
           </w:p>
         </w:tc>
@@ -3280,7 +3280,97 @@
                 <w:color w:val="595959"/>
                 <w:sz w:val="17"/>
               </w:rPr>
-              <w:t>validate:conditions, build (N9, N12)</w:t>
+              <w:t>validate:conditions, build (N9, N12, N15)</w:t>
+            </w:r>
+          </w:p>
+        </w:tc>
+      </w:tr>
+      <w:tr>
+        <w:trPr>
+          <w:cantSplit w:val="true"/>
+        </w:trPr>
+        <w:tc>
+          <w:tcPr>
+            <w:tcW w:type="dxa" w:w="504"/>
+            <w:vAlign w:val="center"/>
+            <w:shd w:val="clear" w:color="auto" w:fill="E8F5EC"/>
+          </w:tcPr>
+          <w:p>
+            <w:pPr>
+              <w:spacing w:after="20" w:before="20"/>
+            </w:pPr>
+            <w:r/>
+            <w:r>
+              <w:rPr>
+                <w:b/>
+                <w:i w:val="0"/>
+                <w:color w:val="1B7A3E"/>
+                <w:sz w:val="22"/>
+              </w:rPr>
+              <w:t>✔</w:t>
+            </w:r>
+          </w:p>
+        </w:tc>
+        <w:tc>
+          <w:tcPr>
+            <w:tcW w:type="dxa" w:w="2808"/>
+            <w:vAlign w:val="center"/>
+          </w:tcPr>
+          <w:p>
+            <w:pPr>
+              <w:spacing w:after="20" w:before="20"/>
+            </w:pPr>
+            <w:r/>
+            <w:r>
+              <w:rPr>
+                <w:b/>
+                <w:i w:val="0"/>
+                <w:color w:val="262626"/>
+                <w:sz w:val="19"/>
+              </w:rPr>
+              <w:t>APA_Only: a misaligned choice opens the APA page at once.</w:t>
+            </w:r>
+          </w:p>
+        </w:tc>
+        <w:tc>
+          <w:tcPr>
+            <w:tcW w:type="dxa" w:w="4968"/>
+            <w:vAlign w:val="center"/>
+          </w:tcPr>
+          <w:p>
+            <w:pPr>
+              <w:spacing w:after="20" w:before="20"/>
+            </w:pPr>
+            <w:r/>
+            <w:r>
+              <w:rPr>
+                <w:b w:val="0"/>
+                <w:i w:val="0"/>
+                <w:color w:val="262626"/>
+                <w:sz w:val="19"/>
+              </w:rPr>
+              <w:t>No reflection page and no person speaking; the APA page shows only its value question (no two-situations table, no view question). The stakeholder, directness and context scores never move (the APA rule's automatic stakeholder move is off there); each APA visit still counts for Stability; the results page says "Clarification shown"; the record says no reflection was shown; the feedback asks the APA questions, never the CVR ones. Checked live.</w:t>
+            </w:r>
+          </w:p>
+        </w:tc>
+        <w:tc>
+          <w:tcPr>
+            <w:tcW w:type="dxa" w:w="1800"/>
+            <w:vAlign w:val="center"/>
+          </w:tcPr>
+          <w:p>
+            <w:pPr>
+              <w:spacing w:after="20" w:before="20"/>
+            </w:pPr>
+            <w:r/>
+            <w:r>
+              <w:rPr>
+                <w:b w:val="0"/>
+                <w:i w:val="0"/>
+                <w:color w:val="595959"/>
+                <w:sz w:val="17"/>
+              </w:rPr>
+              <w:t>validate:conditions (N14, N15, N16)</w:t>
             </w:r>
           </w:p>
         </w:tc>
@@ -10116,7 +10206,7 @@
                 <w:color w:val="595959"/>
                 <w:sz w:val="17"/>
               </w:rPr>
-              <w:t>11</w:t>
+              <w:t>12</w:t>
             </w:r>
           </w:p>
         </w:tc>
@@ -10205,7 +10295,7 @@
                 <w:color w:val="595959"/>
                 <w:sz w:val="17"/>
               </w:rPr>
-              <w:t>13</w:t>
+              <w:t>15</w:t>
             </w:r>
           </w:p>
         </w:tc>
@@ -11163,7 +11253,7 @@
                 <w:color w:val="595959"/>
                 <w:sz w:val="17"/>
               </w:rPr>
-              <w:t>[PASS] K1  the committed tables are exactly what the recipe produces (200000 draws, 3.3s)</w:t>
+              <w:t>[PASS] K1  the committed tables are exactly what the recipe produces (200000 draws, 3.4s)</w:t>
             </w:r>
           </w:p>
         </w:tc>
@@ -11273,7 +11363,7 @@
                 <w:color w:val="595959"/>
                 <w:sz w:val="17"/>
               </w:rPr>
-              <w:t>7</w:t>
+              <w:t>8</w:t>
             </w:r>
           </w:p>
         </w:tc>
@@ -11451,7 +11541,7 @@
                 <w:color w:val="595959"/>
                 <w:sz w:val="17"/>
               </w:rPr>
-              <w:t>9</w:t>
+              <w:t>10</w:t>
             </w:r>
           </w:p>
         </w:tc>
@@ -11807,7 +11897,7 @@
                 <w:color w:val="595959"/>
                 <w:sz w:val="17"/>
               </w:rPr>
-              <w:t>7</w:t>
+              <w:t>8</w:t>
             </w:r>
           </w:p>
         </w:tc>
@@ -12231,7 +12321,7 @@
                 <w:color w:val="595959"/>
                 <w:sz w:val="17"/>
               </w:rPr>
-              <w:t>✓ built in 874ms</w:t>
+              <w:t>✓ built in 869ms</w:t>
             </w:r>
           </w:p>
         </w:tc>

</xml_diff>

<commit_message>
Accuracy checklist rebuilt: APA_Only's opening sentence
27 of 27 checks pass on 87c02a2.

Co-Authored-By: Claude Opus 5.5 <noreply@anthropic.com>
</commit_message>
<xml_diff>
--- a/docs/VRDS_Accuracy_Checklist.docx
+++ b/docs/VRDS_Accuracy_Checklist.docx
@@ -41,7 +41,7 @@
           <w:color w:val="595959"/>
           <w:sz w:val="20"/>
         </w:rPr>
-        <w:t>For Waseem and Claude  ·  01 October 2026  ·  code at commit bf5b7a6 on Prolific-branch-Edit_10_1</w:t>
+        <w:t>For Waseem and Claude  ·  01 October 2026  ·  code at commit 87c02a2 on Prolific-branch-Edit_10_1</w:t>
       </w:r>
     </w:p>
     <w:p>
@@ -60,7 +60,7 @@
         <w:rPr>
           <w:color w:val="595959"/>
         </w:rPr>
-        <w:t xml:space="preserve">  (run 01 October 2026 at 19:24, when this file was made).</w:t>
+        <w:t xml:space="preserve">  (run 01 October 2026 at 19:52, when this file was made).</w:t>
       </w:r>
     </w:p>
     <w:p>
@@ -3349,7 +3349,7 @@
                 <w:color w:val="262626"/>
                 <w:sz w:val="19"/>
               </w:rPr>
-              <w:t>No reflection page and no person speaking; the APA page shows only its value question (no two-situations table, no view question). The stakeholder, directness and context scores never move (the APA rule's automatic stakeholder move is off there); each APA visit still counts for Stability; the results page says "Clarification shown"; the record says no reflection was shown; the feedback asks the APA questions, never the CVR ones. Checked live.</w:t>
+              <w:t>No reflection page and no person speaking; the APA page shows only its value question (no two-situations table, no view question) and opens with your sentence. The stakeholder, directness and context scores never move (the APA rule's automatic stakeholder move is off there); each APA visit still counts for Stability; the results page says "Clarification shown"; the record says no reflection was shown; the feedback asks the APA questions, never the CVR ones. Checked live.</w:t>
             </w:r>
           </w:p>
         </w:tc>
@@ -10206,7 +10206,7 @@
                 <w:color w:val="595959"/>
                 <w:sz w:val="17"/>
               </w:rPr>
-              <w:t>12</w:t>
+              <w:t>14</w:t>
             </w:r>
           </w:p>
         </w:tc>
@@ -10295,7 +10295,7 @@
                 <w:color w:val="595959"/>
                 <w:sz w:val="17"/>
               </w:rPr>
-              <w:t>15</w:t>
+              <w:t>16</w:t>
             </w:r>
           </w:p>
         </w:tc>
@@ -11185,7 +11185,7 @@
                 <w:color w:val="595959"/>
                 <w:sz w:val="17"/>
               </w:rPr>
-              <w:t>9</w:t>
+              <w:t>10</w:t>
             </w:r>
           </w:p>
         </w:tc>
@@ -11719,7 +11719,7 @@
                 <w:color w:val="595959"/>
                 <w:sz w:val="17"/>
               </w:rPr>
-              <w:t>7</w:t>
+              <w:t>8</w:t>
             </w:r>
           </w:p>
         </w:tc>
@@ -12321,7 +12321,7 @@
                 <w:color w:val="595959"/>
                 <w:sz w:val="17"/>
               </w:rPr>
-              <w:t>✓ built in 869ms</w:t>
+              <w:t>✓ built in 904ms</w:t>
             </w:r>
           </w:p>
         </w:tc>

</xml_diff>

<commit_message>
Accuracy checklist rebuilt: APA_Only's box and no warning
27 of 27 checks pass on c150247.

Co-Authored-By: Claude Opus 5.5 <noreply@anthropic.com>
</commit_message>
<xml_diff>
--- a/docs/VRDS_Accuracy_Checklist.docx
+++ b/docs/VRDS_Accuracy_Checklist.docx
@@ -41,7 +41,7 @@
           <w:color w:val="595959"/>
           <w:sz w:val="20"/>
         </w:rPr>
-        <w:t>For Waseem and Claude  ·  01 October 2026  ·  code at commit 87c02a2 on Prolific-branch-Edit_10_1</w:t>
+        <w:t>For Waseem and Claude  ·  01 October 2026  ·  code at commit c150247 on Prolific-branch-Edit_10_1</w:t>
       </w:r>
     </w:p>
     <w:p>
@@ -60,7 +60,7 @@
         <w:rPr>
           <w:color w:val="595959"/>
         </w:rPr>
-        <w:t xml:space="preserve">  (run 01 October 2026 at 19:52, when this file was made).</w:t>
+        <w:t xml:space="preserve">  (run 01 October 2026 at 20:03, when this file was made).</w:t>
       </w:r>
     </w:p>
     <w:p>
@@ -211,7 +211,7 @@
                 <w:color w:val="262626"/>
                 <w:sz w:val="19"/>
               </w:rPr>
-              <w:t>2026-10-01-apa-only</w:t>
+              <w:t>2026-10-01-apa-only-main-value</w:t>
             </w:r>
           </w:p>
         </w:tc>
@@ -3349,7 +3349,7 @@
                 <w:color w:val="262626"/>
                 <w:sz w:val="19"/>
               </w:rPr>
-              <w:t>No reflection page and no person speaking; the APA page shows only its value question (no two-situations table, no view question) and opens with your sentence. The stakeholder, directness and context scores never move (the APA rule's automatic stakeholder move is off there); each APA visit still counts for Stability; the results page says "Clarification shown"; the record says no reflection was shown; the feedback asks the APA questions, never the CVR ones. Checked live.</w:t>
+              <w:t>No reflection page and no person speaking; the APA page shows only its value question (no two-situations table, no view question), opens with your sentence, says which value the chosen option serves most, and goes back to all the options without a warning. The stakeholder, directness and context scores never move (the APA rule's automatic stakeholder move is off there); each APA visit still counts for Stability; the results page says "Clarification shown"; the record says no reflection was shown; the feedback asks the APA questions, never the CVR ones. Checked live.</w:t>
             </w:r>
           </w:p>
         </w:tc>
@@ -10295,7 +10295,7 @@
                 <w:color w:val="595959"/>
                 <w:sz w:val="17"/>
               </w:rPr>
-              <w:t>16</w:t>
+              <w:t>20</w:t>
             </w:r>
           </w:p>
         </w:tc>
@@ -11253,7 +11253,7 @@
                 <w:color w:val="595959"/>
                 <w:sz w:val="17"/>
               </w:rPr>
-              <w:t>[PASS] K1  the committed tables are exactly what the recipe produces (200000 draws, 3.4s)</w:t>
+              <w:t>[PASS] K1  the committed tables are exactly what the recipe produces (200000 draws, 3.5s)</w:t>
             </w:r>
           </w:p>
         </w:tc>
@@ -11274,7 +11274,7 @@
                 <w:color w:val="595959"/>
                 <w:sz w:val="17"/>
               </w:rPr>
-              <w:t>5</w:t>
+              <w:t>6</w:t>
             </w:r>
           </w:p>
         </w:tc>
@@ -11452,7 +11452,7 @@
                 <w:color w:val="595959"/>
                 <w:sz w:val="17"/>
               </w:rPr>
-              <w:t>12</w:t>
+              <w:t>14</w:t>
             </w:r>
           </w:p>
         </w:tc>
@@ -11541,7 +11541,7 @@
                 <w:color w:val="595959"/>
                 <w:sz w:val="17"/>
               </w:rPr>
-              <w:t>10</w:t>
+              <w:t>12</w:t>
             </w:r>
           </w:p>
         </w:tc>
@@ -11719,7 +11719,7 @@
                 <w:color w:val="595959"/>
                 <w:sz w:val="17"/>
               </w:rPr>
-              <w:t>8</w:t>
+              <w:t>9</w:t>
             </w:r>
           </w:p>
         </w:tc>
@@ -11897,7 +11897,7 @@
                 <w:color w:val="595959"/>
                 <w:sz w:val="17"/>
               </w:rPr>
-              <w:t>8</w:t>
+              <w:t>9</w:t>
             </w:r>
           </w:p>
         </w:tc>
@@ -11986,7 +11986,7 @@
                 <w:color w:val="595959"/>
                 <w:sz w:val="17"/>
               </w:rPr>
-              <w:t>7</w:t>
+              <w:t>8</w:t>
             </w:r>
           </w:p>
         </w:tc>
@@ -12321,7 +12321,7 @@
                 <w:color w:val="595959"/>
                 <w:sz w:val="17"/>
               </w:rPr>
-              <w:t>✓ built in 904ms</w:t>
+              <w:t>✓ built in 901ms</w:t>
             </w:r>
           </w:p>
         </w:tc>

</xml_diff>

<commit_message>
Accuracy checklist rebuilt: Baseline's confirmation page
Co-Authored-By: Claude Opus 5.5 <noreply@anthropic.com>
</commit_message>
<xml_diff>
--- a/docs/VRDS_Accuracy_Checklist.docx
+++ b/docs/VRDS_Accuracy_Checklist.docx
@@ -41,7 +41,7 @@
           <w:color w:val="595959"/>
           <w:sz w:val="20"/>
         </w:rPr>
-        <w:t>For Waseem and Claude  ·  01 October 2026  ·  code at commit c150247 on Prolific-branch-Edit_10_1</w:t>
+        <w:t>For Waseem and Claude  ·  01 October 2026  ·  code at commit 3013315 on Prolific-branch-Edit_10_1</w:t>
       </w:r>
     </w:p>
     <w:p>
@@ -60,7 +60,7 @@
         <w:rPr>
           <w:color w:val="595959"/>
         </w:rPr>
-        <w:t xml:space="preserve">  (run 01 October 2026 at 20:03, when this file was made).</w:t>
+        <w:t xml:space="preserve">  (run 01 October 2026 at 21:55, when this file was made).</w:t>
       </w:r>
     </w:p>
     <w:p>
@@ -211,7 +211,7 @@
                 <w:color w:val="262626"/>
                 <w:sz w:val="19"/>
               </w:rPr>
-              <w:t>2026-10-01-apa-only-main-value</w:t>
+              <w:t>2026-10-01-baseline</w:t>
             </w:r>
           </w:p>
         </w:tc>
@@ -3259,7 +3259,7 @@
                 <w:color w:val="262626"/>
                 <w:sz w:val="19"/>
               </w:rPr>
-              <w:t>Built so far: CVR_Only's CVR Rejection page and APA_Only's straight-to-APA flow. Baseline still runs the same study as CVR+APA.</w:t>
+              <w:t>Built: CVR_Only's CVR Rejection page, APA_Only's straight-to-APA flow and Baseline's confirmation page, so all four conditions now differ from Block 5 on.</w:t>
             </w:r>
           </w:p>
         </w:tc>
@@ -3280,7 +3280,97 @@
                 <w:color w:val="595959"/>
                 <w:sz w:val="17"/>
               </w:rPr>
-              <w:t>validate:conditions, build (N9, N12, N15)</w:t>
+              <w:t>validate:conditions, build (N9, N12, N15, N18)</w:t>
+            </w:r>
+          </w:p>
+        </w:tc>
+      </w:tr>
+      <w:tr>
+        <w:trPr>
+          <w:cantSplit w:val="true"/>
+        </w:trPr>
+        <w:tc>
+          <w:tcPr>
+            <w:tcW w:type="dxa" w:w="504"/>
+            <w:vAlign w:val="center"/>
+            <w:shd w:val="clear" w:color="auto" w:fill="E8F5EC"/>
+          </w:tcPr>
+          <w:p>
+            <w:pPr>
+              <w:spacing w:after="20" w:before="20"/>
+            </w:pPr>
+            <w:r/>
+            <w:r>
+              <w:rPr>
+                <w:b/>
+                <w:i w:val="0"/>
+                <w:color w:val="1B7A3E"/>
+                <w:sz w:val="22"/>
+              </w:rPr>
+              <w:t>✔</w:t>
+            </w:r>
+          </w:p>
+        </w:tc>
+        <w:tc>
+          <w:tcPr>
+            <w:tcW w:type="dxa" w:w="2808"/>
+            <w:vAlign w:val="center"/>
+          </w:tcPr>
+          <w:p>
+            <w:pPr>
+              <w:spacing w:after="20" w:before="20"/>
+            </w:pPr>
+            <w:r/>
+            <w:r>
+              <w:rPr>
+                <w:b/>
+                <w:i w:val="0"/>
+                <w:color w:val="262626"/>
+                <w:sz w:val="19"/>
+              </w:rPr>
+              <w:t>Baseline: a misaligned choice gets the confirmation page, and keeping it moves the values.</w:t>
+            </w:r>
+          </w:p>
+        </w:tc>
+        <w:tc>
+          <w:tcPr>
+            <w:tcW w:type="dxa" w:w="4968"/>
+            <w:vAlign w:val="center"/>
+          </w:tcPr>
+          <w:p>
+            <w:pPr>
+              <w:spacing w:after="20" w:before="20"/>
+            </w:pPr>
+            <w:r/>
+            <w:r>
+              <w:rPr>
+                <w:b w:val="0"/>
+                <w:i w:val="0"/>
+                <w:color w:val="262626"/>
+                <w:sz w:val="19"/>
+              </w:rPr>
+              <w:t>No reflection, no person, no APA page. The page says "Before you confirm, take a moment with what this option gives up." (a good fit keeps "fits your earlier priorities") and asks "How sure are you about this choice?". Keeping it: +30 to the value the option serves most, -10 (misaligned) or -15 (strongly misaligned) to the others, all x 0.6-1.0 by how sure; a Stability step; the three reflection scores never move; no CVR or APA feedback questions. Checked live.</w:t>
+            </w:r>
+          </w:p>
+        </w:tc>
+        <w:tc>
+          <w:tcPr>
+            <w:tcW w:type="dxa" w:w="1800"/>
+            <w:vAlign w:val="center"/>
+          </w:tcPr>
+          <w:p>
+            <w:pPr>
+              <w:spacing w:after="20" w:before="20"/>
+            </w:pPr>
+            <w:r/>
+            <w:r>
+              <w:rPr>
+                <w:b w:val="0"/>
+                <w:i w:val="0"/>
+                <w:color w:val="595959"/>
+                <w:sz w:val="17"/>
+              </w:rPr>
+              <w:t>validate:conditions (N17, N18, N19)</w:t>
             </w:r>
           </w:p>
         </w:tc>
@@ -10206,7 +10296,7 @@
                 <w:color w:val="595959"/>
                 <w:sz w:val="17"/>
               </w:rPr>
-              <w:t>14</w:t>
+              <w:t>15</w:t>
             </w:r>
           </w:p>
         </w:tc>
@@ -10295,7 +10385,7 @@
                 <w:color w:val="595959"/>
                 <w:sz w:val="17"/>
               </w:rPr>
-              <w:t>20</w:t>
+              <w:t>18</w:t>
             </w:r>
           </w:p>
         </w:tc>
@@ -11253,7 +11343,7 @@
                 <w:color w:val="595959"/>
                 <w:sz w:val="17"/>
               </w:rPr>
-              <w:t>[PASS] K1  the committed tables are exactly what the recipe produces (200000 draws, 3.5s)</w:t>
+              <w:t>[PASS] K1  the committed tables are exactly what the recipe produces (200000 draws, 3.3s)</w:t>
             </w:r>
           </w:p>
         </w:tc>
@@ -11274,7 +11364,7 @@
                 <w:color w:val="595959"/>
                 <w:sz w:val="17"/>
               </w:rPr>
-              <w:t>6</w:t>
+              <w:t>5</w:t>
             </w:r>
           </w:p>
         </w:tc>
@@ -11363,7 +11453,7 @@
                 <w:color w:val="595959"/>
                 <w:sz w:val="17"/>
               </w:rPr>
-              <w:t>8</w:t>
+              <w:t>7</w:t>
             </w:r>
           </w:p>
         </w:tc>
@@ -11541,7 +11631,7 @@
                 <w:color w:val="595959"/>
                 <w:sz w:val="17"/>
               </w:rPr>
-              <w:t>12</w:t>
+              <w:t>9</w:t>
             </w:r>
           </w:p>
         </w:tc>
@@ -11719,7 +11809,7 @@
                 <w:color w:val="595959"/>
                 <w:sz w:val="17"/>
               </w:rPr>
-              <w:t>9</w:t>
+              <w:t>8</w:t>
             </w:r>
           </w:p>
         </w:tc>
@@ -11897,7 +11987,7 @@
                 <w:color w:val="595959"/>
                 <w:sz w:val="17"/>
               </w:rPr>
-              <w:t>9</w:t>
+              <w:t>8</w:t>
             </w:r>
           </w:p>
         </w:tc>
@@ -11986,7 +12076,7 @@
                 <w:color w:val="595959"/>
                 <w:sz w:val="17"/>
               </w:rPr>
-              <w:t>8</w:t>
+              <w:t>6</w:t>
             </w:r>
           </w:p>
         </w:tc>
@@ -12075,7 +12165,7 @@
                 <w:color w:val="595959"/>
                 <w:sz w:val="17"/>
               </w:rPr>
-              <w:t>11</w:t>
+              <w:t>10</w:t>
             </w:r>
           </w:p>
         </w:tc>
@@ -12321,7 +12411,7 @@
                 <w:color w:val="595959"/>
                 <w:sz w:val="17"/>
               </w:rPr>
-              <w:t>✓ built in 901ms</w:t>
+              <w:t>✓ built in 830ms</w:t>
             </w:r>
           </w:p>
         </w:tc>

</xml_diff>

<commit_message>
Accuracy checklist rebuilt: Stability between conditions is a stated limit
Co-Authored-By: Claude Opus 5.5 <noreply@anthropic.com>
</commit_message>
<xml_diff>
--- a/docs/VRDS_Accuracy_Checklist.docx
+++ b/docs/VRDS_Accuracy_Checklist.docx
@@ -41,7 +41,7 @@
           <w:color w:val="595959"/>
           <w:sz w:val="20"/>
         </w:rPr>
-        <w:t>For Waseem and Claude  ·  01 October 2026  ·  code at commit 3013315 on Prolific-branch-Edit_10_1</w:t>
+        <w:t>For Waseem and Claude  ·  01 October 2026  ·  code at commit 119d223 on Prolific-branch-Edit_10_1</w:t>
       </w:r>
     </w:p>
     <w:p>
@@ -60,7 +60,7 @@
         <w:rPr>
           <w:color w:val="595959"/>
         </w:rPr>
-        <w:t xml:space="preserve">  (run 01 October 2026 at 21:55, when this file was made).</w:t>
+        <w:t xml:space="preserve">  (run 01 October 2026 at 22:29, when this file was made).</w:t>
       </w:r>
     </w:p>
     <w:p>
@@ -9820,6 +9820,53 @@
                 <w:color w:val="262626"/>
                 <w:sz w:val="19"/>
               </w:rPr>
+              <w:t>Stability is moved by each condition's own rules.</w:t>
+            </w:r>
+          </w:p>
+        </w:tc>
+        <w:tc>
+          <w:tcPr>
+            <w:tcW w:type="dxa" w:w="5472"/>
+            <w:vAlign w:val="center"/>
+          </w:tcPr>
+          <w:p>
+            <w:pPr>
+              <w:spacing w:after="20" w:before="20"/>
+            </w:pPr>
+            <w:r/>
+            <w:r>
+              <w:rPr>
+                <w:b w:val="0"/>
+                <w:i w:val="0"/>
+                <w:color w:val="262626"/>
+                <w:sz w:val="19"/>
+              </w:rPr>
+              <w:t>The same behaviour can score up to about 22 points apart between conditions (docs/MAJOR_SCORES_BY_CONDITION.md, HOW_TO_ANALYZE 4.12); VCI moves about 1 point. Compare Stability inside a condition, or against that page's gaps.</w:t>
+            </w:r>
+          </w:p>
+        </w:tc>
+      </w:tr>
+      <w:tr>
+        <w:trPr>
+          <w:cantSplit w:val="true"/>
+        </w:trPr>
+        <w:tc>
+          <w:tcPr>
+            <w:tcW w:type="dxa" w:w="4608"/>
+            <w:vAlign w:val="center"/>
+          </w:tcPr>
+          <w:p>
+            <w:pPr>
+              <w:spacing w:after="20" w:before="20"/>
+            </w:pPr>
+            <w:r/>
+            <w:r>
+              <w:rPr>
+                <w:b/>
+                <w:i w:val="0"/>
+                <w:color w:val="262626"/>
+                <w:sz w:val="19"/>
+              </w:rPr>
               <w:t>Stability's level depends on the step sizes.</w:t>
             </w:r>
           </w:p>
@@ -10296,7 +10343,7 @@
                 <w:color w:val="595959"/>
                 <w:sz w:val="17"/>
               </w:rPr>
-              <w:t>15</w:t>
+              <w:t>12</w:t>
             </w:r>
           </w:p>
         </w:tc>
@@ -10385,7 +10432,7 @@
                 <w:color w:val="595959"/>
                 <w:sz w:val="17"/>
               </w:rPr>
-              <w:t>18</w:t>
+              <w:t>14</w:t>
             </w:r>
           </w:p>
         </w:tc>
@@ -11275,7 +11322,7 @@
                 <w:color w:val="595959"/>
                 <w:sz w:val="17"/>
               </w:rPr>
-              <w:t>10</w:t>
+              <w:t>9</w:t>
             </w:r>
           </w:p>
         </w:tc>
@@ -11542,7 +11589,7 @@
                 <w:color w:val="595959"/>
                 <w:sz w:val="17"/>
               </w:rPr>
-              <w:t>14</w:t>
+              <w:t>12</w:t>
             </w:r>
           </w:p>
         </w:tc>
@@ -11809,7 +11856,7 @@
                 <w:color w:val="595959"/>
                 <w:sz w:val="17"/>
               </w:rPr>
-              <w:t>8</w:t>
+              <w:t>6</w:t>
             </w:r>
           </w:p>
         </w:tc>
@@ -11987,7 +12034,7 @@
                 <w:color w:val="595959"/>
                 <w:sz w:val="17"/>
               </w:rPr>
-              <w:t>8</w:t>
+              <w:t>7</w:t>
             </w:r>
           </w:p>
         </w:tc>
@@ -12411,7 +12458,7 @@
                 <w:color w:val="595959"/>
                 <w:sz w:val="17"/>
               </w:rPr>
-              <w:t>✓ built in 830ms</w:t>
+              <w:t>✓ built in 936ms</w:t>
             </w:r>
           </w:p>
         </w:tc>

</xml_diff>

<commit_message>
Accuracy checklist rebuilt: Stability from two parts
Co-Authored-By: Claude Opus 5.5 <noreply@anthropic.com>
</commit_message>
<xml_diff>
--- a/docs/VRDS_Accuracy_Checklist.docx
+++ b/docs/VRDS_Accuracy_Checklist.docx
@@ -41,7 +41,7 @@
           <w:color w:val="595959"/>
           <w:sz w:val="20"/>
         </w:rPr>
-        <w:t>For Waseem and Claude  ·  01 October 2026  ·  code at commit 119d223 on Prolific-branch-Edit_10_1</w:t>
+        <w:t>For Waseem and Claude  ·  02 October 2026  ·  code at commit 1cd7a7f on Prolific-branch-Edit_10_1</w:t>
       </w:r>
     </w:p>
     <w:p>
@@ -60,7 +60,7 @@
         <w:rPr>
           <w:color w:val="595959"/>
         </w:rPr>
-        <w:t xml:space="preserve">  (run 01 October 2026 at 22:29, when this file was made).</w:t>
+        <w:t xml:space="preserve">  (run 02 October 2026 at 09:25, when this file was made).</w:t>
       </w:r>
     </w:p>
     <w:p>
@@ -211,7 +211,7 @@
                 <w:color w:val="262626"/>
                 <w:sz w:val="19"/>
               </w:rPr>
-              <w:t>2026-10-01-baseline</w:t>
+              <w:t>2026-10-02-stability-two-parts</w:t>
             </w:r>
           </w:p>
         </w:tc>
@@ -415,7 +415,7 @@
                 <w:color w:val="262626"/>
                 <w:sz w:val="19"/>
               </w:rPr>
-              <w:t>2026-09-19-e</w:t>
+              <w:t>2026-10-02-f</w:t>
             </w:r>
           </w:p>
         </w:tc>
@@ -4959,7 +4959,7 @@
                 <w:color w:val="262626"/>
                 <w:sz w:val="19"/>
               </w:rPr>
-              <w:t>Stability's own rule over all six, on the running values: the four decisions count exactly as Stability does, the wish and the veil when the final choice was not one of the two best fits. It is never above Stability. Shown beside Stability in the results page's stability box.</w:t>
+              <w:t>Stability's own rule over all six, on the running values: the four decisions count exactly as Stability does, the wish and the veil when the final choice was not one of the two best fits; since 2 October 2026 two parts averaged, like Stability (its order part is never above Stability's). Shown beside Stability in the results page's stability box.</w:t>
             </w:r>
           </w:p>
         </w:tc>
@@ -5139,7 +5139,7 @@
                 <w:color w:val="262626"/>
                 <w:sz w:val="19"/>
               </w:rPr>
-              <w:t>Counts how many pairs of values swapped places at the moments the person went against their best fit. It also says whether it measured anything at all (stability_was_measured).</w:t>
+              <w:t>Since 2 October 2026 the average of two parts, at the moments the person went against their best fit: how many pairs of values swapped places (the order part) and how far the four values moved (the difference part, counted steps only). The same five words on edges 94 / 85 / 63 / 49, re-derived from the pretend people on every report. It also says whether it measured anything at all (stability_was_measured).</w:t>
             </w:r>
           </w:p>
         </w:tc>
@@ -5160,7 +5160,7 @@
                 <w:color w:val="595959"/>
                 <w:sz w:val="17"/>
               </w:rPr>
-              <w:t>validate:stability, validate:dbshape (D62)</w:t>
+              <w:t>validate:stability, validate:dbshape (S9, S12-S15, D62, D69)</w:t>
             </w:r>
           </w:p>
         </w:tc>
@@ -9820,7 +9820,7 @@
                 <w:color w:val="262626"/>
                 <w:sz w:val="19"/>
               </w:rPr>
-              <w:t>Stability is moved by each condition's own rules.</w:t>
+              <w:t>Stability is moved a little by each condition's own rules.</w:t>
             </w:r>
           </w:p>
         </w:tc>
@@ -9841,7 +9841,54 @@
                 <w:color w:val="262626"/>
                 <w:sz w:val="19"/>
               </w:rPr>
-              <w:t>The same behaviour can score up to about 22 points apart between conditions (docs/MAJOR_SCORES_BY_CONDITION.md, HOW_TO_ANALYZE 4.12); VCI moves about 1 point. Compare Stability inside a condition, or against that page's gaps.</w:t>
+              <w:t>The same behaviour can score up to about 13 points apart between conditions (22 under the order rule alone; docs/MAJOR_SCORES_BY_CONDITION.md, HOW_TO_ANALYZE 4.12); VCI moves about 1 point. Compare Stability inside a condition, or against that page's gaps.</w:t>
+            </w:r>
+          </w:p>
+        </w:tc>
+      </w:tr>
+      <w:tr>
+        <w:trPr>
+          <w:cantSplit w:val="true"/>
+        </w:trPr>
+        <w:tc>
+          <w:tcPr>
+            <w:tcW w:type="dxa" w:w="4608"/>
+            <w:vAlign w:val="center"/>
+          </w:tcPr>
+          <w:p>
+            <w:pPr>
+              <w:spacing w:after="20" w:before="20"/>
+            </w:pPr>
+            <w:r/>
+            <w:r>
+              <w:rPr>
+                <w:b/>
+                <w:i w:val="0"/>
+                <w:color w:val="262626"/>
+                <w:sz w:val="19"/>
+              </w:rPr>
+              <w:t>Never correlate Stability with its two parts.</w:t>
+            </w:r>
+          </w:p>
+        </w:tc>
+        <w:tc>
+          <w:tcPr>
+            <w:tcW w:type="dxa" w:w="5472"/>
+            <w:vAlign w:val="center"/>
+          </w:tcPr>
+          <w:p>
+            <w:pPr>
+              <w:spacing w:after="20" w:before="20"/>
+            </w:pPr>
+            <w:r/>
+            <w:r>
+              <w:rPr>
+                <w:b w:val="0"/>
+                <w:i w:val="0"/>
+                <w:color w:val="262626"/>
+                <w:sz w:val="19"/>
+              </w:rPr>
+              <w:t>It is their average (value_order_stability, value_difference_stability).</w:t>
             </w:r>
           </w:p>
         </w:tc>
@@ -10343,7 +10390,7 @@
                 <w:color w:val="595959"/>
                 <w:sz w:val="17"/>
               </w:rPr>
-              <w:t>12</w:t>
+              <w:t>13</w:t>
             </w:r>
           </w:p>
         </w:tc>
@@ -10432,7 +10479,7 @@
                 <w:color w:val="595959"/>
                 <w:sz w:val="17"/>
               </w:rPr>
-              <w:t>14</w:t>
+              <w:t>15</w:t>
             </w:r>
           </w:p>
         </w:tc>
@@ -11322,7 +11369,7 @@
                 <w:color w:val="595959"/>
                 <w:sz w:val="17"/>
               </w:rPr>
-              <w:t>9</w:t>
+              <w:t>10</w:t>
             </w:r>
           </w:p>
         </w:tc>
@@ -11500,7 +11547,7 @@
                 <w:color w:val="595959"/>
                 <w:sz w:val="17"/>
               </w:rPr>
-              <w:t>7</w:t>
+              <w:t>8</w:t>
             </w:r>
           </w:p>
         </w:tc>
@@ -11589,7 +11636,7 @@
                 <w:color w:val="595959"/>
                 <w:sz w:val="17"/>
               </w:rPr>
-              <w:t>12</w:t>
+              <w:t>13</w:t>
             </w:r>
           </w:p>
         </w:tc>
@@ -11678,7 +11725,7 @@
                 <w:color w:val="595959"/>
                 <w:sz w:val="17"/>
               </w:rPr>
-              <w:t>9</w:t>
+              <w:t>10</w:t>
             </w:r>
           </w:p>
         </w:tc>
@@ -11856,7 +11903,7 @@
                 <w:color w:val="595959"/>
                 <w:sz w:val="17"/>
               </w:rPr>
-              <w:t>6</w:t>
+              <w:t>7</w:t>
             </w:r>
           </w:p>
         </w:tc>
@@ -12034,7 +12081,7 @@
                 <w:color w:val="595959"/>
                 <w:sz w:val="17"/>
               </w:rPr>
-              <w:t>7</w:t>
+              <w:t>8</w:t>
             </w:r>
           </w:p>
         </w:tc>
@@ -12123,7 +12170,7 @@
                 <w:color w:val="595959"/>
                 <w:sz w:val="17"/>
               </w:rPr>
-              <w:t>6</w:t>
+              <w:t>7</w:t>
             </w:r>
           </w:p>
         </w:tc>
@@ -12212,7 +12259,7 @@
                 <w:color w:val="595959"/>
                 <w:sz w:val="17"/>
               </w:rPr>
-              <w:t>10</w:t>
+              <w:t>11</w:t>
             </w:r>
           </w:p>
         </w:tc>
@@ -12458,7 +12505,7 @@
                 <w:color w:val="595959"/>
                 <w:sz w:val="17"/>
               </w:rPr>
-              <w:t>✓ built in 936ms</w:t>
+              <w:t>✓ built in 875ms</w:t>
             </w:r>
           </w:p>
         </w:tc>

</xml_diff>

<commit_message>
Accuracy checklist rebuilt: the four-condition audit
Co-Authored-By: Claude Opus 5.5 <noreply@anthropic.com>
</commit_message>
<xml_diff>
--- a/docs/VRDS_Accuracy_Checklist.docx
+++ b/docs/VRDS_Accuracy_Checklist.docx
@@ -41,7 +41,7 @@
           <w:color w:val="595959"/>
           <w:sz w:val="20"/>
         </w:rPr>
-        <w:t>For Waseem and Claude  ·  02 October 2026  ·  code at commit 1cd7a7f on Prolific-branch-Edit_10_1</w:t>
+        <w:t>For Waseem and Claude  ·  02 October 2026  ·  code at commit 56d40d8 on Prolific-branch-Edit_10_1</w:t>
       </w:r>
     </w:p>
     <w:p>
@@ -60,7 +60,7 @@
         <w:rPr>
           <w:color w:val="595959"/>
         </w:rPr>
-        <w:t xml:space="preserve">  (run 02 October 2026 at 09:25, when this file was made).</w:t>
+        <w:t xml:space="preserve">  (run 02 October 2026 at 10:00, when this file was made).</w:t>
       </w:r>
     </w:p>
     <w:p>
@@ -211,7 +211,7 @@
                 <w:color w:val="262626"/>
                 <w:sz w:val="19"/>
               </w:rPr>
-              <w:t>2026-10-02-stability-two-parts</w:t>
+              <w:t>2026-10-02-condition-audit</w:t>
             </w:r>
           </w:p>
         </w:tc>
@@ -3418,7 +3418,7 @@
                 <w:color w:val="262626"/>
                 <w:sz w:val="19"/>
               </w:rPr>
-              <w:t>APA_Only: a misaligned choice opens the APA page at once.</w:t>
+              <w:t>The four-condition audit (2 October 2026): every condition records what the participant saw.</w:t>
             </w:r>
           </w:p>
         </w:tc>
@@ -3439,7 +3439,97 @@
                 <w:color w:val="262626"/>
                 <w:sz w:val="19"/>
               </w:rPr>
-              <w:t>No reflection page and no person speaking; the APA page shows only its value question (no two-situations table, no view question), opens with your sentence, says which value the chosen option serves most, and goes back to all the options without a warning. The stakeholder, directness and context scores never move (the APA rule's automatic stakeholder move is off there); each APA visit still counts for Stability; the results page says "Clarification shown"; the record says no reflection was shown; the feedback asks the APA questions, never the CVR ones. Checked live.</w:t>
+              <w:t>A reflection shown and then left for a good fit is recorded as shown (badge, database, timing); a second view opened before going back is kept (the two-views questions, the results page); APA_Only's note and badge are true; Baseline's confirmation page is counted like every other condition's page; the feedback summary carries each condition's page. Checked live in CVR_Only, Baseline and a full APA_Only run.</w:t>
+            </w:r>
+          </w:p>
+        </w:tc>
+        <w:tc>
+          <w:tcPr>
+            <w:tcW w:type="dxa" w:w="1800"/>
+            <w:vAlign w:val="center"/>
+          </w:tcPr>
+          <w:p>
+            <w:pPr>
+              <w:spacing w:after="20" w:before="20"/>
+            </w:pPr>
+            <w:r/>
+            <w:r>
+              <w:rPr>
+                <w:b w:val="0"/>
+                <w:i w:val="0"/>
+                <w:color w:val="595959"/>
+                <w:sz w:val="17"/>
+              </w:rPr>
+              <w:t>validate:conditions (N15, N18, N20)</w:t>
+            </w:r>
+          </w:p>
+        </w:tc>
+      </w:tr>
+      <w:tr>
+        <w:trPr>
+          <w:cantSplit w:val="true"/>
+        </w:trPr>
+        <w:tc>
+          <w:tcPr>
+            <w:tcW w:type="dxa" w:w="504"/>
+            <w:vAlign w:val="center"/>
+            <w:shd w:val="clear" w:color="auto" w:fill="E8F5EC"/>
+          </w:tcPr>
+          <w:p>
+            <w:pPr>
+              <w:spacing w:after="20" w:before="20"/>
+            </w:pPr>
+            <w:r/>
+            <w:r>
+              <w:rPr>
+                <w:b/>
+                <w:i w:val="0"/>
+                <w:color w:val="1B7A3E"/>
+                <w:sz w:val="22"/>
+              </w:rPr>
+              <w:t>✔</w:t>
+            </w:r>
+          </w:p>
+        </w:tc>
+        <w:tc>
+          <w:tcPr>
+            <w:tcW w:type="dxa" w:w="2808"/>
+            <w:vAlign w:val="center"/>
+          </w:tcPr>
+          <w:p>
+            <w:pPr>
+              <w:spacing w:after="20" w:before="20"/>
+            </w:pPr>
+            <w:r/>
+            <w:r>
+              <w:rPr>
+                <w:b/>
+                <w:i w:val="0"/>
+                <w:color w:val="262626"/>
+                <w:sz w:val="19"/>
+              </w:rPr>
+              <w:t>APA_Only: a misaligned choice opens the APA page at once.</w:t>
+            </w:r>
+          </w:p>
+        </w:tc>
+        <w:tc>
+          <w:tcPr>
+            <w:tcW w:type="dxa" w:w="4968"/>
+            <w:vAlign w:val="center"/>
+          </w:tcPr>
+          <w:p>
+            <w:pPr>
+              <w:spacing w:after="20" w:before="20"/>
+            </w:pPr>
+            <w:r/>
+            <w:r>
+              <w:rPr>
+                <w:b w:val="0"/>
+                <w:i w:val="0"/>
+                <w:color w:val="262626"/>
+                <w:sz w:val="19"/>
+              </w:rPr>
+              <w:t>No reflection page and no person speaking; the APA page shows only its value question (no two-situations table, no view question), opens with your sentence, says which value the chosen option serves most, and goes back to all the options without a warning. The stakeholder, directness and context scores never move (the APA rule's automatic stakeholder move is off there); each choice confirmed on the APA page still counts for Stability; the results page says "Clarification shown"; the record says no reflection was shown; the feedback asks the APA questions, never the CVR ones. Checked live.</w:t>
             </w:r>
           </w:p>
         </w:tc>
@@ -10390,7 +10480,7 @@
                 <w:color w:val="595959"/>
                 <w:sz w:val="17"/>
               </w:rPr>
-              <w:t>13</w:t>
+              <w:t>12</w:t>
             </w:r>
           </w:p>
         </w:tc>
@@ -11369,7 +11459,7 @@
                 <w:color w:val="595959"/>
                 <w:sz w:val="17"/>
               </w:rPr>
-              <w:t>10</w:t>
+              <w:t>9</w:t>
             </w:r>
           </w:p>
         </w:tc>
@@ -11437,7 +11527,7 @@
                 <w:color w:val="595959"/>
                 <w:sz w:val="17"/>
               </w:rPr>
-              <w:t>[PASS] K1  the committed tables are exactly what the recipe produces (200000 draws, 3.3s)</w:t>
+              <w:t>[PASS] K1  the committed tables are exactly what the recipe produces (200000 draws, 3.4s)</w:t>
             </w:r>
           </w:p>
         </w:tc>
@@ -12505,7 +12595,7 @@
                 <w:color w:val="595959"/>
                 <w:sz w:val="17"/>
               </w:rPr>
-              <w:t>✓ built in 875ms</w:t>
+              <w:t>✓ built in 832ms</w:t>
             </w:r>
           </w:p>
         </w:tc>

</xml_diff>

<commit_message>
Accuracy checklist rebuilt: Baseline without the fit score
Co-Authored-By: Claude Opus 5.5 <noreply@anthropic.com>
</commit_message>
<xml_diff>
--- a/docs/VRDS_Accuracy_Checklist.docx
+++ b/docs/VRDS_Accuracy_Checklist.docx
@@ -41,7 +41,7 @@
           <w:color w:val="595959"/>
           <w:sz w:val="20"/>
         </w:rPr>
-        <w:t>For Waseem and Claude  ·  02 October 2026  ·  code at commit 56d40d8 on Prolific-branch-Edit_10_1</w:t>
+        <w:t>For Waseem and Claude  ·  03 October 2026  ·  code at commit dd28e00 on Prolific-branch-Edit_10_1</w:t>
       </w:r>
     </w:p>
     <w:p>
@@ -60,7 +60,7 @@
         <w:rPr>
           <w:color w:val="595959"/>
         </w:rPr>
-        <w:t xml:space="preserve">  (run 02 October 2026 at 10:00, when this file was made).</w:t>
+        <w:t xml:space="preserve">  (run 03 October 2026 at 10:13, when this file was made).</w:t>
       </w:r>
     </w:p>
     <w:p>
@@ -211,7 +211,7 @@
                 <w:color w:val="262626"/>
                 <w:sz w:val="19"/>
               </w:rPr>
-              <w:t>2026-10-02-condition-audit</w:t>
+              <w:t>2026-10-03-baseline-no-fit</w:t>
             </w:r>
           </w:p>
         </w:tc>
@@ -3349,7 +3349,7 @@
                 <w:color w:val="262626"/>
                 <w:sz w:val="19"/>
               </w:rPr>
-              <w:t>No reflection, no person, no APA page. The page says "Before you confirm, take a moment with what this option gives up." (a good fit keeps "fits your earlier priorities") and asks "How sure are you about this choice?". Keeping it: +30 to the value the option serves most, -10 (misaligned) or -15 (strongly misaligned) to the others, all x 0.6-1.0 by how sure; a Stability step; the three reflection scores never move; no CVR or APA feedback questions. Checked live.</w:t>
+              <w:t>No reflection, no person, no APA page. The page says "Before you confirm, take a moment with what this option gives up." and asks "How sure are you about this choice?" (since 3 October 2026 a good fit gets the same page). Keeping it: +30 to the value the option serves most, -10 (misaligned) or -15 (strongly misaligned) to the others, all x 0.6-1.0 by how sure; a Stability step; the three reflection scores never move; no CVR or APA feedback questions. Checked live.</w:t>
             </w:r>
           </w:p>
         </w:tc>
@@ -3371,6 +3371,96 @@
                 <w:sz w:val="17"/>
               </w:rPr>
               <w:t>validate:conditions (N17, N18, N19)</w:t>
+            </w:r>
+          </w:p>
+        </w:tc>
+      </w:tr>
+      <w:tr>
+        <w:trPr>
+          <w:cantSplit w:val="true"/>
+        </w:trPr>
+        <w:tc>
+          <w:tcPr>
+            <w:tcW w:type="dxa" w:w="504"/>
+            <w:vAlign w:val="center"/>
+            <w:shd w:val="clear" w:color="auto" w:fill="E8F5EC"/>
+          </w:tcPr>
+          <w:p>
+            <w:pPr>
+              <w:spacing w:after="20" w:before="20"/>
+            </w:pPr>
+            <w:r/>
+            <w:r>
+              <w:rPr>
+                <w:b/>
+                <w:i w:val="0"/>
+                <w:color w:val="1B7A3E"/>
+                <w:sz w:val="22"/>
+              </w:rPr>
+              <w:t>✔</w:t>
+            </w:r>
+          </w:p>
+        </w:tc>
+        <w:tc>
+          <w:tcPr>
+            <w:tcW w:type="dxa" w:w="2808"/>
+            <w:vAlign w:val="center"/>
+          </w:tcPr>
+          <w:p>
+            <w:pPr>
+              <w:spacing w:after="20" w:before="20"/>
+            </w:pPr>
+            <w:r/>
+            <w:r>
+              <w:rPr>
+                <w:b/>
+                <w:i w:val="0"/>
+                <w:color w:val="262626"/>
+                <w:sz w:val="19"/>
+              </w:rPr>
+              <w:t>Baseline: no fit score and no ranking reasons on the cards, and one confirmation page for every choice.</w:t>
+            </w:r>
+          </w:p>
+        </w:tc>
+        <w:tc>
+          <w:tcPr>
+            <w:tcW w:type="dxa" w:w="4968"/>
+            <w:vAlign w:val="center"/>
+          </w:tcPr>
+          <w:p>
+            <w:pPr>
+              <w:spacing w:after="20" w:before="20"/>
+            </w:pPr>
+            <w:r/>
+            <w:r>
+              <w:rPr>
+                <w:b w:val="0"/>
+                <w:i w:val="0"/>
+                <w:color w:val="262626"/>
+                <w:sz w:val="19"/>
+              </w:rPr>
+              <w:t>Since 3 October 2026 (your advisor's request; Q1-A, Q2-A, Q3-yes). Baseline's open cards show only "How it performs": no "Matches your earlier answers", no "Ranked N - why". The note under the bars, the page before the main study and the wish page say the approved words. Every choice in scenarios 1-4 opens the same page with "How sure"; a good fit's answer is saved and moves nothing. Every row says whether the fit could be shown. Checked live in Baseline and in condition 1 (unchanged).</w:t>
+            </w:r>
+          </w:p>
+        </w:tc>
+        <w:tc>
+          <w:tcPr>
+            <w:tcW w:type="dxa" w:w="1800"/>
+            <w:vAlign w:val="center"/>
+          </w:tcPr>
+          <w:p>
+            <w:pPr>
+              <w:spacing w:after="20" w:before="20"/>
+            </w:pPr>
+            <w:r/>
+            <w:r>
+              <w:rPr>
+                <w:b w:val="0"/>
+                <w:i w:val="0"/>
+                <w:color w:val="595959"/>
+                <w:sz w:val="17"/>
+              </w:rPr>
+              <w:t>validate:conditions (N17, N18, N21)</w:t>
             </w:r>
           </w:p>
         </w:tc>
@@ -9038,7 +9128,7 @@
                 <w:color w:val="262626"/>
                 <w:sz w:val="19"/>
               </w:rPr>
-              <w:t>The open option cards still print the fit number, one card sentence can reveal the #1 value, scenario 5's wish page compares the wish with "what you said matters most", and the intro page says "Each option will show you how closely it matches them". CLAUDE.md's "no verdict or arithmetic is shown" becomes true only after it. (Audit A1, A2, A6, A8.)</w:t>
+              <w:t>Done for Baseline on 3 October 2026; conditions 1-3 still wait. The open option cards still print the fit number, one card sentence can reveal the #1 value, scenario 5's wish page compares the wish with "what you said matters most", and the intro page says "Each option will show you how closely it matches them". CLAUDE.md's "no verdict or arithmetic is shown" becomes true only after it. (Audit A1, A2, A6, A8.)</w:t>
             </w:r>
           </w:p>
         </w:tc>
@@ -9932,6 +10022,53 @@
                 <w:sz w:val="19"/>
               </w:rPr>
               <w:t>The same behaviour can score up to about 13 points apart between conditions (22 under the order rule alone; docs/MAJOR_SCORES_BY_CONDITION.md, HOW_TO_ANALYZE 4.12); VCI moves about 1 point. Compare Stability inside a condition, or against that page's gaps.</w:t>
+            </w:r>
+          </w:p>
+        </w:tc>
+      </w:tr>
+      <w:tr>
+        <w:trPr>
+          <w:cantSplit w:val="true"/>
+        </w:trPr>
+        <w:tc>
+          <w:tcPr>
+            <w:tcW w:type="dxa" w:w="4608"/>
+            <w:vAlign w:val="center"/>
+          </w:tcPr>
+          <w:p>
+            <w:pPr>
+              <w:spacing w:after="20" w:before="20"/>
+            </w:pPr>
+            <w:r/>
+            <w:r>
+              <w:rPr>
+                <w:b/>
+                <w:i w:val="0"/>
+                <w:color w:val="262626"/>
+                <w:sz w:val="19"/>
+              </w:rPr>
+              <w:t>Baseline differs for everybody since 3 October 2026.</w:t>
+            </w:r>
+          </w:p>
+        </w:tc>
+        <w:tc>
+          <w:tcPr>
+            <w:tcW w:type="dxa" w:w="5472"/>
+            <w:vAlign w:val="center"/>
+          </w:tcPr>
+          <w:p>
+            <w:pPr>
+              <w:spacing w:after="20" w:before="20"/>
+            </w:pPr>
+            <w:r/>
+            <w:r>
+              <w:rPr>
+                <w:b w:val="0"/>
+                <w:i w:val="0"/>
+                <w:color w:val="262626"/>
+                <w:sz w:val="19"/>
+              </w:rPr>
+              <w:t>Its cards show no fit line and no ranking reasons, so a Baseline difference mixes the missing reflection and APA pages with the missing card information (HOW_TO_ANALYZE 9.1, 9.6). Comparisons among conditions 1-3 are not affected.</w:t>
             </w:r>
           </w:p>
         </w:tc>
@@ -10480,7 +10617,7 @@
                 <w:color w:val="595959"/>
                 <w:sz w:val="17"/>
               </w:rPr>
-              <w:t>12</w:t>
+              <w:t>14</w:t>
             </w:r>
           </w:p>
         </w:tc>
@@ -10569,7 +10706,7 @@
                 <w:color w:val="595959"/>
                 <w:sz w:val="17"/>
               </w:rPr>
-              <w:t>15</w:t>
+              <w:t>16</w:t>
             </w:r>
           </w:p>
         </w:tc>
@@ -11527,7 +11664,7 @@
                 <w:color w:val="595959"/>
                 <w:sz w:val="17"/>
               </w:rPr>
-              <w:t>[PASS] K1  the committed tables are exactly what the recipe produces (200000 draws, 3.4s)</w:t>
+              <w:t>[PASS] K1  the committed tables are exactly what the recipe produces (200000 draws, 3.3s)</w:t>
             </w:r>
           </w:p>
         </w:tc>
@@ -11993,7 +12130,7 @@
                 <w:color w:val="595959"/>
                 <w:sz w:val="17"/>
               </w:rPr>
-              <w:t>7</w:t>
+              <w:t>8</w:t>
             </w:r>
           </w:p>
         </w:tc>
@@ -12595,7 +12732,7 @@
                 <w:color w:val="595959"/>
                 <w:sz w:val="17"/>
               </w:rPr>
-              <w:t>✓ built in 832ms</w:t>
+              <w:t>✓ built in 926ms</w:t>
             </w:r>
           </w:p>
         </w:tc>

</xml_diff>

<commit_message>
Accuracy checklist rebuilt: the first page and the panel title
Co-Authored-By: Claude Opus 5.5 <noreply@anthropic.com>
</commit_message>
<xml_diff>
--- a/docs/VRDS_Accuracy_Checklist.docx
+++ b/docs/VRDS_Accuracy_Checklist.docx
@@ -41,7 +41,7 @@
           <w:color w:val="595959"/>
           <w:sz w:val="20"/>
         </w:rPr>
-        <w:t>For Waseem and Claude  ·  03 October 2026  ·  code at commit dd28e00 on Prolific-branch-Edit_10_1</w:t>
+        <w:t>For Waseem and Claude  ·  03 October 2026  ·  code at commit c3abe2a on Prolific-branch-Edit_10_1</w:t>
       </w:r>
     </w:p>
     <w:p>
@@ -60,7 +60,7 @@
         <w:rPr>
           <w:color w:val="595959"/>
         </w:rPr>
-        <w:t xml:space="preserve">  (run 03 October 2026 at 10:13, when this file was made).</w:t>
+        <w:t xml:space="preserve">  (run 03 October 2026 at 13:20, when this file was made).</w:t>
       </w:r>
     </w:p>
     <w:p>
@@ -6680,6 +6680,96 @@
                 <w:sz w:val="19"/>
               </w:rPr>
               <w:t>Checked by</w:t>
+            </w:r>
+          </w:p>
+        </w:tc>
+      </w:tr>
+      <w:tr>
+        <w:trPr>
+          <w:cantSplit w:val="true"/>
+        </w:trPr>
+        <w:tc>
+          <w:tcPr>
+            <w:tcW w:type="dxa" w:w="504"/>
+            <w:vAlign w:val="center"/>
+            <w:shd w:val="clear" w:color="auto" w:fill="E8F5EC"/>
+          </w:tcPr>
+          <w:p>
+            <w:pPr>
+              <w:spacing w:after="20" w:before="20"/>
+            </w:pPr>
+            <w:r/>
+            <w:r>
+              <w:rPr>
+                <w:b/>
+                <w:i w:val="0"/>
+                <w:color w:val="1B7A3E"/>
+                <w:sz w:val="22"/>
+              </w:rPr>
+              <w:t>✔</w:t>
+            </w:r>
+          </w:p>
+        </w:tc>
+        <w:tc>
+          <w:tcPr>
+            <w:tcW w:type="dxa" w:w="2808"/>
+            <w:vAlign w:val="center"/>
+          </w:tcPr>
+          <w:p>
+            <w:pPr>
+              <w:spacing w:after="20" w:before="20"/>
+            </w:pPr>
+            <w:r/>
+            <w:r>
+              <w:rPr>
+                <w:b/>
+                <w:i w:val="0"/>
+                <w:color w:val="262626"/>
+                <w:sz w:val="19"/>
+              </w:rPr>
+              <w:t>The first page welcomes the participant and names the study; the performance panel fits a phone.</w:t>
+            </w:r>
+          </w:p>
+        </w:tc>
+        <w:tc>
+          <w:tcPr>
+            <w:tcW w:type="dxa" w:w="4968"/>
+            <w:vAlign w:val="center"/>
+          </w:tcPr>
+          <w:p>
+            <w:pPr>
+              <w:spacing w:after="20" w:before="20"/>
+            </w:pPr>
+            <w:r/>
+            <w:r>
+              <w:rPr>
+                <w:b w:val="0"/>
+                <w:i w:val="0"/>
+                <w:color w:val="262626"/>
+                <w:sz w:val="19"/>
+              </w:rPr>
+              <w:t>Since 3 October 2026, in every condition: "Human-AI Moral Value Decision-making Study" as the heading (never split at a hyphen), a three-sentence welcome while the email is asked for, "Start or continue" in the card, the email step unchanged. On a phone the performance panel's buttons sit on their own line instead of covering its title. Checked live on a computer and a phone, light and dark.</w:t>
+            </w:r>
+          </w:p>
+        </w:tc>
+        <w:tc>
+          <w:tcPr>
+            <w:tcW w:type="dxa" w:w="1800"/>
+            <w:vAlign w:val="center"/>
+          </w:tcPr>
+          <w:p>
+            <w:pPr>
+              <w:spacing w:after="20" w:before="20"/>
+            </w:pPr>
+            <w:r/>
+            <w:r>
+              <w:rPr>
+                <w:b w:val="0"/>
+                <w:i w:val="0"/>
+                <w:color w:val="595959"/>
+                <w:sz w:val="17"/>
+              </w:rPr>
+              <w:t>validate:journey (J14)</w:t>
             </w:r>
           </w:p>
         </w:tc>
@@ -10617,7 +10707,7 @@
                 <w:color w:val="595959"/>
                 <w:sz w:val="17"/>
               </w:rPr>
-              <w:t>14</w:t>
+              <w:t>12</w:t>
             </w:r>
           </w:p>
         </w:tc>
@@ -10706,7 +10796,7 @@
                 <w:color w:val="595959"/>
                 <w:sz w:val="17"/>
               </w:rPr>
-              <w:t>16</w:t>
+              <w:t>15</w:t>
             </w:r>
           </w:p>
         </w:tc>
@@ -11664,7 +11754,7 @@
                 <w:color w:val="595959"/>
                 <w:sz w:val="17"/>
               </w:rPr>
-              <w:t>[PASS] K1  the committed tables are exactly what the recipe produces (200000 draws, 3.3s)</w:t>
+              <w:t>[PASS] K1  the committed tables are exactly what the recipe produces (200000 draws, 3.4s)</w:t>
             </w:r>
           </w:p>
         </w:tc>
@@ -12130,7 +12220,7 @@
                 <w:color w:val="595959"/>
                 <w:sz w:val="17"/>
               </w:rPr>
-              <w:t>8</w:t>
+              <w:t>7</w:t>
             </w:r>
           </w:p>
         </w:tc>
@@ -12732,7 +12822,7 @@
                 <w:color w:val="595959"/>
                 <w:sz w:val="17"/>
               </w:rPr>
-              <w:t>✓ built in 926ms</w:t>
+              <w:t>✓ built in 876ms</w:t>
             </w:r>
           </w:p>
         </w:tc>

</xml_diff>

<commit_message>
Accuracy checklist rebuilt: the English question
Co-Authored-By: Claude Opus 5.5 <noreply@anthropic.com>
</commit_message>
<xml_diff>
--- a/docs/VRDS_Accuracy_Checklist.docx
+++ b/docs/VRDS_Accuracy_Checklist.docx
@@ -41,7 +41,7 @@
           <w:color w:val="595959"/>
           <w:sz w:val="20"/>
         </w:rPr>
-        <w:t>For Waseem and Claude  ·  03 October 2026  ·  code at commit c3abe2a on Prolific-branch-Edit_10_1</w:t>
+        <w:t>For Waseem and Claude  ·  04 October 2026  ·  code at commit 6515de2 on Prolific-branch-Edit_10_1</w:t>
       </w:r>
     </w:p>
     <w:p>
@@ -60,7 +60,7 @@
         <w:rPr>
           <w:color w:val="595959"/>
         </w:rPr>
-        <w:t xml:space="preserve">  (run 03 October 2026 at 13:20, when this file was made).</w:t>
+        <w:t xml:space="preserve">  (run 04 October 2026 at 13:21, when this file was made).</w:t>
       </w:r>
     </w:p>
     <w:p>
@@ -8250,6 +8250,96 @@
                 <w:sz w:val="17"/>
               </w:rPr>
               <w:t>validate:attention (T6, T7)</w:t>
+            </w:r>
+          </w:p>
+        </w:tc>
+      </w:tr>
+      <w:tr>
+        <w:trPr>
+          <w:cantSplit w:val="true"/>
+        </w:trPr>
+        <w:tc>
+          <w:tcPr>
+            <w:tcW w:type="dxa" w:w="504"/>
+            <w:vAlign w:val="center"/>
+            <w:shd w:val="clear" w:color="auto" w:fill="E8F5EC"/>
+          </w:tcPr>
+          <w:p>
+            <w:pPr>
+              <w:spacing w:after="20" w:before="20"/>
+            </w:pPr>
+            <w:r/>
+            <w:r>
+              <w:rPr>
+                <w:b/>
+                <w:i w:val="0"/>
+                <w:color w:val="1B7A3E"/>
+                <w:sz w:val="22"/>
+              </w:rPr>
+              <w:t>✔</w:t>
+            </w:r>
+          </w:p>
+        </w:tc>
+        <w:tc>
+          <w:tcPr>
+            <w:tcW w:type="dxa" w:w="2808"/>
+            <w:vAlign w:val="center"/>
+          </w:tcPr>
+          <w:p>
+            <w:pPr>
+              <w:spacing w:after="20" w:before="20"/>
+            </w:pPr>
+            <w:r/>
+            <w:r>
+              <w:rPr>
+                <w:b/>
+                <w:i w:val="0"/>
+                <w:color w:val="262626"/>
+                <w:sz w:val="19"/>
+              </w:rPr>
+              <w:t>The demographic page asks whether English is the first language, and asks "Where are you from?".</w:t>
+            </w:r>
+          </w:p>
+        </w:tc>
+        <w:tc>
+          <w:tcPr>
+            <w:tcW w:type="dxa" w:w="4968"/>
+            <w:vAlign w:val="center"/>
+          </w:tcPr>
+          <w:p>
+            <w:pPr>
+              <w:spacing w:after="20" w:before="20"/>
+            </w:pPr>
+            <w:r/>
+            <w:r>
+              <w:rPr>
+                <w:b w:val="0"/>
+                <w:i w:val="0"/>
+                <w:color w:val="262626"/>
+                <w:sz w:val="19"/>
+              </w:rPr>
+              <w:t>Since 4 October 2026, in every condition: Yes / No, required with no default, saved as english_first_language (true / false) beside age, gender and country, and never erased by a resume that does not know it. Tested live on a second copy of the new server: saved, kept through a resume, fits a phone.</w:t>
+            </w:r>
+          </w:p>
+        </w:tc>
+        <w:tc>
+          <w:tcPr>
+            <w:tcW w:type="dxa" w:w="1800"/>
+            <w:vAlign w:val="center"/>
+          </w:tcPr>
+          <w:p>
+            <w:pPr>
+              <w:spacing w:after="20" w:before="20"/>
+            </w:pPr>
+            <w:r/>
+            <w:r>
+              <w:rPr>
+                <w:b w:val="0"/>
+                <w:i w:val="0"/>
+                <w:color w:val="595959"/>
+                <w:sz w:val="17"/>
+              </w:rPr>
+              <w:t>validate:session (C11)</w:t>
             </w:r>
           </w:p>
         </w:tc>
@@ -10707,7 +10797,7 @@
                 <w:color w:val="595959"/>
                 <w:sz w:val="17"/>
               </w:rPr>
-              <w:t>12</w:t>
+              <w:t>13</w:t>
             </w:r>
           </w:p>
         </w:tc>
@@ -10796,7 +10886,7 @@
                 <w:color w:val="595959"/>
                 <w:sz w:val="17"/>
               </w:rPr>
-              <w:t>15</w:t>
+              <w:t>17</w:t>
             </w:r>
           </w:p>
         </w:tc>
@@ -11686,7 +11776,7 @@
                 <w:color w:val="595959"/>
                 <w:sz w:val="17"/>
               </w:rPr>
-              <w:t>9</w:t>
+              <w:t>10</w:t>
             </w:r>
           </w:p>
         </w:tc>
@@ -11754,7 +11844,7 @@
                 <w:color w:val="595959"/>
                 <w:sz w:val="17"/>
               </w:rPr>
-              <w:t>[PASS] K1  the committed tables are exactly what the recipe produces (200000 draws, 3.4s)</w:t>
+              <w:t>[PASS] K1  the committed tables are exactly what the recipe produces (200000 draws, 3.5s)</w:t>
             </w:r>
           </w:p>
         </w:tc>
@@ -11864,7 +11954,7 @@
                 <w:color w:val="595959"/>
                 <w:sz w:val="17"/>
               </w:rPr>
-              <w:t>8</w:t>
+              <w:t>9</w:t>
             </w:r>
           </w:p>
         </w:tc>
@@ -11953,7 +12043,7 @@
                 <w:color w:val="595959"/>
                 <w:sz w:val="17"/>
               </w:rPr>
-              <w:t>13</w:t>
+              <w:t>14</w:t>
             </w:r>
           </w:p>
         </w:tc>
@@ -12042,7 +12132,7 @@
                 <w:color w:val="595959"/>
                 <w:sz w:val="17"/>
               </w:rPr>
-              <w:t>10</w:t>
+              <w:t>11</w:t>
             </w:r>
           </w:p>
         </w:tc>
@@ -12220,7 +12310,7 @@
                 <w:color w:val="595959"/>
                 <w:sz w:val="17"/>
               </w:rPr>
-              <w:t>7</w:t>
+              <w:t>8</w:t>
             </w:r>
           </w:p>
         </w:tc>
@@ -12398,7 +12488,7 @@
                 <w:color w:val="595959"/>
                 <w:sz w:val="17"/>
               </w:rPr>
-              <w:t>8</w:t>
+              <w:t>9</w:t>
             </w:r>
           </w:p>
         </w:tc>
@@ -12487,7 +12577,7 @@
                 <w:color w:val="595959"/>
                 <w:sz w:val="17"/>
               </w:rPr>
-              <w:t>7</w:t>
+              <w:t>8</w:t>
             </w:r>
           </w:p>
         </w:tc>
@@ -12822,7 +12912,7 @@
                 <w:color w:val="595959"/>
                 <w:sz w:val="17"/>
               </w:rPr>
-              <w:t>✓ built in 876ms</w:t>
+              <w:t>✓ built in 822ms</w:t>
             </w:r>
           </w:p>
         </w:tc>

</xml_diff>

<commit_message>
Accuracy checklist rebuilt: the results page explains itself
Co-Authored-By: Claude Opus 5.5 <noreply@anthropic.com>
</commit_message>
<xml_diff>
--- a/docs/VRDS_Accuracy_Checklist.docx
+++ b/docs/VRDS_Accuracy_Checklist.docx
@@ -41,7 +41,7 @@
           <w:color w:val="595959"/>
           <w:sz w:val="20"/>
         </w:rPr>
-        <w:t>For Waseem and Claude  ·  04 October 2026  ·  code at commit 6515de2 on Prolific-branch-Edit_10_1</w:t>
+        <w:t>For Waseem and Claude  ·  04 October 2026  ·  code at commit 1574974 on Prolific-branch-Edit_10_1</w:t>
       </w:r>
     </w:p>
     <w:p>
@@ -60,7 +60,7 @@
         <w:rPr>
           <w:color w:val="595959"/>
         </w:rPr>
-        <w:t xml:space="preserve">  (run 04 October 2026 at 13:21, when this file was made).</w:t>
+        <w:t xml:space="preserve">  (run 04 October 2026 at 14:54, when this file was made).</w:t>
       </w:r>
     </w:p>
     <w:p>
@@ -7040,6 +7040,96 @@
                 <w:sz w:val="17"/>
               </w:rPr>
               <w:t>validate:journey (J9)</w:t>
+            </w:r>
+          </w:p>
+        </w:tc>
+      </w:tr>
+      <w:tr>
+        <w:trPr>
+          <w:cantSplit w:val="true"/>
+        </w:trPr>
+        <w:tc>
+          <w:tcPr>
+            <w:tcW w:type="dxa" w:w="504"/>
+            <w:vAlign w:val="center"/>
+            <w:shd w:val="clear" w:color="auto" w:fill="E8F5EC"/>
+          </w:tcPr>
+          <w:p>
+            <w:pPr>
+              <w:spacing w:after="20" w:before="20"/>
+            </w:pPr>
+            <w:r/>
+            <w:r>
+              <w:rPr>
+                <w:b/>
+                <w:i w:val="0"/>
+                <w:color w:val="1B7A3E"/>
+                <w:sz w:val="22"/>
+              </w:rPr>
+              <w:t>✔</w:t>
+            </w:r>
+          </w:p>
+        </w:tc>
+        <w:tc>
+          <w:tcPr>
+            <w:tcW w:type="dxa" w:w="2808"/>
+            <w:vAlign w:val="center"/>
+          </w:tcPr>
+          <w:p>
+            <w:pPr>
+              <w:spacing w:after="20" w:before="20"/>
+            </w:pPr>
+            <w:r/>
+            <w:r>
+              <w:rPr>
+                <w:b/>
+                <w:i w:val="0"/>
+                <w:color w:val="262626"/>
+                <w:sz w:val="19"/>
+              </w:rPr>
+              <w:t>The results page explains itself.</w:t>
+            </w:r>
+          </w:p>
+        </w:tc>
+        <w:tc>
+          <w:tcPr>
+            <w:tcW w:type="dxa" w:w="4968"/>
+            <w:vAlign w:val="center"/>
+          </w:tcPr>
+          <w:p>
+            <w:pPr>
+              <w:spacing w:after="20" w:before="20"/>
+            </w:pPr>
+            <w:r/>
+            <w:r>
+              <w:rPr>
+                <w:b w:val="0"/>
+                <w:i w:val="0"/>
+                <w:color w:val="262626"/>
+                <w:sz w:val="19"/>
+              </w:rPr>
+              <w:t>Since 4 October 2026: the first box teaches alignment (choice by choice) and stability (before and after); a box above the scores explains Your 4 decisions and All 6 scenarios; each level is a traffic-light badge on a bar split into the score's own levels, with its range ("This level: 50–64 · next at 65"), so a 57 reads Low with its reason; no random mark; every badge readable; the VCI named the Value Consistency Index. Every whole score 0-100 lands in the band its own level word names.</w:t>
+            </w:r>
+          </w:p>
+        </w:tc>
+        <w:tc>
+          <w:tcPr>
+            <w:tcW w:type="dxa" w:w="1800"/>
+            <w:vAlign w:val="center"/>
+          </w:tcPr>
+          <w:p>
+            <w:pPr>
+              <w:spacing w:after="20" w:before="20"/>
+            </w:pPr>
+            <w:r/>
+            <w:r>
+              <w:rPr>
+                <w:b w:val="0"/>
+                <w:i w:val="0"/>
+                <w:color w:val="595959"/>
+                <w:sz w:val="17"/>
+              </w:rPr>
+              <w:t>validate:journey (J15)</w:t>
             </w:r>
           </w:p>
         </w:tc>
@@ -11776,7 +11866,7 @@
                 <w:color w:val="595959"/>
                 <w:sz w:val="17"/>
               </w:rPr>
-              <w:t>10</w:t>
+              <w:t>9</w:t>
             </w:r>
           </w:p>
         </w:tc>
@@ -11844,7 +11934,7 @@
                 <w:color w:val="595959"/>
                 <w:sz w:val="17"/>
               </w:rPr>
-              <w:t>[PASS] K1  the committed tables are exactly what the recipe produces (200000 draws, 3.5s)</w:t>
+              <w:t>[PASS] K1  the committed tables are exactly what the recipe produces (200000 draws, 3.3s)</w:t>
             </w:r>
           </w:p>
         </w:tc>
@@ -12043,7 +12133,7 @@
                 <w:color w:val="595959"/>
                 <w:sz w:val="17"/>
               </w:rPr>
-              <w:t>14</w:t>
+              <w:t>12</w:t>
             </w:r>
           </w:p>
         </w:tc>
@@ -12132,7 +12222,7 @@
                 <w:color w:val="595959"/>
                 <w:sz w:val="17"/>
               </w:rPr>
-              <w:t>11</w:t>
+              <w:t>10</w:t>
             </w:r>
           </w:p>
         </w:tc>
@@ -12310,7 +12400,7 @@
                 <w:color w:val="595959"/>
                 <w:sz w:val="17"/>
               </w:rPr>
-              <w:t>8</w:t>
+              <w:t>7</w:t>
             </w:r>
           </w:p>
         </w:tc>
@@ -12912,7 +13002,7 @@
                 <w:color w:val="595959"/>
                 <w:sz w:val="17"/>
               </w:rPr>
-              <w:t>✓ built in 822ms</w:t>
+              <w:t>✓ built in 895ms</w:t>
             </w:r>
           </w:p>
         </w:tc>

</xml_diff>

<commit_message>
Accuracy checklist rebuilt: the level panels
Co-Authored-By: Claude Opus 5.5 <noreply@anthropic.com>
</commit_message>
<xml_diff>
--- a/docs/VRDS_Accuracy_Checklist.docx
+++ b/docs/VRDS_Accuracy_Checklist.docx
@@ -41,7 +41,7 @@
           <w:color w:val="595959"/>
           <w:sz w:val="20"/>
         </w:rPr>
-        <w:t>For Waseem and Claude  ·  04 October 2026  ·  code at commit 1574974 on Prolific-branch-Edit_10_1</w:t>
+        <w:t>For Waseem and Claude  ·  04 October 2026  ·  code at commit 6a50280 on Prolific-branch-Edit_10_1</w:t>
       </w:r>
     </w:p>
     <w:p>
@@ -60,7 +60,7 @@
         <w:rPr>
           <w:color w:val="595959"/>
         </w:rPr>
-        <w:t xml:space="preserve">  (run 04 October 2026 at 14:54, when this file was made).</w:t>
+        <w:t xml:space="preserve">  (run 04 October 2026 at 16:06, when this file was made).</w:t>
       </w:r>
     </w:p>
     <w:p>
@@ -7108,7 +7108,7 @@
                 <w:color w:val="262626"/>
                 <w:sz w:val="19"/>
               </w:rPr>
-              <w:t>Since 4 October 2026: the first box teaches alignment (choice by choice) and stability (before and after); a box above the scores explains Your 4 decisions and All 6 scenarios; each level is a traffic-light badge on a bar split into the score's own levels, with its range ("This level: 50–64 · next at 65"), so a 57 reads Low with its reason; no random mark; every badge readable; the VCI named the Value Consistency Index. Every whole score 0-100 lands in the band its own level word names.</w:t>
+              <w:t>Since 4 October 2026: the first box teaches alignment (choice by choice) and stability (before and after); a box above the scores explains Your 4 decisions and All 6 scenarios; each level is a traffic-light badge on a bar split into the score's own levels, with its range ("This level: 50–64 · next at 65"), so a 57 reads Low with its reason; no random mark; every badge readable; the VCI named the Value Consistency Index; an ⓘ beside each level opens its own level ladder (tap, click or hover). Every whole score 0-100 lands in the band its own level word names.</w:t>
             </w:r>
           </w:p>
         </w:tc>
@@ -7129,7 +7129,7 @@
                 <w:color w:val="595959"/>
                 <w:sz w:val="17"/>
               </w:rPr>
-              <w:t>validate:journey (J15)</w:t>
+              <w:t>validate:journey (J15, J16)</w:t>
             </w:r>
           </w:p>
         </w:tc>
@@ -10887,7 +10887,7 @@
                 <w:color w:val="595959"/>
                 <w:sz w:val="17"/>
               </w:rPr>
-              <w:t>13</w:t>
+              <w:t>12</w:t>
             </w:r>
           </w:p>
         </w:tc>
@@ -10976,7 +10976,7 @@
                 <w:color w:val="595959"/>
                 <w:sz w:val="17"/>
               </w:rPr>
-              <w:t>17</w:t>
+              <w:t>16</w:t>
             </w:r>
           </w:p>
         </w:tc>
@@ -11934,7 +11934,7 @@
                 <w:color w:val="595959"/>
                 <w:sz w:val="17"/>
               </w:rPr>
-              <w:t>[PASS] K1  the committed tables are exactly what the recipe produces (200000 draws, 3.3s)</w:t>
+              <w:t>[PASS] K1  the committed tables are exactly what the recipe produces (200000 draws, 3.4s)</w:t>
             </w:r>
           </w:p>
         </w:tc>
@@ -12044,7 +12044,7 @@
                 <w:color w:val="595959"/>
                 <w:sz w:val="17"/>
               </w:rPr>
-              <w:t>9</w:t>
+              <w:t>8</w:t>
             </w:r>
           </w:p>
         </w:tc>
@@ -12578,7 +12578,7 @@
                 <w:color w:val="595959"/>
                 <w:sz w:val="17"/>
               </w:rPr>
-              <w:t>9</w:t>
+              <w:t>8</w:t>
             </w:r>
           </w:p>
         </w:tc>
@@ -13002,7 +13002,7 @@
                 <w:color w:val="595959"/>
                 <w:sz w:val="17"/>
               </w:rPr>
-              <w:t>✓ built in 895ms</w:t>
+              <w:t>✓ built in 871ms</w:t>
             </w:r>
           </w:p>
         </w:tc>

</xml_diff>

<commit_message>
Accuracy checklist rebuilt: many people at once (load test, N22-N24, C12)
Co-Authored-By: Claude Opus 5.5 <noreply@anthropic.com>
</commit_message>
<xml_diff>
--- a/docs/VRDS_Accuracy_Checklist.docx
+++ b/docs/VRDS_Accuracy_Checklist.docx
@@ -41,7 +41,7 @@
           <w:color w:val="595959"/>
           <w:sz w:val="20"/>
         </w:rPr>
-        <w:t>For Waseem and Claude  ·  04 October 2026  ·  code at commit 6a50280 on Prolific-branch-Edit_10_1</w:t>
+        <w:t>For Waseem and Claude  ·  06 October 2026  ·  code at commit 29fd2c8 on Prolific-branch-Edit_10_1</w:t>
       </w:r>
     </w:p>
     <w:p>
@@ -54,13 +54,13 @@
           <w:color w:val="1B7A3E"/>
           <w:sz w:val="24"/>
         </w:rPr>
-        <w:t>All 27 checks passed</w:t>
+        <w:t>All 28 checks passed</w:t>
       </w:r>
       <w:r>
         <w:rPr>
           <w:color w:val="595959"/>
         </w:rPr>
-        <w:t xml:space="preserve">  (run 04 October 2026 at 16:06, when this file was made).</w:t>
+        <w:t xml:space="preserve">  (run 06 October 2026 at 12:12, when this file was made).</w:t>
       </w:r>
     </w:p>
     <w:p>
@@ -1758,6 +1758,96 @@
                 <w:color w:val="262626"/>
                 <w:sz w:val="19"/>
               </w:rPr>
+              <w:t>A short break in the server never keeps a participant out of the database.</w:t>
+            </w:r>
+          </w:p>
+        </w:tc>
+        <w:tc>
+          <w:tcPr>
+            <w:tcW w:type="dxa" w:w="4968"/>
+            <w:vAlign w:val="center"/>
+          </w:tcPr>
+          <w:p>
+            <w:pPr>
+              <w:spacing w:after="20" w:before="20"/>
+            </w:pPr>
+            <w:r/>
+            <w:r>
+              <w:rPr>
+                <w:b w:val="0"/>
+                <w:i w:val="0"/>
+                <w:color w:val="262626"/>
+                <w:sz w:val="19"/>
+              </w:rPr>
+              <w:t>Since 6 October 2026 the live page asks for the server again after 1, 2 and 4 seconds and then every 15 seconds; when it answers late, the participant's record is sent first, then their answers. Checked live: somebody who started while the server was down reached the database 13 seconds after it came back, with every answer. The first saves after opening a page no longer wait 15 seconds (an older delay found the same day).</w:t>
+            </w:r>
+          </w:p>
+        </w:tc>
+        <w:tc>
+          <w:tcPr>
+            <w:tcW w:type="dxa" w:w="1800"/>
+            <w:vAlign w:val="center"/>
+          </w:tcPr>
+          <w:p>
+            <w:pPr>
+              <w:spacing w:after="20" w:before="20"/>
+            </w:pPr>
+            <w:r/>
+            <w:r>
+              <w:rPr>
+                <w:b w:val="0"/>
+                <w:i w:val="0"/>
+                <w:color w:val="595959"/>
+                <w:sz w:val="17"/>
+              </w:rPr>
+              <w:t>validate:session (C12)</w:t>
+            </w:r>
+          </w:p>
+        </w:tc>
+      </w:tr>
+      <w:tr>
+        <w:trPr>
+          <w:cantSplit w:val="true"/>
+        </w:trPr>
+        <w:tc>
+          <w:tcPr>
+            <w:tcW w:type="dxa" w:w="504"/>
+            <w:vAlign w:val="center"/>
+            <w:shd w:val="clear" w:color="auto" w:fill="E8F5EC"/>
+          </w:tcPr>
+          <w:p>
+            <w:pPr>
+              <w:spacing w:after="20" w:before="20"/>
+            </w:pPr>
+            <w:r/>
+            <w:r>
+              <w:rPr>
+                <w:b/>
+                <w:i w:val="0"/>
+                <w:color w:val="1B7A3E"/>
+                <w:sz w:val="22"/>
+              </w:rPr>
+              <w:t>✔</w:t>
+            </w:r>
+          </w:p>
+        </w:tc>
+        <w:tc>
+          <w:tcPr>
+            <w:tcW w:type="dxa" w:w="2808"/>
+            <w:vAlign w:val="center"/>
+          </w:tcPr>
+          <w:p>
+            <w:pPr>
+              <w:spacing w:after="20" w:before="20"/>
+            </w:pPr>
+            <w:r/>
+            <w:r>
+              <w:rPr>
+                <w:b/>
+                <w:i w:val="0"/>
+                <w:color w:val="262626"/>
+                <w:sz w:val="19"/>
+              </w:rPr>
               <w:t>A refresh in the pause after a block never restarts that block.</w:t>
             </w:r>
           </w:p>
@@ -2921,6 +3011,186 @@
                 <w:sz w:val="19"/>
               </w:rPr>
               <w:t>Checked by</w:t>
+            </w:r>
+          </w:p>
+        </w:tc>
+      </w:tr>
+      <w:tr>
+        <w:trPr>
+          <w:cantSplit w:val="true"/>
+        </w:trPr>
+        <w:tc>
+          <w:tcPr>
+            <w:tcW w:type="dxa" w:w="504"/>
+            <w:vAlign w:val="center"/>
+            <w:shd w:val="clear" w:color="auto" w:fill="E8F5EC"/>
+          </w:tcPr>
+          <w:p>
+            <w:pPr>
+              <w:spacing w:after="20" w:before="20"/>
+            </w:pPr>
+            <w:r/>
+            <w:r>
+              <w:rPr>
+                <w:b/>
+                <w:i w:val="0"/>
+                <w:color w:val="1B7A3E"/>
+                <w:sz w:val="22"/>
+              </w:rPr>
+              <w:t>✔</w:t>
+            </w:r>
+          </w:p>
+        </w:tc>
+        <w:tc>
+          <w:tcPr>
+            <w:tcW w:type="dxa" w:w="2808"/>
+            <w:vAlign w:val="center"/>
+          </w:tcPr>
+          <w:p>
+            <w:pPr>
+              <w:spacing w:after="20" w:before="20"/>
+            </w:pPr>
+            <w:r/>
+            <w:r>
+              <w:rPr>
+                <w:b/>
+                <w:i w:val="0"/>
+                <w:color w:val="262626"/>
+                <w:sz w:val="19"/>
+              </w:rPr>
+              <w:t>Many people at once: 100 people starting together are all saved, each with their own session id, and spread evenly.</w:t>
+            </w:r>
+          </w:p>
+        </w:tc>
+        <w:tc>
+          <w:tcPr>
+            <w:tcW w:type="dxa" w:w="4968"/>
+            <w:vAlign w:val="center"/>
+          </w:tcPr>
+          <w:p>
+            <w:pPr>
+              <w:spacing w:after="20" w:before="20"/>
+            </w:pPr>
+            <w:r/>
+            <w:r>
+              <w:rPr>
+                <w:b w:val="0"/>
+                <w:i w:val="0"/>
+                <w:color w:val="262626"/>
+                <w:sz w:val="19"/>
+              </w:rPr>
+              <w:t>Since 6 October 2026 (your advisor's "multiple sessions safe"). The real server, on a throw-away database, took 400 pretend people arriving in bursts of 100, 100 and 200 in the same instant: 17,600 requests, none failed, every person saved with their own session id, exactly 25 per condition in every 100. The server now serves a crowd from one reading of the database: the slowest wait for a condition fell from 4.8 seconds to 0.14 (before, a third of each burst waited past the page's 3 seconds and got an uncounted random condition). Every person is counted exactly once while their record is being made (a burst could end 26 / 24 before).</w:t>
+            </w:r>
+          </w:p>
+        </w:tc>
+        <w:tc>
+          <w:tcPr>
+            <w:tcW w:type="dxa" w:w="1800"/>
+            <w:vAlign w:val="center"/>
+          </w:tcPr>
+          <w:p>
+            <w:pPr>
+              <w:spacing w:after="20" w:before="20"/>
+            </w:pPr>
+            <w:r/>
+            <w:r>
+              <w:rPr>
+                <w:b w:val="0"/>
+                <w:i w:val="0"/>
+                <w:color w:val="595959"/>
+                <w:sz w:val="17"/>
+              </w:rPr>
+              <w:t>validate:conditions, test:load (N22, N24, L1-L4)</w:t>
+            </w:r>
+          </w:p>
+        </w:tc>
+      </w:tr>
+      <w:tr>
+        <w:trPr>
+          <w:cantSplit w:val="true"/>
+        </w:trPr>
+        <w:tc>
+          <w:tcPr>
+            <w:tcW w:type="dxa" w:w="504"/>
+            <w:vAlign w:val="center"/>
+            <w:shd w:val="clear" w:color="auto" w:fill="E8F5EC"/>
+          </w:tcPr>
+          <w:p>
+            <w:pPr>
+              <w:spacing w:after="20" w:before="20"/>
+            </w:pPr>
+            <w:r/>
+            <w:r>
+              <w:rPr>
+                <w:b/>
+                <w:i w:val="0"/>
+                <w:color w:val="1B7A3E"/>
+                <w:sz w:val="22"/>
+              </w:rPr>
+              <w:t>✔</w:t>
+            </w:r>
+          </w:p>
+        </w:tc>
+        <w:tc>
+          <w:tcPr>
+            <w:tcW w:type="dxa" w:w="2808"/>
+            <w:vAlign w:val="center"/>
+          </w:tcPr>
+          <w:p>
+            <w:pPr>
+              <w:spacing w:after="20" w:before="20"/>
+            </w:pPr>
+            <w:r/>
+            <w:r>
+              <w:rPr>
+                <w:b/>
+                <w:i w:val="0"/>
+                <w:color w:val="262626"/>
+                <w:sz w:val="19"/>
+              </w:rPr>
+              <w:t>The live landing page never gives a random condition.</w:t>
+            </w:r>
+          </w:p>
+        </w:tc>
+        <w:tc>
+          <w:tcPr>
+            <w:tcW w:type="dxa" w:w="4968"/>
+            <w:vAlign w:val="center"/>
+          </w:tcPr>
+          <w:p>
+            <w:pPr>
+              <w:spacing w:after="20" w:before="20"/>
+            </w:pPr>
+            <w:r/>
+            <w:r>
+              <w:rPr>
+                <w:b w:val="0"/>
+                <w:i w:val="0"/>
+                <w:color w:val="262626"/>
+                <w:sz w:val="19"/>
+              </w:rPr>
+              <w:t>It asks the server up to four times with the same arrival id; if the server cannot be reached it says "We could not reach the study" with "Try again", which keeps the arrival id, so nobody is counted twice. Checked live with the server switched off and on again.</w:t>
+            </w:r>
+          </w:p>
+        </w:tc>
+        <w:tc>
+          <w:tcPr>
+            <w:tcW w:type="dxa" w:w="1800"/>
+            <w:vAlign w:val="center"/>
+          </w:tcPr>
+          <w:p>
+            <w:pPr>
+              <w:spacing w:after="20" w:before="20"/>
+            </w:pPr>
+            <w:r/>
+            <w:r>
+              <w:rPr>
+                <w:b w:val="0"/>
+                <w:i w:val="0"/>
+                <w:color w:val="595959"/>
+                <w:sz w:val="17"/>
+              </w:rPr>
+              <w:t>validate:conditions (N23)</w:t>
             </w:r>
           </w:p>
         </w:tc>
@@ -9377,6 +9647,75 @@
                 <w:color w:val="262626"/>
                 <w:sz w:val="19"/>
               </w:rPr>
+              <w:t>The Prolific version</w:t>
+            </w:r>
+          </w:p>
+        </w:tc>
+        <w:tc>
+          <w:tcPr>
+            <w:tcW w:type="dxa" w:w="5904"/>
+            <w:vAlign w:val="center"/>
+          </w:tcPr>
+          <w:p>
+            <w:pPr>
+              <w:spacing w:after="20" w:before="20"/>
+            </w:pPr>
+            <w:r/>
+            <w:r>
+              <w:rPr>
+                <w:b w:val="0"/>
+                <w:i w:val="0"/>
+                <w:color w:val="262626"/>
+                <w:sz w:val="19"/>
+              </w:rPr>
+              <w:t>Decided 6 October 2026: two versions on one website (the email version for FIT students and employees, and moonlander.fit.edu/prolific), conditions balanced per group, the second number check in the Prolific version only, no pilot, the first batch 40 places, every submission manually reviewed with a daily pay check by Claude. Built: Step 0 (many people at once). Still to build: steps 1-5 in docs/PROLIFIC_CONVERSION_PLAN.md section 1b.</w:t>
+            </w:r>
+          </w:p>
+        </w:tc>
+        <w:tc>
+          <w:tcPr>
+            <w:tcW w:type="dxa" w:w="1584"/>
+            <w:vAlign w:val="center"/>
+          </w:tcPr>
+          <w:p>
+            <w:pPr>
+              <w:spacing w:after="20" w:before="20"/>
+            </w:pPr>
+            <w:r/>
+            <w:r>
+              <w:rPr>
+                <w:b w:val="0"/>
+                <w:i w:val="0"/>
+                <w:color w:val="595959"/>
+                <w:sz w:val="19"/>
+              </w:rPr>
+              <w:t>Before Prolific</w:t>
+            </w:r>
+          </w:p>
+        </w:tc>
+      </w:tr>
+      <w:tr>
+        <w:trPr>
+          <w:cantSplit w:val="true"/>
+        </w:trPr>
+        <w:tc>
+          <w:tcPr>
+            <w:tcW w:type="dxa" w:w="2592"/>
+            <w:vAlign w:val="center"/>
+            <w:shd w:val="clear" w:color="auto" w:fill="FFF4E0"/>
+          </w:tcPr>
+          <w:p>
+            <w:pPr>
+              <w:spacing w:after="20" w:before="20"/>
+            </w:pPr>
+            <w:r/>
+            <w:r>
+              <w:rPr>
+                <w:b/>
+                <w:i w:val="0"/>
+                <w:color w:val="262626"/>
+                <w:sz w:val="19"/>
+              </w:rPr>
               <w:t>Fix 1, the very last fix before launch</w:t>
             </w:r>
           </w:p>
@@ -10887,7 +11226,7 @@
                 <w:color w:val="595959"/>
                 <w:sz w:val="17"/>
               </w:rPr>
-              <w:t>12</w:t>
+              <w:t>11</w:t>
             </w:r>
           </w:p>
         </w:tc>
@@ -10976,7 +11315,7 @@
                 <w:color w:val="595959"/>
                 <w:sz w:val="17"/>
               </w:rPr>
-              <w:t>16</w:t>
+              <w:t>14</w:t>
             </w:r>
           </w:p>
         </w:tc>
@@ -11934,7 +12273,7 @@
                 <w:color w:val="595959"/>
                 <w:sz w:val="17"/>
               </w:rPr>
-              <w:t>[PASS] K1  the committed tables are exactly what the recipe produces (200000 draws, 3.4s)</w:t>
+              <w:t>[PASS] K1  the committed tables are exactly what the recipe produces (200000 draws, 3.3s)</w:t>
             </w:r>
           </w:p>
         </w:tc>
@@ -12044,7 +12383,7 @@
                 <w:color w:val="595959"/>
                 <w:sz w:val="17"/>
               </w:rPr>
-              <w:t>8</w:t>
+              <w:t>7</w:t>
             </w:r>
           </w:p>
         </w:tc>
@@ -12222,7 +12561,7 @@
                 <w:color w:val="595959"/>
                 <w:sz w:val="17"/>
               </w:rPr>
-              <w:t>10</w:t>
+              <w:t>9</w:t>
             </w:r>
           </w:p>
         </w:tc>
@@ -12400,7 +12739,7 @@
                 <w:color w:val="595959"/>
                 <w:sz w:val="17"/>
               </w:rPr>
-              <w:t>7</w:t>
+              <w:t>6</w:t>
             </w:r>
           </w:p>
         </w:tc>
@@ -12667,7 +13006,7 @@
                 <w:color w:val="595959"/>
                 <w:sz w:val="17"/>
               </w:rPr>
-              <w:t>8</w:t>
+              <w:t>6</w:t>
             </w:r>
           </w:p>
         </w:tc>
@@ -12756,7 +13095,7 @@
                 <w:color w:val="595959"/>
                 <w:sz w:val="17"/>
               </w:rPr>
-              <w:t>11</w:t>
+              <w:t>22</w:t>
             </w:r>
           </w:p>
         </w:tc>
@@ -12782,7 +13121,7 @@
                 <w:color w:val="262626"/>
                 <w:sz w:val="18"/>
               </w:rPr>
-              <w:t>validate:mcf</w:t>
+              <w:t>test:load</w:t>
             </w:r>
           </w:p>
         </w:tc>
@@ -12824,7 +13163,7 @@
                 <w:color w:val="595959"/>
                 <w:sz w:val="17"/>
               </w:rPr>
-              <w:t>ALL MCF GATES PASSED</w:t>
+              <w:t>ALL LOAD GATES PASSED</w:t>
             </w:r>
           </w:p>
         </w:tc>
@@ -12845,7 +13184,7 @@
                 <w:color w:val="595959"/>
                 <w:sz w:val="17"/>
               </w:rPr>
-              <w:t>5</w:t>
+              <w:t>17</w:t>
             </w:r>
           </w:p>
         </w:tc>
@@ -12871,7 +13210,7 @@
                 <w:color w:val="262626"/>
                 <w:sz w:val="18"/>
               </w:rPr>
-              <w:t>validate:prediction</w:t>
+              <w:t>validate:mcf</w:t>
             </w:r>
           </w:p>
         </w:tc>
@@ -12913,7 +13252,7 @@
                 <w:color w:val="595959"/>
                 <w:sz w:val="17"/>
               </w:rPr>
-              <w:t>ALL PREDICTION GATES PASSED</w:t>
+              <w:t>ALL MCF GATES PASSED</w:t>
             </w:r>
           </w:p>
         </w:tc>
@@ -12934,7 +13273,7 @@
                 <w:color w:val="595959"/>
                 <w:sz w:val="17"/>
               </w:rPr>
-              <w:t>2</w:t>
+              <w:t>5</w:t>
             </w:r>
           </w:p>
         </w:tc>
@@ -12960,7 +13299,7 @@
                 <w:color w:val="262626"/>
                 <w:sz w:val="18"/>
               </w:rPr>
-              <w:t>build</w:t>
+              <w:t>validate:prediction</w:t>
             </w:r>
           </w:p>
         </w:tc>
@@ -13002,7 +13341,96 @@
                 <w:color w:val="595959"/>
                 <w:sz w:val="17"/>
               </w:rPr>
-              <w:t>✓ built in 871ms</w:t>
+              <w:t>ALL PREDICTION GATES PASSED</w:t>
+            </w:r>
+          </w:p>
+        </w:tc>
+        <w:tc>
+          <w:tcPr>
+            <w:tcW w:type="dxa" w:w="1008"/>
+            <w:vAlign w:val="center"/>
+          </w:tcPr>
+          <w:p>
+            <w:pPr>
+              <w:spacing w:after="20" w:before="20"/>
+            </w:pPr>
+            <w:r/>
+            <w:r>
+              <w:rPr>
+                <w:b w:val="0"/>
+                <w:i w:val="0"/>
+                <w:color w:val="595959"/>
+                <w:sz w:val="17"/>
+              </w:rPr>
+              <w:t>2</w:t>
+            </w:r>
+          </w:p>
+        </w:tc>
+      </w:tr>
+      <w:tr>
+        <w:trPr>
+          <w:cantSplit w:val="true"/>
+        </w:trPr>
+        <w:tc>
+          <w:tcPr>
+            <w:tcW w:type="dxa" w:w="2160"/>
+            <w:vAlign w:val="center"/>
+          </w:tcPr>
+          <w:p>
+            <w:pPr>
+              <w:spacing w:after="20" w:before="20"/>
+            </w:pPr>
+            <w:r/>
+            <w:r>
+              <w:rPr>
+                <w:b/>
+                <w:i w:val="0"/>
+                <w:color w:val="262626"/>
+                <w:sz w:val="18"/>
+              </w:rPr>
+              <w:t>build</w:t>
+            </w:r>
+          </w:p>
+        </w:tc>
+        <w:tc>
+          <w:tcPr>
+            <w:tcW w:type="dxa" w:w="1152"/>
+            <w:vAlign w:val="center"/>
+          </w:tcPr>
+          <w:p>
+            <w:pPr>
+              <w:spacing w:after="20" w:before="20"/>
+            </w:pPr>
+            <w:r/>
+            <w:r>
+              <w:rPr>
+                <w:b/>
+                <w:i w:val="0"/>
+                <w:color w:val="1B7A3E"/>
+                <w:sz w:val="18"/>
+              </w:rPr>
+              <w:t>passed</w:t>
+            </w:r>
+          </w:p>
+        </w:tc>
+        <w:tc>
+          <w:tcPr>
+            <w:tcW w:type="dxa" w:w="5760"/>
+            <w:vAlign w:val="center"/>
+          </w:tcPr>
+          <w:p>
+            <w:pPr>
+              <w:spacing w:after="20" w:before="20"/>
+            </w:pPr>
+            <w:r/>
+            <w:r>
+              <w:rPr>
+                <w:b w:val="0"/>
+                <w:i w:val="0"/>
+                <w:color w:val="595959"/>
+                <w:sz w:val="17"/>
+              </w:rPr>
+              <w:t>✓ built in 722ms</w:t>
             </w:r>
           </w:p>
         </w:tc>

</xml_diff>

<commit_message>
Accuracy checklist rebuilt: the two doors (C13, N25, load L5-L6)
Co-Authored-By: Claude Opus 5.5 <noreply@anthropic.com>
</commit_message>
<xml_diff>
--- a/docs/VRDS_Accuracy_Checklist.docx
+++ b/docs/VRDS_Accuracy_Checklist.docx
@@ -41,7 +41,7 @@
           <w:color w:val="595959"/>
           <w:sz w:val="20"/>
         </w:rPr>
-        <w:t>For Waseem and Claude  ·  06 October 2026  ·  code at commit 29fd2c8 on Prolific-branch-Edit_10_1</w:t>
+        <w:t>For Waseem and Claude  ·  06 October 2026  ·  code at commit f1d6856 on Prolific-branch-Edit_10_1</w:t>
       </w:r>
     </w:p>
     <w:p>
@@ -60,7 +60,7 @@
         <w:rPr>
           <w:color w:val="595959"/>
         </w:rPr>
-        <w:t xml:space="preserve">  (run 06 October 2026 at 12:12, when this file was made).</w:t>
+        <w:t xml:space="preserve">  (run 06 October 2026 at 16:03, when this file was made).</w:t>
       </w:r>
     </w:p>
     <w:p>
@@ -211,7 +211,7 @@
                 <w:color w:val="262626"/>
                 <w:sz w:val="19"/>
               </w:rPr>
-              <w:t>2026-10-03-baseline-no-fit</w:t>
+              <w:t>2026-10-06-two-doors</w:t>
             </w:r>
           </w:p>
         </w:tc>
@@ -3101,6 +3101,186 @@
                 <w:sz w:val="17"/>
               </w:rPr>
               <w:t>validate:conditions, test:load (N22, N24, L1-L4)</w:t>
+            </w:r>
+          </w:p>
+        </w:tc>
+      </w:tr>
+      <w:tr>
+        <w:trPr>
+          <w:cantSplit w:val="true"/>
+        </w:trPr>
+        <w:tc>
+          <w:tcPr>
+            <w:tcW w:type="dxa" w:w="504"/>
+            <w:vAlign w:val="center"/>
+            <w:shd w:val="clear" w:color="auto" w:fill="E8F5EC"/>
+          </w:tcPr>
+          <w:p>
+            <w:pPr>
+              <w:spacing w:after="20" w:before="20"/>
+            </w:pPr>
+            <w:r/>
+            <w:r>
+              <w:rPr>
+                <w:b/>
+                <w:i w:val="0"/>
+                <w:color w:val="1B7A3E"/>
+                <w:sz w:val="22"/>
+              </w:rPr>
+              <w:t>✔</w:t>
+            </w:r>
+          </w:p>
+        </w:tc>
+        <w:tc>
+          <w:tcPr>
+            <w:tcW w:type="dxa" w:w="2808"/>
+            <w:vAlign w:val="center"/>
+          </w:tcPr>
+          <w:p>
+            <w:pPr>
+              <w:spacing w:after="20" w:before="20"/>
+            </w:pPr>
+            <w:r/>
+            <w:r>
+              <w:rPr>
+                <w:b/>
+                <w:i w:val="0"/>
+                <w:color w:val="262626"/>
+                <w:sz w:val="19"/>
+              </w:rPr>
+              <w:t>Two doors: the university version is unchanged, and the Prolific version keys everybody by their Prolific ID.</w:t>
+            </w:r>
+          </w:p>
+        </w:tc>
+        <w:tc>
+          <w:tcPr>
+            <w:tcW w:type="dxa" w:w="4968"/>
+            <w:vAlign w:val="center"/>
+          </w:tcPr>
+          <w:p>
+            <w:pPr>
+              <w:spacing w:after="20" w:before="20"/>
+            </w:pPr>
+            <w:r/>
+            <w:r>
+              <w:rPr>
+                <w:b w:val="0"/>
+                <w:i w:val="0"/>
+                <w:color w:val="262626"/>
+                <w:sz w:val="19"/>
+              </w:rPr>
+              <w:t>Since 6 October 2026 (your 1-A, 2-A, 4-A; Step 1). moonlander.fit.edu asks the email as before; /prolific takes the Prolific ID from Prolific's link (a paste box if it is missing), stores it as prolific_pid and never as an email, marks every new record with its door (recruitment_source) and balances the four conditions inside each door. A returning Prolific person continues with no question; "A little about you" asks four questions there. 100 students and 100 Prolific people at once: 25 per condition inside each door. Checked live on the built site.</w:t>
+            </w:r>
+          </w:p>
+        </w:tc>
+        <w:tc>
+          <w:tcPr>
+            <w:tcW w:type="dxa" w:w="1800"/>
+            <w:vAlign w:val="center"/>
+          </w:tcPr>
+          <w:p>
+            <w:pPr>
+              <w:spacing w:after="20" w:before="20"/>
+            </w:pPr>
+            <w:r/>
+            <w:r>
+              <w:rPr>
+                <w:b w:val="0"/>
+                <w:i w:val="0"/>
+                <w:color w:val="595959"/>
+                <w:sz w:val="17"/>
+              </w:rPr>
+              <w:t>validate:session, validate:conditions, test:load (C13, N25, L5)</w:t>
+            </w:r>
+          </w:p>
+        </w:tc>
+      </w:tr>
+      <w:tr>
+        <w:trPr>
+          <w:cantSplit w:val="true"/>
+        </w:trPr>
+        <w:tc>
+          <w:tcPr>
+            <w:tcW w:type="dxa" w:w="504"/>
+            <w:vAlign w:val="center"/>
+            <w:shd w:val="clear" w:color="auto" w:fill="E8F5EC"/>
+          </w:tcPr>
+          <w:p>
+            <w:pPr>
+              <w:spacing w:after="20" w:before="20"/>
+            </w:pPr>
+            <w:r/>
+            <w:r>
+              <w:rPr>
+                <w:b/>
+                <w:i w:val="0"/>
+                <w:color w:val="1B7A3E"/>
+                <w:sz w:val="22"/>
+              </w:rPr>
+              <w:t>✔</w:t>
+            </w:r>
+          </w:p>
+        </w:tc>
+        <w:tc>
+          <w:tcPr>
+            <w:tcW w:type="dxa" w:w="2808"/>
+            <w:vAlign w:val="center"/>
+          </w:tcPr>
+          <w:p>
+            <w:pPr>
+              <w:spacing w:after="20" w:before="20"/>
+            </w:pPr>
+            <w:r/>
+            <w:r>
+              <w:rPr>
+                <w:b/>
+                <w:i w:val="0"/>
+                <w:color w:val="262626"/>
+                <w:sz w:val="19"/>
+              </w:rPr>
+              <w:t>The database's "one person" rules work for both doors, and the swap is safe.</w:t>
+            </w:r>
+          </w:p>
+        </w:tc>
+        <w:tc>
+          <w:tcPr>
+            <w:tcW w:type="dxa" w:w="4968"/>
+            <w:vAlign w:val="center"/>
+          </w:tcPr>
+          <w:p>
+            <w:pPr>
+              <w:spacing w:after="20" w:before="20"/>
+            </w:pPr>
+            <w:r/>
+            <w:r>
+              <w:rPr>
+                <w:b w:val="0"/>
+                <w:i w:val="0"/>
+                <w:color w:val="262626"/>
+                <w:sz w:val="19"/>
+              </w:rPr>
+              <w:t>One email is one person, and one Prolific ID is one person, each on the records that have it. The old rule is replaced when the server starts; tested on a copy with today's rule (every record kept). Without the swap the server could not start on such a database, which is why the swap is there. Back up the database before that deploy.</w:t>
+            </w:r>
+          </w:p>
+        </w:tc>
+        <w:tc>
+          <w:tcPr>
+            <w:tcW w:type="dxa" w:w="1800"/>
+            <w:vAlign w:val="center"/>
+          </w:tcPr>
+          <w:p>
+            <w:pPr>
+              <w:spacing w:after="20" w:before="20"/>
+            </w:pPr>
+            <w:r/>
+            <w:r>
+              <w:rPr>
+                <w:b w:val="0"/>
+                <w:i w:val="0"/>
+                <w:color w:val="595959"/>
+                <w:sz w:val="17"/>
+              </w:rPr>
+              <w:t>validate:session, test:load (C13, L6)</w:t>
             </w:r>
           </w:p>
         </w:tc>
@@ -9668,7 +9848,7 @@
                 <w:color w:val="262626"/>
                 <w:sz w:val="19"/>
               </w:rPr>
-              <w:t>Decided 6 October 2026: two versions on one website (the email version for FIT students and employees, and moonlander.fit.edu/prolific), conditions balanced per group, the second number check in the Prolific version only, no pilot, the first batch 40 places, every submission manually reviewed with a daily pay check by Claude. Built: Step 0 (many people at once). Still to build: steps 1-5 in docs/PROLIFIC_CONVERSION_PLAN.md section 1b.</w:t>
+              <w:t>Decided 6 October 2026: two versions on one website (the email version for FIT students and employees, and moonlander.fit.edu/prolific), conditions balanced per group, the second number check in the Prolific version only, no pilot, the first batch 40 places, every submission manually reviewed with a daily pay check by Claude. Built: Step 0 (many people at once) and Step 1 (the two doors and the Prolific ID). Still to build: steps 2-5 in docs/PROLIFIC_CONVERSION_PLAN.md section 1b (the Prolific door still shows the university consent page). Deploy after Step 4, with a database backup first (your 3-A).</w:t>
             </w:r>
           </w:p>
         </w:tc>
@@ -9690,6 +9870,75 @@
                 <w:sz w:val="19"/>
               </w:rPr>
               <w:t>Before Prolific</w:t>
+            </w:r>
+          </w:p>
+        </w:tc>
+      </w:tr>
+      <w:tr>
+        <w:trPr>
+          <w:cantSplit w:val="true"/>
+        </w:trPr>
+        <w:tc>
+          <w:tcPr>
+            <w:tcW w:type="dxa" w:w="2592"/>
+            <w:vAlign w:val="center"/>
+            <w:shd w:val="clear" w:color="auto" w:fill="FFF4E0"/>
+          </w:tcPr>
+          <w:p>
+            <w:pPr>
+              <w:spacing w:after="20" w:before="20"/>
+            </w:pPr>
+            <w:r/>
+            <w:r>
+              <w:rPr>
+                <w:b/>
+                <w:i w:val="0"/>
+                <w:color w:val="262626"/>
+                <w:sz w:val="19"/>
+              </w:rPr>
+              <w:t>A second student on a shared computer (the university door)</w:t>
+            </w:r>
+          </w:p>
+        </w:tc>
+        <w:tc>
+          <w:tcPr>
+            <w:tcW w:type="dxa" w:w="5904"/>
+            <w:vAlign w:val="center"/>
+          </w:tcPr>
+          <w:p>
+            <w:pPr>
+              <w:spacing w:after="20" w:before="20"/>
+            </w:pPr>
+            <w:r/>
+            <w:r>
+              <w:rPr>
+                <w:b w:val="0"/>
+                <w:i w:val="0"/>
+                <w:color w:val="262626"/>
+                <w:sz w:val="19"/>
+              </w:rPr>
+              <w:t>Found on 6 October 2026, not changed: on a shared lab computer the browser reopens the first student's run, or their thank-you page, so a second student cannot start there. A private window (or their own device) works. A "Not you? Start as someone else" button is your decision. (The Prolific door handles this: a different Prolific ID in the link starts fresh.)</w:t>
+            </w:r>
+          </w:p>
+        </w:tc>
+        <w:tc>
+          <w:tcPr>
+            <w:tcW w:type="dxa" w:w="1584"/>
+            <w:vAlign w:val="center"/>
+          </w:tcPr>
+          <w:p>
+            <w:pPr>
+              <w:spacing w:after="20" w:before="20"/>
+            </w:pPr>
+            <w:r/>
+            <w:r>
+              <w:rPr>
+                <w:b w:val="0"/>
+                <w:i w:val="0"/>
+                <w:color w:val="595959"/>
+                <w:sz w:val="19"/>
+              </w:rPr>
+              <w:t>Your choice</w:t>
             </w:r>
           </w:p>
         </w:tc>
@@ -11226,7 +11475,7 @@
                 <w:color w:val="595959"/>
                 <w:sz w:val="17"/>
               </w:rPr>
-              <w:t>11</w:t>
+              <w:t>12</w:t>
             </w:r>
           </w:p>
         </w:tc>
@@ -12739,7 +12988,7 @@
                 <w:color w:val="595959"/>
                 <w:sz w:val="17"/>
               </w:rPr>
-              <w:t>6</w:t>
+              <w:t>7</w:t>
             </w:r>
           </w:p>
         </w:tc>
@@ -12917,7 +13166,7 @@
                 <w:color w:val="595959"/>
                 <w:sz w:val="17"/>
               </w:rPr>
-              <w:t>8</w:t>
+              <w:t>9</w:t>
             </w:r>
           </w:p>
         </w:tc>
@@ -13006,7 +13255,7 @@
                 <w:color w:val="595959"/>
                 <w:sz w:val="17"/>
               </w:rPr>
-              <w:t>6</w:t>
+              <w:t>7</w:t>
             </w:r>
           </w:p>
         </w:tc>
@@ -13095,7 +13344,7 @@
                 <w:color w:val="595959"/>
                 <w:sz w:val="17"/>
               </w:rPr>
-              <w:t>22</w:t>
+              <w:t>27</w:t>
             </w:r>
           </w:p>
         </w:tc>
@@ -13184,7 +13433,7 @@
                 <w:color w:val="595959"/>
                 <w:sz w:val="17"/>
               </w:rPr>
-              <w:t>17</w:t>
+              <w:t>27</w:t>
             </w:r>
           </w:p>
         </w:tc>
@@ -13430,7 +13679,7 @@
                 <w:color w:val="595959"/>
                 <w:sz w:val="17"/>
               </w:rPr>
-              <w:t>✓ built in 722ms</w:t>
+              <w:t>✓ built in 756ms</w:t>
             </w:r>
           </w:p>
         </w:tc>

</xml_diff>

<commit_message>
Accuracy checklist rebuilt: the audit fixes and Not you? (C14)
Co-Authored-By: Claude Opus 5.5 <noreply@anthropic.com>
</commit_message>
<xml_diff>
--- a/docs/VRDS_Accuracy_Checklist.docx
+++ b/docs/VRDS_Accuracy_Checklist.docx
@@ -41,7 +41,7 @@
           <w:color w:val="595959"/>
           <w:sz w:val="20"/>
         </w:rPr>
-        <w:t>For Waseem and Claude  ·  06 October 2026  ·  code at commit f1d6856 on Prolific-branch-Edit_10_1</w:t>
+        <w:t>For Waseem and Claude  ·  06 October 2026  ·  code at commit 301bcc6 on Prolific-branch-Edit_10_1</w:t>
       </w:r>
     </w:p>
     <w:p>
@@ -60,7 +60,7 @@
         <w:rPr>
           <w:color w:val="595959"/>
         </w:rPr>
-        <w:t xml:space="preserve">  (run 06 October 2026 at 16:03, when this file was made).</w:t>
+        <w:t xml:space="preserve">  (run 06 October 2026 at 18:06, when this file was made).</w:t>
       </w:r>
     </w:p>
     <w:p>
@@ -3281,6 +3281,96 @@
                 <w:sz w:val="17"/>
               </w:rPr>
               <w:t>validate:session, test:load (C13, L6)</w:t>
+            </w:r>
+          </w:p>
+        </w:tc>
+      </w:tr>
+      <w:tr>
+        <w:trPr>
+          <w:cantSplit w:val="true"/>
+        </w:trPr>
+        <w:tc>
+          <w:tcPr>
+            <w:tcW w:type="dxa" w:w="504"/>
+            <w:vAlign w:val="center"/>
+            <w:shd w:val="clear" w:color="auto" w:fill="E8F5EC"/>
+          </w:tcPr>
+          <w:p>
+            <w:pPr>
+              <w:spacing w:after="20" w:before="20"/>
+            </w:pPr>
+            <w:r/>
+            <w:r>
+              <w:rPr>
+                <w:b/>
+                <w:i w:val="0"/>
+                <w:color w:val="1B7A3E"/>
+                <w:sz w:val="22"/>
+              </w:rPr>
+              <w:t>✔</w:t>
+            </w:r>
+          </w:p>
+        </w:tc>
+        <w:tc>
+          <w:tcPr>
+            <w:tcW w:type="dxa" w:w="2808"/>
+            <w:vAlign w:val="center"/>
+          </w:tcPr>
+          <w:p>
+            <w:pPr>
+              <w:spacing w:after="20" w:before="20"/>
+            </w:pPr>
+            <w:r/>
+            <w:r>
+              <w:rPr>
+                <w:b/>
+                <w:i w:val="0"/>
+                <w:color w:val="262626"/>
+                <w:sz w:val="19"/>
+              </w:rPr>
+              <w:t>A second student on a shared computer can start ("Not you?").</w:t>
+            </w:r>
+          </w:p>
+        </w:tc>
+        <w:tc>
+          <w:tcPr>
+            <w:tcW w:type="dxa" w:w="4968"/>
+            <w:vAlign w:val="center"/>
+          </w:tcPr>
+          <w:p>
+            <w:pPr>
+              <w:spacing w:after="20" w:before="20"/>
+            </w:pPr>
+            <w:r/>
+            <w:r>
+              <w:rPr>
+                <w:b w:val="0"/>
+                <w:i w:val="0"/>
+                <w:color w:val="262626"/>
+                <w:sz w:val="19"/>
+              </w:rPr>
+              <w:t>Since 6 October 2026 (your 4-Yes). When the university door opens with somebody's run in the browser, a small note says "This study is open for w•••@my.fit.edu. Not you?" (the email partly hidden); after a confirmation the browser forgets that run (it stays on the server) and the study starts afresh. Checked live.</w:t>
+            </w:r>
+          </w:p>
+        </w:tc>
+        <w:tc>
+          <w:tcPr>
+            <w:tcW w:type="dxa" w:w="1800"/>
+            <w:vAlign w:val="center"/>
+          </w:tcPr>
+          <w:p>
+            <w:pPr>
+              <w:spacing w:after="20" w:before="20"/>
+            </w:pPr>
+            <w:r/>
+            <w:r>
+              <w:rPr>
+                <w:b w:val="0"/>
+                <w:i w:val="0"/>
+                <w:color w:val="595959"/>
+                <w:sz w:val="17"/>
+              </w:rPr>
+              <w:t>validate:session (C14)</w:t>
             </w:r>
           </w:p>
         </w:tc>
@@ -9896,7 +9986,7 @@
                 <w:color w:val="262626"/>
                 <w:sz w:val="19"/>
               </w:rPr>
-              <w:t>A second student on a shared computer (the university door)</w:t>
+              <w:t>Anybody who knows a key can download that person's whole record (audit F2)</w:t>
             </w:r>
           </w:p>
         </w:tc>
@@ -9917,7 +10007,7 @@
                 <w:color w:val="262626"/>
                 <w:sz w:val="19"/>
               </w:rPr>
-              <w:t>Found on 6 October 2026, not changed: on a shared lab computer the browser reopens the first student's run, or their thank-you page, so a second student cannot start there. A private window (or their own device) works. A "Not you? Start as someone else" button is your decision. (The Prolific door handles this: a different Prolific ID in the link starts fresh.)</w:t>
+              <w:t>Found in the audit of 6 October 2026, older than the two doors: /api/participants/lookup returns the whole record (every answer, and the age) to anyone who knows a participant's email or Prolific ID, so the "email and age" check is weaker than it looks. Your 2-A: fix it as the next step, before Step 2 - the start page would learn only "new, unfinished or finished", the server would check the age itself, and answers would come down only after that.</w:t>
             </w:r>
           </w:p>
         </w:tc>
@@ -9938,7 +10028,7 @@
                 <w:color w:val="595959"/>
                 <w:sz w:val="19"/>
               </w:rPr>
-              <w:t>Your choice</w:t>
+              <w:t>Before launch, next</w:t>
             </w:r>
           </w:p>
         </w:tc>
@@ -10124,7 +10214,7 @@
                 <w:color w:val="262626"/>
                 <w:sz w:val="19"/>
               </w:rPr>
-              <w:t>The database holds test runs, and a record carries no stamp of the code version. Decide before launch whether to delete them or mark them. When analysing, always filter on status "Study Completed" and date records by completed_at.</w:t>
+              <w:t>The database holds test runs, and a record carries no stamp of the code version. Decide before launch whether to delete them or mark them. When analysing, always filter on status "Study Completed" and date records by completed_at. The rule for every test run, both doors and Prolific's "Preview as participant": add ?condition=CVR_APA (or CVR_Only, APA_Only, Baseline) to the address, so it is never counted for balance.</w:t>
             </w:r>
           </w:p>
         </w:tc>
@@ -12810,7 +12900,7 @@
                 <w:color w:val="595959"/>
                 <w:sz w:val="17"/>
               </w:rPr>
-              <w:t>9</w:t>
+              <w:t>10</w:t>
             </w:r>
           </w:p>
         </w:tc>
@@ -13433,7 +13523,7 @@
                 <w:color w:val="595959"/>
                 <w:sz w:val="17"/>
               </w:rPr>
-              <w:t>27</w:t>
+              <w:t>29</w:t>
             </w:r>
           </w:p>
         </w:tc>
@@ -13679,7 +13769,7 @@
                 <w:color w:val="595959"/>
                 <w:sz w:val="17"/>
               </w:rPr>
-              <w:t>✓ built in 756ms</w:t>
+              <w:t>✓ built in 745ms</w:t>
             </w:r>
           </w:p>
         </w:tc>

</xml_diff>

<commit_message>
A finished person's new condition is given back (both doors)
The researcher's "A". Somebody who had already finished and opened the study on a new
device was given a landing-page condition that counted for balance as "just arrived"
for 30 minutes, so the balance was off by one for that half hour. Now both first pages
give it back as soon as they see a finished email or Prolific ID (onFinishedSeen in
ExperimentFlow; only a condition nobody owns; storage gives each arrival back once),
and a given-back arrival never counts.

validate:conditions N26 new (5 deliberate breaks, 5 caught); C13 taught the new prop.
Live in both doors: the two arrivals were released and neither counted. Full chain and
the accuracy checklist (28 of 28) pass.

Co-Authored-By: Claude Opus 5.5 <noreply@anthropic.com>
</commit_message>
<xml_diff>
--- a/docs/VRDS_Accuracy_Checklist.docx
+++ b/docs/VRDS_Accuracy_Checklist.docx
@@ -41,7 +41,7 @@
           <w:color w:val="595959"/>
           <w:sz w:val="20"/>
         </w:rPr>
-        <w:t>For Waseem and Claude  ·  07 October 2026  ·  code at commit 727d215 on Prolific-branch-Edit_10_1</w:t>
+        <w:t>For Waseem and Claude  ·  07 October 2026  ·  code at commit c6ccbf5 on Prolific-branch-Edit_10_1</w:t>
       </w:r>
     </w:p>
     <w:p>
@@ -60,7 +60,7 @@
         <w:rPr>
           <w:color w:val="595959"/>
         </w:rPr>
-        <w:t xml:space="preserve">  (run 07 October 2026 at 09:57, when this file was made).</w:t>
+        <w:t xml:space="preserve">  (run 07 October 2026 at 10:23, when this file was made).</w:t>
       </w:r>
     </w:p>
     <w:p>
@@ -3731,6 +3731,96 @@
                 <w:sz w:val="17"/>
               </w:rPr>
               <w:t>validate:session, test:load (C16, L8)</w:t>
+            </w:r>
+          </w:p>
+        </w:tc>
+      </w:tr>
+      <w:tr>
+        <w:trPr>
+          <w:cantSplit w:val="true"/>
+        </w:trPr>
+        <w:tc>
+          <w:tcPr>
+            <w:tcW w:type="dxa" w:w="504"/>
+            <w:vAlign w:val="center"/>
+            <w:shd w:val="clear" w:color="auto" w:fill="E8F5EC"/>
+          </w:tcPr>
+          <w:p>
+            <w:pPr>
+              <w:spacing w:after="20" w:before="20"/>
+            </w:pPr>
+            <w:r/>
+            <w:r>
+              <w:rPr>
+                <w:b/>
+                <w:i w:val="0"/>
+                <w:color w:val="1B7A3E"/>
+                <w:sz w:val="22"/>
+              </w:rPr>
+              <w:t>✔</w:t>
+            </w:r>
+          </w:p>
+        </w:tc>
+        <w:tc>
+          <w:tcPr>
+            <w:tcW w:type="dxa" w:w="2808"/>
+            <w:vAlign w:val="center"/>
+          </w:tcPr>
+          <w:p>
+            <w:pPr>
+              <w:spacing w:after="20" w:before="20"/>
+            </w:pPr>
+            <w:r/>
+            <w:r>
+              <w:rPr>
+                <w:b/>
+                <w:i w:val="0"/>
+                <w:color w:val="262626"/>
+                <w:sz w:val="19"/>
+              </w:rPr>
+              <w:t>Somebody who already finished never tilts the balance.</w:t>
+            </w:r>
+          </w:p>
+        </w:tc>
+        <w:tc>
+          <w:tcPr>
+            <w:tcW w:type="dxa" w:w="4968"/>
+            <w:vAlign w:val="center"/>
+          </w:tcPr>
+          <w:p>
+            <w:pPr>
+              <w:spacing w:after="20" w:before="20"/>
+            </w:pPr>
+            <w:r/>
+            <w:r>
+              <w:rPr>
+                <w:b w:val="0"/>
+                <w:i w:val="0"/>
+                <w:color w:val="262626"/>
+                <w:sz w:val="19"/>
+              </w:rPr>
+              <w:t>Since 7 October 2026 (your "A"). A finished person who opens the study on a new device is given a condition by the landing page; the first page now gives it back as soon as it sees they finished, so it never counts as "just arrived" (both versions). Checked live.</w:t>
+            </w:r>
+          </w:p>
+        </w:tc>
+        <w:tc>
+          <w:tcPr>
+            <w:tcW w:type="dxa" w:w="1800"/>
+            <w:vAlign w:val="center"/>
+          </w:tcPr>
+          <w:p>
+            <w:pPr>
+              <w:spacing w:after="20" w:before="20"/>
+            </w:pPr>
+            <w:r/>
+            <w:r>
+              <w:rPr>
+                <w:b w:val="0"/>
+                <w:i w:val="0"/>
+                <w:color w:val="595959"/>
+                <w:sz w:val="17"/>
+              </w:rPr>
+              <w:t>validate:conditions (N26)</w:t>
             </w:r>
           </w:p>
         </w:tc>
@@ -10346,75 +10436,6 @@
                 <w:color w:val="262626"/>
                 <w:sz w:val="19"/>
               </w:rPr>
-              <w:t>A finished person on a new device counts as "just arrived" for 30 minutes</w:t>
-            </w:r>
-          </w:p>
-        </w:tc>
-        <w:tc>
-          <w:tcPr>
-            <w:tcW w:type="dxa" w:w="5904"/>
-            <w:vAlign w:val="center"/>
-          </w:tcPr>
-          <w:p>
-            <w:pPr>
-              <w:spacing w:after="20" w:before="20"/>
-            </w:pPr>
-            <w:r/>
-            <w:r>
-              <w:rPr>
-                <w:b w:val="0"/>
-                <w:i w:val="0"/>
-                <w:color w:val="262626"/>
-                <w:sz w:val="19"/>
-              </w:rPr>
-              <w:t>Noticed on 7 October 2026, not changed: somebody who already finished and opens the study on a new device is given a landing-page condition that counts for balance as "just arrived" for 30 minutes (both versions, since 1 October). The balance is off by one for that half hour, then corrects itself. A small fix (release that arrival when the first page sees a finished person) is possible.</w:t>
-            </w:r>
-          </w:p>
-        </w:tc>
-        <w:tc>
-          <w:tcPr>
-            <w:tcW w:type="dxa" w:w="1584"/>
-            <w:vAlign w:val="center"/>
-          </w:tcPr>
-          <w:p>
-            <w:pPr>
-              <w:spacing w:after="20" w:before="20"/>
-            </w:pPr>
-            <w:r/>
-            <w:r>
-              <w:rPr>
-                <w:b w:val="0"/>
-                <w:i w:val="0"/>
-                <w:color w:val="595959"/>
-                <w:sz w:val="19"/>
-              </w:rPr>
-              <w:t>Optional</w:t>
-            </w:r>
-          </w:p>
-        </w:tc>
-      </w:tr>
-      <w:tr>
-        <w:trPr>
-          <w:cantSplit w:val="true"/>
-        </w:trPr>
-        <w:tc>
-          <w:tcPr>
-            <w:tcW w:type="dxa" w:w="2592"/>
-            <w:vAlign w:val="center"/>
-            <w:shd w:val="clear" w:color="auto" w:fill="FFF4E0"/>
-          </w:tcPr>
-          <w:p>
-            <w:pPr>
-              <w:spacing w:after="20" w:before="20"/>
-            </w:pPr>
-            <w:r/>
-            <w:r>
-              <w:rPr>
-                <w:b/>
-                <w:i w:val="0"/>
-                <w:color w:val="262626"/>
-                <w:sz w:val="19"/>
-              </w:rPr>
               <w:t>Your ethics board approves the Prolific consent text</w:t>
             </w:r>
           </w:p>
@@ -11994,7 +12015,7 @@
                 <w:color w:val="595959"/>
                 <w:sz w:val="17"/>
               </w:rPr>
-              <w:t>13</w:t>
+              <w:t>12</w:t>
             </w:r>
           </w:p>
         </w:tc>
@@ -12083,7 +12104,7 @@
                 <w:color w:val="595959"/>
                 <w:sz w:val="17"/>
               </w:rPr>
-              <w:t>17</w:t>
+              <w:t>15</w:t>
             </w:r>
           </w:p>
         </w:tc>
@@ -13151,7 +13172,7 @@
                 <w:color w:val="595959"/>
                 <w:sz w:val="17"/>
               </w:rPr>
-              <w:t>8</w:t>
+              <w:t>7</w:t>
             </w:r>
           </w:p>
         </w:tc>
@@ -13240,7 +13261,7 @@
                 <w:color w:val="595959"/>
                 <w:sz w:val="17"/>
               </w:rPr>
-              <w:t>13</w:t>
+              <w:t>12</w:t>
             </w:r>
           </w:p>
         </w:tc>
@@ -13329,7 +13350,7 @@
                 <w:color w:val="595959"/>
                 <w:sz w:val="17"/>
               </w:rPr>
-              <w:t>11</w:t>
+              <w:t>10</w:t>
             </w:r>
           </w:p>
         </w:tc>
@@ -13507,7 +13528,7 @@
                 <w:color w:val="595959"/>
                 <w:sz w:val="17"/>
               </w:rPr>
-              <w:t>8</w:t>
+              <w:t>7</w:t>
             </w:r>
           </w:p>
         </w:tc>
@@ -13685,7 +13706,7 @@
                 <w:color w:val="595959"/>
                 <w:sz w:val="17"/>
               </w:rPr>
-              <w:t>10</w:t>
+              <w:t>9</w:t>
             </w:r>
           </w:p>
         </w:tc>
@@ -13774,7 +13795,7 @@
                 <w:color w:val="595959"/>
                 <w:sz w:val="17"/>
               </w:rPr>
-              <w:t>9</w:t>
+              <w:t>8</w:t>
             </w:r>
           </w:p>
         </w:tc>
@@ -13863,7 +13884,7 @@
                 <w:color w:val="595959"/>
                 <w:sz w:val="17"/>
               </w:rPr>
-              <w:t>29</w:t>
+              <w:t>27</w:t>
             </w:r>
           </w:p>
         </w:tc>
@@ -13952,7 +13973,7 @@
                 <w:color w:val="595959"/>
                 <w:sz w:val="17"/>
               </w:rPr>
-              <w:t>30</w:t>
+              <w:t>27</w:t>
             </w:r>
           </w:p>
         </w:tc>
@@ -14041,7 +14062,7 @@
                 <w:color w:val="595959"/>
                 <w:sz w:val="17"/>
               </w:rPr>
-              <w:t>6</w:t>
+              <w:t>5</w:t>
             </w:r>
           </w:p>
         </w:tc>
@@ -14198,7 +14219,7 @@
                 <w:color w:val="595959"/>
                 <w:sz w:val="17"/>
               </w:rPr>
-              <w:t>✓ built in 945ms</w:t>
+              <w:t>✓ built in 773ms</w:t>
             </w:r>
           </w:p>
         </w:tc>

</xml_diff>

<commit_message>
Fix 2 holds in both doors; condition 1 checked
The main study never reads the door, so APA_Only's box and its new sentence are
the same for students and Prolific people. N27 now fails if the page ever reads
the door (2 deliberate breaks, 2 caught). Seen live in the university door with
the same answers as the Prolific rehearsal.

Condition 1 (CVR+APA) has no box: its APA page says only "It fell short on ...",
so that clash cannot happen there (seen live). Recorded as an open question for
the researcher: the list heading "These options best fit X" (conditions 1 and 3)
can list the person's own option one screen after "It fell short on ... X".

Co-Authored-By: Claude Opus 5.5 <noreply@anthropic.com>
</commit_message>
<xml_diff>
--- a/docs/VRDS_Accuracy_Checklist.docx
+++ b/docs/VRDS_Accuracy_Checklist.docx
@@ -41,7 +41,7 @@
           <w:color w:val="595959"/>
           <w:sz w:val="20"/>
         </w:rPr>
-        <w:t>For Waseem and Claude  ·  07 October 2026  ·  code at commit 4dfbe38 on Prolific-branch-Edit_10_1</w:t>
+        <w:t>For Waseem and Claude  ·  07 October 2026  ·  code at commit c6a6048 on Prolific-branch-Edit_10_1</w:t>
       </w:r>
     </w:p>
     <w:p>
@@ -60,7 +60,7 @@
         <w:rPr>
           <w:color w:val="595959"/>
         </w:rPr>
-        <w:t xml:space="preserve">  (run 07 October 2026 at 19:05, when this file was made).</w:t>
+        <w:t xml:space="preserve">  (run 07 October 2026 at 19:34, when this file was made).</w:t>
       </w:r>
     </w:p>
     <w:p>
@@ -4069,7 +4069,7 @@
                 <w:color w:val="262626"/>
                 <w:sz w:val="19"/>
               </w:rPr>
-              <w:t>Since 7 October 2026 (your 2-A). When the chosen option falls short on the very value the box says it serves most, the box adds "It still gives less on X than your earlier answers asked for." - exactly when the line under it names that value too. Saved with the record. Checked by hand over every option and 400 pretend profiles, and live.</w:t>
+              <w:t>Since 7 October 2026 (your 2-A). When the chosen option falls short on the very value the box says it serves most, the box adds "It still gives less on X than your earlier answers asked for." - exactly when the line under it names that value too, in both versions (students and Prolific). Saved with the record. Checked by hand over every option and 400 pretend profiles, and live in both versions.</w:t>
             </w:r>
           </w:p>
         </w:tc>
@@ -10886,6 +10886,75 @@
                 <w:color w:val="262626"/>
                 <w:sz w:val="19"/>
               </w:rPr>
+              <w:t>The APA list heading in conditions 1 and 3 (your decision)</w:t>
+            </w:r>
+          </w:p>
+        </w:tc>
+        <w:tc>
+          <w:tcPr>
+            <w:tcW w:type="dxa" w:w="5904"/>
+            <w:vAlign w:val="center"/>
+          </w:tcPr>
+          <w:p>
+            <w:pPr>
+              <w:spacing w:after="20" w:before="20"/>
+            </w:pPr>
+            <w:r/>
+            <w:r>
+              <w:rPr>
+                <w:b w:val="0"/>
+                <w:i w:val="0"/>
+                <w:color w:val="262626"/>
+                <w:sz w:val="19"/>
+              </w:rPr>
+              <w:t>After a person names a value, the APA page lists options under "These options best fit X - the value you just prioritized." If they name the value their own option is built on, their option is listed there one screen after "It fell short on ... X". Both are true ("best fit" compares the options; "fell short" compares with what they asked for), but it can read like the clash fixed in APA_Only's box. Found 7 October 2026; asked.</w:t>
+            </w:r>
+          </w:p>
+        </w:tc>
+        <w:tc>
+          <w:tcPr>
+            <w:tcW w:type="dxa" w:w="1584"/>
+            <w:vAlign w:val="center"/>
+          </w:tcPr>
+          <w:p>
+            <w:pPr>
+              <w:spacing w:after="20" w:before="20"/>
+            </w:pPr>
+            <w:r/>
+            <w:r>
+              <w:rPr>
+                <w:b w:val="0"/>
+                <w:i w:val="0"/>
+                <w:color w:val="595959"/>
+                <w:sz w:val="19"/>
+              </w:rPr>
+              <w:t>Before Prolific</w:t>
+            </w:r>
+          </w:p>
+        </w:tc>
+      </w:tr>
+      <w:tr>
+        <w:trPr>
+          <w:cantSplit w:val="true"/>
+        </w:trPr>
+        <w:tc>
+          <w:tcPr>
+            <w:tcW w:type="dxa" w:w="2592"/>
+            <w:vAlign w:val="center"/>
+            <w:shd w:val="clear" w:color="auto" w:fill="FFF4E0"/>
+          </w:tcPr>
+          <w:p>
+            <w:pPr>
+              <w:spacing w:after="20" w:before="20"/>
+            </w:pPr>
+            <w:r/>
+            <w:r>
+              <w:rPr>
+                <w:b/>
+                <w:i w:val="0"/>
+                <w:color w:val="262626"/>
+                <w:sz w:val="19"/>
+              </w:rPr>
               <w:t>Your ethics board approves the Prolific consent text</w:t>
             </w:r>
           </w:p>
@@ -12465,7 +12534,7 @@
                 <w:color w:val="595959"/>
                 <w:sz w:val="17"/>
               </w:rPr>
-              <w:t>12</w:t>
+              <w:t>13</w:t>
             </w:r>
           </w:p>
         </w:tc>
@@ -12554,7 +12623,7 @@
                 <w:color w:val="595959"/>
                 <w:sz w:val="17"/>
               </w:rPr>
-              <w:t>15</w:t>
+              <w:t>16</w:t>
             </w:r>
           </w:p>
         </w:tc>
@@ -13444,7 +13513,7 @@
                 <w:color w:val="595959"/>
                 <w:sz w:val="17"/>
               </w:rPr>
-              <w:t>9</w:t>
+              <w:t>10</w:t>
             </w:r>
           </w:p>
         </w:tc>
@@ -13512,7 +13581,7 @@
                 <w:color w:val="595959"/>
                 <w:sz w:val="17"/>
               </w:rPr>
-              <w:t>[PASS] K1  the committed tables are exactly what the recipe produces (200000 draws, 3.4s)</w:t>
+              <w:t>[PASS] K1  the committed tables are exactly what the recipe produces (200000 draws, 3.3s)</w:t>
             </w:r>
           </w:p>
         </w:tc>
@@ -14423,7 +14492,7 @@
                 <w:color w:val="595959"/>
                 <w:sz w:val="17"/>
               </w:rPr>
-              <w:t>28</w:t>
+              <w:t>27</w:t>
             </w:r>
           </w:p>
         </w:tc>
@@ -14512,7 +14581,7 @@
                 <w:color w:val="595959"/>
                 <w:sz w:val="17"/>
               </w:rPr>
-              <w:t>31</w:t>
+              <w:t>28</w:t>
             </w:r>
           </w:p>
         </w:tc>
@@ -14601,7 +14670,7 @@
                 <w:color w:val="595959"/>
                 <w:sz w:val="17"/>
               </w:rPr>
-              <w:t>6</w:t>
+              <w:t>5</w:t>
             </w:r>
           </w:p>
         </w:tc>
@@ -14758,7 +14827,7 @@
                 <w:color w:val="595959"/>
                 <w:sz w:val="17"/>
               </w:rPr>
-              <w:t>✓ built in 880ms</w:t>
+              <w:t>✓ built in 1.01s</w:t>
             </w:r>
           </w:p>
         </w:tc>

</xml_diff>

<commit_message>
APA list heading: "These options are built on X" (B)
Conditions 1 and 3: after a person names a value, the APA page's list heading
said "These options best fit X - the value you just prioritized.", which could
list the person's own option one screen after "It fell short on ... X". It now
says "These options are built on X - the value you just prioritized." - what the
list is (the options whose strongest value is X). The options are unchanged.

N28: the words, no "best fit" on the APA page, the list still the options built
on X, and every value has an option built on it in each decision scenario so the
heading is always true. 5 deliberate breaks, 5 caught. Seen live in condition 1.

Co-Authored-By: Claude Opus 5.5 <noreply@anthropic.com>
</commit_message>
<xml_diff>
--- a/docs/VRDS_Accuracy_Checklist.docx
+++ b/docs/VRDS_Accuracy_Checklist.docx
@@ -41,7 +41,7 @@
           <w:color w:val="595959"/>
           <w:sz w:val="20"/>
         </w:rPr>
-        <w:t>For Waseem and Claude  ·  07 October 2026  ·  code at commit c6a6048 on Prolific-branch-Edit_10_1</w:t>
+        <w:t>For Waseem and Claude  ·  07 October 2026  ·  code at commit ffbfbf3 on Prolific-branch-Edit_10_1</w:t>
       </w:r>
     </w:p>
     <w:p>
@@ -60,7 +60,7 @@
         <w:rPr>
           <w:color w:val="595959"/>
         </w:rPr>
-        <w:t xml:space="preserve">  (run 07 October 2026 at 19:34, when this file was made).</w:t>
+        <w:t xml:space="preserve">  (run 07 October 2026 at 19:56, when this file was made).</w:t>
       </w:r>
     </w:p>
     <w:p>
@@ -4091,6 +4091,96 @@
                 <w:sz w:val="17"/>
               </w:rPr>
               <w:t>validate:conditions (N27)</w:t>
+            </w:r>
+          </w:p>
+        </w:tc>
+      </w:tr>
+      <w:tr>
+        <w:trPr>
+          <w:cantSplit w:val="true"/>
+        </w:trPr>
+        <w:tc>
+          <w:tcPr>
+            <w:tcW w:type="dxa" w:w="504"/>
+            <w:vAlign w:val="center"/>
+            <w:shd w:val="clear" w:color="auto" w:fill="E8F5EC"/>
+          </w:tcPr>
+          <w:p>
+            <w:pPr>
+              <w:spacing w:after="20" w:before="20"/>
+            </w:pPr>
+            <w:r/>
+            <w:r>
+              <w:rPr>
+                <w:b/>
+                <w:i w:val="0"/>
+                <w:color w:val="1B7A3E"/>
+                <w:sz w:val="22"/>
+              </w:rPr>
+              <w:t>✔</w:t>
+            </w:r>
+          </w:p>
+        </w:tc>
+        <w:tc>
+          <w:tcPr>
+            <w:tcW w:type="dxa" w:w="2808"/>
+            <w:vAlign w:val="center"/>
+          </w:tcPr>
+          <w:p>
+            <w:pPr>
+              <w:spacing w:after="20" w:before="20"/>
+            </w:pPr>
+            <w:r/>
+            <w:r>
+              <w:rPr>
+                <w:b/>
+                <w:i w:val="0"/>
+                <w:color w:val="262626"/>
+                <w:sz w:val="19"/>
+              </w:rPr>
+              <w:t>The APA list says what it is: "These options are built on X".</w:t>
+            </w:r>
+          </w:p>
+        </w:tc>
+        <w:tc>
+          <w:tcPr>
+            <w:tcW w:type="dxa" w:w="4968"/>
+            <w:vAlign w:val="center"/>
+          </w:tcPr>
+          <w:p>
+            <w:pPr>
+              <w:spacing w:after="20" w:before="20"/>
+            </w:pPr>
+            <w:r/>
+            <w:r>
+              <w:rPr>
+                <w:b w:val="0"/>
+                <w:i w:val="0"/>
+                <w:color w:val="262626"/>
+                <w:sz w:val="19"/>
+              </w:rPr>
+              <w:t>Since 7 October 2026 (your B). Conditions 1 and 3: after naming a value, the list heading said "These options best fit X", which could list the person's own option one screen after "It fell short on ... X". It now says "These options are built on X - the value you just prioritized." The same options; every value has an option built on it in all four decisions, so it is always true. Checked live in condition 1.</w:t>
+            </w:r>
+          </w:p>
+        </w:tc>
+        <w:tc>
+          <w:tcPr>
+            <w:tcW w:type="dxa" w:w="1800"/>
+            <w:vAlign w:val="center"/>
+          </w:tcPr>
+          <w:p>
+            <w:pPr>
+              <w:spacing w:after="20" w:before="20"/>
+            </w:pPr>
+            <w:r/>
+            <w:r>
+              <w:rPr>
+                <w:b w:val="0"/>
+                <w:i w:val="0"/>
+                <w:color w:val="595959"/>
+                <w:sz w:val="17"/>
+              </w:rPr>
+              <w:t>validate:conditions (N28)</w:t>
             </w:r>
           </w:p>
         </w:tc>
@@ -10886,75 +10976,6 @@
                 <w:color w:val="262626"/>
                 <w:sz w:val="19"/>
               </w:rPr>
-              <w:t>The APA list heading in conditions 1 and 3 (your decision)</w:t>
-            </w:r>
-          </w:p>
-        </w:tc>
-        <w:tc>
-          <w:tcPr>
-            <w:tcW w:type="dxa" w:w="5904"/>
-            <w:vAlign w:val="center"/>
-          </w:tcPr>
-          <w:p>
-            <w:pPr>
-              <w:spacing w:after="20" w:before="20"/>
-            </w:pPr>
-            <w:r/>
-            <w:r>
-              <w:rPr>
-                <w:b w:val="0"/>
-                <w:i w:val="0"/>
-                <w:color w:val="262626"/>
-                <w:sz w:val="19"/>
-              </w:rPr>
-              <w:t>After a person names a value, the APA page lists options under "These options best fit X - the value you just prioritized." If they name the value their own option is built on, their option is listed there one screen after "It fell short on ... X". Both are true ("best fit" compares the options; "fell short" compares with what they asked for), but it can read like the clash fixed in APA_Only's box. Found 7 October 2026; asked.</w:t>
-            </w:r>
-          </w:p>
-        </w:tc>
-        <w:tc>
-          <w:tcPr>
-            <w:tcW w:type="dxa" w:w="1584"/>
-            <w:vAlign w:val="center"/>
-          </w:tcPr>
-          <w:p>
-            <w:pPr>
-              <w:spacing w:after="20" w:before="20"/>
-            </w:pPr>
-            <w:r/>
-            <w:r>
-              <w:rPr>
-                <w:b w:val="0"/>
-                <w:i w:val="0"/>
-                <w:color w:val="595959"/>
-                <w:sz w:val="19"/>
-              </w:rPr>
-              <w:t>Before Prolific</w:t>
-            </w:r>
-          </w:p>
-        </w:tc>
-      </w:tr>
-      <w:tr>
-        <w:trPr>
-          <w:cantSplit w:val="true"/>
-        </w:trPr>
-        <w:tc>
-          <w:tcPr>
-            <w:tcW w:type="dxa" w:w="2592"/>
-            <w:vAlign w:val="center"/>
-            <w:shd w:val="clear" w:color="auto" w:fill="FFF4E0"/>
-          </w:tcPr>
-          <w:p>
-            <w:pPr>
-              <w:spacing w:after="20" w:before="20"/>
-            </w:pPr>
-            <w:r/>
-            <w:r>
-              <w:rPr>
-                <w:b/>
-                <w:i w:val="0"/>
-                <w:color w:val="262626"/>
-                <w:sz w:val="19"/>
-              </w:rPr>
               <w:t>Your ethics board approves the Prolific consent text</w:t>
             </w:r>
           </w:p>
@@ -13581,7 +13602,7 @@
                 <w:color w:val="595959"/>
                 <w:sz w:val="17"/>
               </w:rPr>
-              <w:t>[PASS] K1  the committed tables are exactly what the recipe produces (200000 draws, 3.3s)</w:t>
+              <w:t>[PASS] K1  the committed tables are exactly what the recipe produces (200000 draws, 3.4s)</w:t>
             </w:r>
           </w:p>
         </w:tc>
@@ -14047,7 +14068,7 @@
                 <w:color w:val="595959"/>
                 <w:sz w:val="17"/>
               </w:rPr>
-              <w:t>7</w:t>
+              <w:t>8</w:t>
             </w:r>
           </w:p>
         </w:tc>
@@ -14492,7 +14513,7 @@
                 <w:color w:val="595959"/>
                 <w:sz w:val="17"/>
               </w:rPr>
-              <w:t>27</w:t>
+              <w:t>28</w:t>
             </w:r>
           </w:p>
         </w:tc>
@@ -14581,7 +14602,7 @@
                 <w:color w:val="595959"/>
                 <w:sz w:val="17"/>
               </w:rPr>
-              <w:t>28</w:t>
+              <w:t>29</w:t>
             </w:r>
           </w:p>
         </w:tc>
@@ -14670,7 +14691,7 @@
                 <w:color w:val="595959"/>
                 <w:sz w:val="17"/>
               </w:rPr>
-              <w:t>5</w:t>
+              <w:t>6</w:t>
             </w:r>
           </w:p>
         </w:tc>
@@ -14827,7 +14848,7 @@
                 <w:color w:val="595959"/>
                 <w:sz w:val="17"/>
               </w:rPr>
-              <w:t>✓ built in 1.01s</w:t>
+              <w:t>✓ built in 950ms</w:t>
             </w:r>
           </w:p>
         </w:tc>

</xml_diff>

<commit_message>
Consent pages: the study takes at least 35 minutes (both doors)
The researcher: "make the consent form in both doors that the minimum time for
this study is 35 minutes". One shared sentence, "The whole study takes at least
35 minutes" (it said "about 40 to 55 minutes"), matching Prolific's listing
(35 minutes, $8.75 = $15.00 an hour). Both consent version stamps moved:
CONSENT_VERSION "2026-10-07-35-minutes", PROLIFIC_CONSENT_VERSION
"2026-10-07-prolific-35-minutes".

T10 holds the sentence in both doors, the old wording gone and both stamps; 4
deliberate breaks, 4 caught. Live on the built site in both doors; the consent
record saved the new stamp. The Prolific plan records the price ($8.75, $11.67
with the fee) and the $1,000 budget; the ethics-board document, the pay-check
how-to and the analysis guide are updated.

Co-Authored-By: Claude Opus 5.5 <noreply@anthropic.com>
</commit_message>
<xml_diff>
--- a/docs/VRDS_Accuracy_Checklist.docx
+++ b/docs/VRDS_Accuracy_Checklist.docx
@@ -41,7 +41,7 @@
           <w:color w:val="595959"/>
           <w:sz w:val="20"/>
         </w:rPr>
-        <w:t>For Waseem and Claude  ·  07 October 2026  ·  code at commit ffbfbf3 on Prolific-branch-Edit_10_1</w:t>
+        <w:t>For Waseem and Claude  ·  07 October 2026  ·  code at commit 16baeda on Prolific-branch-Edit_10_1</w:t>
       </w:r>
     </w:p>
     <w:p>
@@ -60,7 +60,7 @@
         <w:rPr>
           <w:color w:val="595959"/>
         </w:rPr>
-        <w:t xml:space="preserve">  (run 07 October 2026 at 19:56, when this file was made).</w:t>
+        <w:t xml:space="preserve">  (run 07 October 2026 at 20:55, when this file was made).</w:t>
       </w:r>
     </w:p>
     <w:p>
@@ -3530,6 +3530,96 @@
                 <w:sz w:val="19"/>
               </w:rPr>
               <w:t>Since 7 October 2026 (Step 2). Paid through Prolific (no gift card, no minutes rule), one sitting within Prolific's time limit, the Prolific ID instead of the email, "If you fail two or more of them, your submission may be rejected.", withdrawal through Prolific, one tick-box, and "I do not agree" (return the study on Prolific). The text for your ethics board: docs/PROLIFIC_CONSENT_FOR_ETHICS_BOARD.md.</w:t>
+            </w:r>
+          </w:p>
+        </w:tc>
+        <w:tc>
+          <w:tcPr>
+            <w:tcW w:type="dxa" w:w="1800"/>
+            <w:vAlign w:val="center"/>
+          </w:tcPr>
+          <w:p>
+            <w:pPr>
+              <w:spacing w:after="20" w:before="20"/>
+            </w:pPr>
+            <w:r/>
+            <w:r>
+              <w:rPr>
+                <w:b w:val="0"/>
+                <w:i w:val="0"/>
+                <w:color w:val="595959"/>
+                <w:sz w:val="17"/>
+              </w:rPr>
+              <w:t>validate:attention (T10)</w:t>
+            </w:r>
+          </w:p>
+        </w:tc>
+      </w:tr>
+      <w:tr>
+        <w:trPr>
+          <w:cantSplit w:val="true"/>
+        </w:trPr>
+        <w:tc>
+          <w:tcPr>
+            <w:tcW w:type="dxa" w:w="504"/>
+            <w:vAlign w:val="center"/>
+            <w:shd w:val="clear" w:color="auto" w:fill="E8F5EC"/>
+          </w:tcPr>
+          <w:p>
+            <w:pPr>
+              <w:spacing w:after="20" w:before="20"/>
+            </w:pPr>
+            <w:r/>
+            <w:r>
+              <w:rPr>
+                <w:b/>
+                <w:i w:val="0"/>
+                <w:color w:val="1B7A3E"/>
+                <w:sz w:val="22"/>
+              </w:rPr>
+              <w:t>✔</w:t>
+            </w:r>
+          </w:p>
+        </w:tc>
+        <w:tc>
+          <w:tcPr>
+            <w:tcW w:type="dxa" w:w="2808"/>
+            <w:vAlign w:val="center"/>
+          </w:tcPr>
+          <w:p>
+            <w:pPr>
+              <w:spacing w:after="20" w:before="20"/>
+            </w:pPr>
+            <w:r/>
+            <w:r>
+              <w:rPr>
+                <w:b/>
+                <w:i w:val="0"/>
+                <w:color w:val="262626"/>
+                <w:sz w:val="19"/>
+              </w:rPr>
+              <w:t>Both consent pages say the study takes at least 35 minutes.</w:t>
+            </w:r>
+          </w:p>
+        </w:tc>
+        <w:tc>
+          <w:tcPr>
+            <w:tcW w:type="dxa" w:w="4968"/>
+            <w:vAlign w:val="center"/>
+          </w:tcPr>
+          <w:p>
+            <w:pPr>
+              <w:spacing w:after="20" w:before="20"/>
+            </w:pPr>
+            <w:r/>
+            <w:r>
+              <w:rPr>
+                <w:b w:val="0"/>
+                <w:i w:val="0"/>
+                <w:color w:val="262626"/>
+                <w:sz w:val="19"/>
+              </w:rPr>
+              <w:t>Since 7 October 2026 (your request). One shared sentence, "The whole study takes at least 35 minutes" (it said "about 40 to 55 minutes"), the same as Prolific's listing (35 minutes, $8.75 = $15 an hour). Both consent version stamps moved, so every record says which wording it agreed to. The university page changed too: ask your ethics board. Checked live in both versions.</w:t>
             </w:r>
           </w:p>
         </w:tc>
@@ -12644,7 +12734,7 @@
                 <w:color w:val="595959"/>
                 <w:sz w:val="17"/>
               </w:rPr>
-              <w:t>16</w:t>
+              <w:t>15</w:t>
             </w:r>
           </w:p>
         </w:tc>
@@ -13602,7 +13692,7 @@
                 <w:color w:val="595959"/>
                 <w:sz w:val="17"/>
               </w:rPr>
-              <w:t>[PASS] K1  the committed tables are exactly what the recipe produces (200000 draws, 3.4s)</w:t>
+              <w:t>[PASS] K1  the committed tables are exactly what the recipe produces (200000 draws, 3.5s)</w:t>
             </w:r>
           </w:p>
         </w:tc>
@@ -13890,7 +13980,7 @@
                 <w:color w:val="595959"/>
                 <w:sz w:val="17"/>
               </w:rPr>
-              <w:t>10</w:t>
+              <w:t>9</w:t>
             </w:r>
           </w:p>
         </w:tc>
@@ -14068,7 +14158,7 @@
                 <w:color w:val="595959"/>
                 <w:sz w:val="17"/>
               </w:rPr>
-              <w:t>8</w:t>
+              <w:t>7</w:t>
             </w:r>
           </w:p>
         </w:tc>
@@ -14335,7 +14425,7 @@
                 <w:color w:val="595959"/>
                 <w:sz w:val="17"/>
               </w:rPr>
-              <w:t>8</w:t>
+              <w:t>7</w:t>
             </w:r>
           </w:p>
         </w:tc>
@@ -14513,7 +14603,7 @@
                 <w:color w:val="595959"/>
                 <w:sz w:val="17"/>
               </w:rPr>
-              <w:t>28</w:t>
+              <w:t>27</w:t>
             </w:r>
           </w:p>
         </w:tc>
@@ -14602,7 +14692,7 @@
                 <w:color w:val="595959"/>
                 <w:sz w:val="17"/>
               </w:rPr>
-              <w:t>29</w:t>
+              <w:t>26</w:t>
             </w:r>
           </w:p>
         </w:tc>
@@ -14691,7 +14781,7 @@
                 <w:color w:val="595959"/>
                 <w:sz w:val="17"/>
               </w:rPr>
-              <w:t>6</w:t>
+              <w:t>5</w:t>
             </w:r>
           </w:p>
         </w:tc>
@@ -14848,7 +14938,7 @@
                 <w:color w:val="595959"/>
                 <w:sz w:val="17"/>
               </w:rPr>
-              <w:t>✓ built in 950ms</w:t>
+              <w:t>✓ built in 754ms</w:t>
             </w:r>
           </w:p>
         </w:tc>

</xml_diff>

<commit_message>
Documents say BSL4 is the Baseline condition
Waseem: "make sure the experiment documents ... indicate that BSL4 is the
baseline condition". The database never stores the web address, so it always
says condition 4 / "Baseline"; the documents now say that BSL4 in an address
means Baseline, wherever a reader meets the condition codes:

- HOW_TO_READ_MY_DATABASE: the condition fields, condition_source "address",
  and the Baseline section's heading.
- HOW_TO_ANALYZE_MY_DATA: section 1, section 9's opening, 9.2, and a
  14 October 2026 row in 4.9 (only the address bar changed; nothing on the
  page; no participant before this date).
- CLAUDE.md: the four conditions' opening line.
- The accuracy checklist: its builder's two address lists, and the Word file
  rebuilt (every check run first; all pass).
- FRESH_EYE_AUDIT: the log entry for the change.

Co-Authored-By: Claude Opus 5.5 <noreply@anthropic.com>
</commit_message>
<xml_diff>
--- a/docs/VRDS_Accuracy_Checklist.docx
+++ b/docs/VRDS_Accuracy_Checklist.docx
@@ -41,7 +41,7 @@
           <w:color w:val="595959"/>
           <w:sz w:val="20"/>
         </w:rPr>
-        <w:t>For Waseem and Claude  ·  07 October 2026  ·  code at commit 16baeda on Prolific-branch-Edit_10_1</w:t>
+        <w:t>For Waseem and Claude  ·  14 October 2026  ·  code at commit f1a4552 on Prolific-branch-Edit_10_1</w:t>
       </w:r>
     </w:p>
     <w:p>
@@ -60,7 +60,7 @@
         <w:rPr>
           <w:color w:val="595959"/>
         </w:rPr>
-        <w:t xml:space="preserve">  (run 07 October 2026 at 20:55, when this file was made).</w:t>
+        <w:t xml:space="preserve">  (run 14 October 2026 at 08:34, when this file was made).</w:t>
       </w:r>
     </w:p>
     <w:p>
@@ -4789,7 +4789,7 @@
                 <w:color w:val="262626"/>
                 <w:sz w:val="19"/>
               </w:rPr>
-              <w:t>The address shows the condition (?condition=CVR_APA, CVR_Only, APA_Only, Baseline). Opening one of those addresses yourself gives that condition and is never counted (your Q2-yes); /api/conditions/report shows the counts (Q3-yes).</w:t>
+              <w:t>The address shows the condition (?condition=CVR_APA, CVR_Only, APA_Only, BSL4; BSL4 is Baseline, so a participant cannot read "Baseline" there, since 14 October). Opening one of those addresses yourself gives that condition and is never counted (your Q2-yes); /api/conditions/report shows the counts (Q3-yes).</w:t>
             </w:r>
           </w:p>
         </w:tc>
@@ -11294,7 +11294,7 @@
                 <w:color w:val="262626"/>
                 <w:sz w:val="19"/>
               </w:rPr>
-              <w:t>The database holds test runs, and a record carries no stamp of the code version. Decide before launch whether to delete them or mark them. When analysing, always filter on status "Study Completed" and date records by completed_at. The rule for every test run, both doors and Prolific's "Preview as participant": add ?condition=CVR_APA (or CVR_Only, APA_Only, Baseline) to the address, so it is never counted for balance.</w:t>
+              <w:t>The database holds test runs, and a record carries no stamp of the code version. Decide before launch whether to delete them or mark them. When analysing, always filter on status "Study Completed" and date records by completed_at. The rule for every test run, both doors and Prolific's "Preview as participant": add ?condition=CVR_APA (or CVR_Only, APA_Only, BSL4 for Baseline) to the address, so it is never counted for balance.</w:t>
             </w:r>
           </w:p>
         </w:tc>
@@ -13624,7 +13624,7 @@
                 <w:color w:val="595959"/>
                 <w:sz w:val="17"/>
               </w:rPr>
-              <w:t>10</w:t>
+              <w:t>9</w:t>
             </w:r>
           </w:p>
         </w:tc>
@@ -13692,7 +13692,7 @@
                 <w:color w:val="595959"/>
                 <w:sz w:val="17"/>
               </w:rPr>
-              <w:t>[PASS] K1  the committed tables are exactly what the recipe produces (200000 draws, 3.5s)</w:t>
+              <w:t>[PASS] K1  the committed tables are exactly what the recipe produces (200000 draws, 3.2s)</w:t>
             </w:r>
           </w:p>
         </w:tc>
@@ -13802,7 +13802,7 @@
                 <w:color w:val="595959"/>
                 <w:sz w:val="17"/>
               </w:rPr>
-              <w:t>8</w:t>
+              <w:t>7</w:t>
             </w:r>
           </w:p>
         </w:tc>
@@ -13891,7 +13891,7 @@
                 <w:color w:val="595959"/>
                 <w:sz w:val="17"/>
               </w:rPr>
-              <w:t>13</w:t>
+              <w:t>12</w:t>
             </w:r>
           </w:p>
         </w:tc>
@@ -14603,7 +14603,7 @@
                 <w:color w:val="595959"/>
                 <w:sz w:val="17"/>
               </w:rPr>
-              <w:t>27</w:t>
+              <w:t>26</w:t>
             </w:r>
           </w:p>
         </w:tc>
@@ -14692,7 +14692,7 @@
                 <w:color w:val="595959"/>
                 <w:sz w:val="17"/>
               </w:rPr>
-              <w:t>26</w:t>
+              <w:t>25</w:t>
             </w:r>
           </w:p>
         </w:tc>
@@ -14938,7 +14938,7 @@
                 <w:color w:val="595959"/>
                 <w:sz w:val="17"/>
               </w:rPr>
-              <w:t>✓ built in 754ms</w:t>
+              <w:t>✓ built in 742ms</w:t>
             </w:r>
           </w:p>
         </w:tc>

</xml_diff>

<commit_message>
Reading checks at random places; Prolific: two or more failed = rejected
The advisor: attention checks must test reading, not memory, and be
"(somewhat) randomly placed". The two memory questions become two
reading checks in the researcher's approved words, in both doors:
"please choose 'By boat'" after Block 1, 2 or 3 and "please choose
'Reading a book'" after scenario 1, 2 or 3, each place drawn per
participant and saved. The repeated line under the heading is gone.

Prolific door ("1-B"): all four checks count; two or more failed is
the rejection reason, and the consent page now says "will be
rejected". The pay check gains a Reject group. The database stores
the drawn places and failed_two_or_more_attention_checks.

ATTENTION_VERSION and SHAPE_VERSION 2026-10-14-reading-checks,
PROLIFIC_CONSENT_VERSION 2026-10-14-prolific-will-be-rejected.
Full chain passes; 17 deliberate breaks, 17 caught; checked live.

Co-Authored-By: Claude Opus 5.5 <noreply@anthropic.com>
</commit_message>
<xml_diff>
--- a/docs/VRDS_Accuracy_Checklist.docx
+++ b/docs/VRDS_Accuracy_Checklist.docx
@@ -41,7 +41,7 @@
           <w:color w:val="595959"/>
           <w:sz w:val="20"/>
         </w:rPr>
-        <w:t>For Waseem and Claude  ·  14 October 2026  ·  code at commit f1a4552 on Prolific-branch-Edit_10_1</w:t>
+        <w:t>For Waseem and Claude  ·  14 October 2026  ·  code at commit 76acaec on Prolific-branch-Edit_10_1</w:t>
       </w:r>
     </w:p>
     <w:p>
@@ -60,7 +60,7 @@
         <w:rPr>
           <w:color w:val="595959"/>
         </w:rPr>
-        <w:t xml:space="preserve">  (run 14 October 2026 at 08:34, when this file was made).</w:t>
+        <w:t xml:space="preserve">  (run 14 October 2026 at 17:52, when this file was made).</w:t>
       </w:r>
     </w:p>
     <w:p>
@@ -211,7 +211,7 @@
                 <w:color w:val="262626"/>
                 <w:sz w:val="19"/>
               </w:rPr>
-              <w:t>2026-10-07-rehearsal-fixes</w:t>
+              <w:t>2026-10-14-reading-checks</w:t>
             </w:r>
           </w:p>
         </w:tc>
@@ -1538,7 +1538,7 @@
                 <w:color w:val="262626"/>
                 <w:sz w:val="19"/>
               </w:rPr>
-              <w:t>The gift card needs all three attention checks right.</w:t>
+              <w:t>The gift card needs all three attention checks right (university version).</w:t>
             </w:r>
           </w:p>
         </w:tc>
@@ -3529,7 +3529,7 @@
                 <w:color w:val="262626"/>
                 <w:sz w:val="19"/>
               </w:rPr>
-              <w:t>Since 7 October 2026 (Step 2). Paid through Prolific (no gift card, no minutes rule), one sitting within Prolific's time limit, the Prolific ID instead of the email, "If you fail two or more of them, your submission may be rejected.", withdrawal through Prolific, one tick-box, and "I do not agree" (return the study on Prolific). The text for your ethics board: docs/PROLIFIC_CONSENT_FOR_ETHICS_BOARD.md.</w:t>
+              <w:t>Since 7 October 2026 (Step 2). Paid through Prolific (no gift card, no minutes rule), one sitting within Prolific's time limit, the Prolific ID instead of the email, "If you fail two or more of them, your submission will be rejected." ("may be" until 14 October 2026), withdrawal through Prolific, one tick-box, and "I do not agree" (return the study on Prolific). The text for your ethics board: docs/PROLIFIC_CONSENT_FOR_ETHICS_BOARD.md.</w:t>
             </w:r>
           </w:p>
         </w:tc>
@@ -3709,7 +3709,7 @@
                 <w:color w:val="262626"/>
                 <w:sz w:val="19"/>
               </w:rPr>
-              <w:t>Since 7 October 2026 (your 3-B, Step 3). One row in "The tools &amp; the experiment design" and one in "How this experience was for you", two different numbers two to five. Only these two count for Prolific's rule, and failing BOTH is the "look first" flag (a random clicker fails both about 36 times in 49). The university plan is drawn exactly as before (20,000 compared, 0 different), and a run already in progress keeps its answered checks.</w:t>
+              <w:t>Since 7 October 2026 (your 3-B, Step 3). One row in "The tools &amp; the experiment design" and one in "How this experience was for you", two different numbers two to five. Since 14 October 2026 (your 1-B) all FOUR checks count for Prolific's rule (the two reading checks and the two number rows): two or more failed means the submission is rejected, as the consent page says; one failed is never a reason. A random clicker fails two or more 765 times in 784; the daily pay check lists them in its Reject group.</w:t>
             </w:r>
           </w:p>
         </w:tc>
@@ -3730,7 +3730,7 @@
                 <w:color w:val="595959"/>
                 <w:sz w:val="17"/>
               </w:rPr>
-              <w:t>validate:attention (T9)</w:t>
+              <w:t>validate:attention, validate:pay (T9, Y1)</w:t>
             </w:r>
           </w:p>
         </w:tc>
@@ -9557,7 +9557,7 @@
                 <w:color w:val="262626"/>
                 <w:sz w:val="19"/>
               </w:rPr>
-              <w:t>Three very simple attention checks, in your approved words.</w:t>
+              <w:t>Three very simple reading checks, in your approved words, at random places.</w:t>
             </w:r>
           </w:p>
         </w:tc>
@@ -9578,7 +9578,7 @@
                 <w:color w:val="262626"/>
                 <w:sz w:val="19"/>
               </w:rPr>
-              <w:t>"What was the part you just finished about?" right after Block 3, "What was the scenario you just finished about?" right after scenario 3 (each: the right topic and three answers from outside the study, in a random order), and "Pick the number four" in the feedback (two to five, random place). The words are held to the approved text; over 4,000 pretend people each answer order and number comes up about equally.</w:t>
+              <w:t>Since 14 October 2026 (your advisor: test reading, not memory, and place them at random): "How do you usually get to work or class? This question checks that you are reading: please choose 'By boat', whatever your real answer is." after Block 1, 2 or 3, and "Which of these do you enjoy most on a free afternoon? ... please choose 'Reading a book' ..." after scenario 1, 2 or 3 (never between scenarios 4 and 5, never before 6), each place drawn per person; and "Pick the number four" in the feedback (two to five, random place). The words are held to the approved text; over 4,000 pretend people each answer order, each place and each number comes up about equally.</w:t>
             </w:r>
           </w:p>
         </w:tc>
@@ -9668,7 +9668,7 @@
                 <w:color w:val="262626"/>
                 <w:sz w:val="19"/>
               </w:rPr>
-              <w:t>Drawn once and saved; a refresh or another computer shows the same check in the same place, an answered one is never asked again, and a second person on the same computer gets their own.</w:t>
+              <w:t>Drawn once and saved; a refresh or another computer shows the same check in the same place, an answered one is never asked again, and a second person on the same computer gets their own. Checked live on 14 October 2026: the checks after the drawn block and the drawn scenario, the same after a refresh.</w:t>
             </w:r>
           </w:p>
         </w:tc>
@@ -9689,7 +9689,7 @@
                 <w:color w:val="595959"/>
                 <w:sz w:val="17"/>
               </w:rPr>
-              <w:t>validate:attention (T2)</w:t>
+              <w:t>validate:attention (T2, T8)</w:t>
             </w:r>
           </w:p>
         </w:tc>
@@ -9758,7 +9758,7 @@
                 <w:color w:val="262626"/>
                 <w:sz w:val="19"/>
               </w:rPr>
-              <w:t>The screens say it is an attention check, never say right or wrong, and let any pick continue; words only, so fair to colour-blind people. Checked live in the browser, on a computer and a phone.</w:t>
+              <w:t>The screens say it is an attention check, give the instruction once (the repeated line is gone since 14 October 2026), never say right or wrong, and let any pick continue; words only, so fair to colour-blind people. Checked live in the browser, on a computer and a phone.</w:t>
             </w:r>
           </w:p>
         </w:tc>
@@ -11087,7 +11087,7 @@
                 <w:color w:val="262626"/>
                 <w:sz w:val="19"/>
               </w:rPr>
-              <w:t>docs/PROLIFIC_CONSENT_FOR_ETHICS_BOARD.md shows the Prolific version's consent page beside the university's: eight parts differ (payment through Prolific, one sitting, the Prolific ID instead of the email, the two-failure attention rule, one tick-box, "I do not agree"). The Prolific door must not open before the approval.</w:t>
+              <w:t>docs/PROLIFIC_CONSENT_FOR_ETHICS_BOARD.md shows the Prolific version's consent page beside the university's: eight parts differ (payment through Prolific, one sitting, the Prolific ID instead of the email, the attention rule "two or more failed: will be rejected" (since 14 October 2026), one tick-box, "I do not agree"). The Prolific door must not open before the approval.</w:t>
             </w:r>
           </w:p>
         </w:tc>
@@ -12645,7 +12645,7 @@
                 <w:color w:val="595959"/>
                 <w:sz w:val="17"/>
               </w:rPr>
-              <w:t>13</w:t>
+              <w:t>11</w:t>
             </w:r>
           </w:p>
         </w:tc>
@@ -12734,7 +12734,7 @@
                 <w:color w:val="595959"/>
                 <w:sz w:val="17"/>
               </w:rPr>
-              <w:t>15</w:t>
+              <w:t>14</w:t>
             </w:r>
           </w:p>
         </w:tc>
@@ -13692,7 +13692,7 @@
                 <w:color w:val="595959"/>
                 <w:sz w:val="17"/>
               </w:rPr>
-              <w:t>[PASS] K1  the committed tables are exactly what the recipe produces (200000 draws, 3.2s)</w:t>
+              <w:t>[PASS] K1  the committed tables are exactly what the recipe produces (200000 draws, 3.3s)</w:t>
             </w:r>
           </w:p>
         </w:tc>
@@ -13980,7 +13980,7 @@
                 <w:color w:val="595959"/>
                 <w:sz w:val="17"/>
               </w:rPr>
-              <w:t>9</w:t>
+              <w:t>10</w:t>
             </w:r>
           </w:p>
         </w:tc>
@@ -14158,7 +14158,7 @@
                 <w:color w:val="595959"/>
                 <w:sz w:val="17"/>
               </w:rPr>
-              <w:t>7</w:t>
+              <w:t>8</w:t>
             </w:r>
           </w:p>
         </w:tc>
@@ -14425,7 +14425,7 @@
                 <w:color w:val="595959"/>
                 <w:sz w:val="17"/>
               </w:rPr>
-              <w:t>7</w:t>
+              <w:t>8</w:t>
             </w:r>
           </w:p>
         </w:tc>
@@ -14603,7 +14603,7 @@
                 <w:color w:val="595959"/>
                 <w:sz w:val="17"/>
               </w:rPr>
-              <w:t>26</w:t>
+              <w:t>27</w:t>
             </w:r>
           </w:p>
         </w:tc>
@@ -14692,7 +14692,7 @@
                 <w:color w:val="595959"/>
                 <w:sz w:val="17"/>
               </w:rPr>
-              <w:t>25</w:t>
+              <w:t>33</w:t>
             </w:r>
           </w:p>
         </w:tc>
@@ -14938,7 +14938,7 @@
                 <w:color w:val="595959"/>
                 <w:sz w:val="17"/>
               </w:rPr>
-              <w:t>✓ built in 742ms</w:t>
+              <w:t>✓ built in 830ms</w:t>
             </w:r>
           </w:p>
         </w:tc>

</xml_diff>

<commit_message>
Student consent: an "At Least 35 Minutes" request box
One grey box on the Florida Tech consent page only, right after the
study's length: take your time, read carefully, answer as you genuinely
would (not as you think you should), and a few short questions check that
you are reading. It is a request: the course credit is still given on
completion, and the box says so. No word about positions, roles, values,
choices or options. CONSENT_VERSION "2026-10-16-take-your-time".

T10 holds the words, the place, the grey "A request" style, students only
and no design word; 13 deliberate breaks, 13 caught. The researcher sends
the box to the IRB as a small change before it goes live.

Co-Authored-By: Claude Opus 5.5 <noreply@anthropic.com>
</commit_message>
<xml_diff>
--- a/docs/VRDS_Accuracy_Checklist.docx
+++ b/docs/VRDS_Accuracy_Checklist.docx
@@ -41,7 +41,7 @@
           <w:color w:val="595959"/>
           <w:sz w:val="20"/>
         </w:rPr>
-        <w:t>For Waseem and Claude  ·  16 October 2026  ·  code at commit 83d1395 on Prolific-branch-Edit_10_1</w:t>
+        <w:t>For Waseem and Claude  ·  16 October 2026  ·  code at commit 5a9dd5f on Prolific-branch-Edit_10_1</w:t>
       </w:r>
     </w:p>
     <w:p>
@@ -60,7 +60,7 @@
         <w:rPr>
           <w:color w:val="595959"/>
         </w:rPr>
-        <w:t xml:space="preserve">  (run 16 October 2026 at 08:34, when this file was made).</w:t>
+        <w:t xml:space="preserve">  (run 16 October 2026 at 10:05, when this file was made).</w:t>
       </w:r>
     </w:p>
     <w:p>
@@ -1581,6 +1581,96 @@
                 <w:sz w:val="17"/>
               </w:rPr>
               <w:t>validate:attention, validate:journey (T4, T10, J18)</w:t>
+            </w:r>
+          </w:p>
+        </w:tc>
+      </w:tr>
+      <w:tr>
+        <w:trPr>
+          <w:cantSplit w:val="true"/>
+        </w:trPr>
+        <w:tc>
+          <w:tcPr>
+            <w:tcW w:type="dxa" w:w="504"/>
+            <w:vAlign w:val="center"/>
+            <w:shd w:val="clear" w:color="auto" w:fill="E8F5EC"/>
+          </w:tcPr>
+          <w:p>
+            <w:pPr>
+              <w:spacing w:after="20" w:before="20"/>
+            </w:pPr>
+            <w:r/>
+            <w:r>
+              <w:rPr>
+                <w:b/>
+                <w:i w:val="0"/>
+                <w:color w:val="1B7A3E"/>
+                <w:sz w:val="22"/>
+              </w:rPr>
+              <w:t>✔</w:t>
+            </w:r>
+          </w:p>
+        </w:tc>
+        <w:tc>
+          <w:tcPr>
+            <w:tcW w:type="dxa" w:w="2808"/>
+            <w:vAlign w:val="center"/>
+          </w:tcPr>
+          <w:p>
+            <w:pPr>
+              <w:spacing w:after="20" w:before="20"/>
+            </w:pPr>
+            <w:r/>
+            <w:r>
+              <w:rPr>
+                <w:b/>
+                <w:i w:val="0"/>
+                <w:color w:val="262626"/>
+                <w:sz w:val="19"/>
+              </w:rPr>
+              <w:t>Students are asked to take their time (a request box on their consent page only).</w:t>
+            </w:r>
+          </w:p>
+        </w:tc>
+        <w:tc>
+          <w:tcPr>
+            <w:tcW w:type="dxa" w:w="4968"/>
+            <w:vAlign w:val="center"/>
+          </w:tcPr>
+          <w:p>
+            <w:pPr>
+              <w:spacing w:after="20" w:before="20"/>
+            </w:pPr>
+            <w:r/>
+            <w:r>
+              <w:rPr>
+                <w:b w:val="0"/>
+                <w:i w:val="0"/>
+                <w:color w:val="262626"/>
+                <w:sz w:val="19"/>
+              </w:rPr>
+              <w:t>Since 16 October 2026 (your 1-OK, 2-yes). "At Least 35 Minutes" (A request): take your time, read carefully, answer as you genuinely would (not as you think you should), and a few short questions check that you are reading; the course credit is still given on completion. Not one word about positions, roles, values, choices or options. Grey, not orange, so it reads as a request. Checked live on a computer and a phone; not in the Prolific version.</w:t>
+            </w:r>
+          </w:p>
+        </w:tc>
+        <w:tc>
+          <w:tcPr>
+            <w:tcW w:type="dxa" w:w="1800"/>
+            <w:vAlign w:val="center"/>
+          </w:tcPr>
+          <w:p>
+            <w:pPr>
+              <w:spacing w:after="20" w:before="20"/>
+            </w:pPr>
+            <w:r/>
+            <w:r>
+              <w:rPr>
+                <w:b w:val="0"/>
+                <w:i w:val="0"/>
+                <w:color w:val="595959"/>
+                <w:sz w:val="17"/>
+              </w:rPr>
+              <w:t>validate:attention (T10)</w:t>
             </w:r>
           </w:p>
         </w:tc>
@@ -11639,6 +11729,75 @@
                 <w:color w:val="262626"/>
                 <w:sz w:val="19"/>
               </w:rPr>
+              <w:t>Send the "At Least 35 Minutes" box to the IRB office</w:t>
+            </w:r>
+          </w:p>
+        </w:tc>
+        <w:tc>
+          <w:tcPr>
+            <w:tcW w:type="dxa" w:w="5904"/>
+            <w:vAlign w:val="center"/>
+          </w:tcPr>
+          <w:p>
+            <w:pPr>
+              <w:spacing w:after="20" w:before="20"/>
+            </w:pPr>
+            <w:r/>
+            <w:r>
+              <w:rPr>
+                <w:b w:val="0"/>
+                <w:i w:val="0"/>
+                <w:color w:val="262626"/>
+                <w:sz w:val="19"/>
+              </w:rPr>
+              <w:t>A small change to the pending modification: the clean form, the form with the box highlighted (both PDF) and a note to paste are in Downloads/Consent forms/Ready to upload (16 October).</w:t>
+            </w:r>
+          </w:p>
+        </w:tc>
+        <w:tc>
+          <w:tcPr>
+            <w:tcW w:type="dxa" w:w="1584"/>
+            <w:vAlign w:val="center"/>
+          </w:tcPr>
+          <w:p>
+            <w:pPr>
+              <w:spacing w:after="20" w:before="20"/>
+            </w:pPr>
+            <w:r/>
+            <w:r>
+              <w:rPr>
+                <w:b w:val="0"/>
+                <w:i w:val="0"/>
+                <w:color w:val="595959"/>
+                <w:sz w:val="19"/>
+              </w:rPr>
+              <w:t>Before launch</w:t>
+            </w:r>
+          </w:p>
+        </w:tc>
+      </w:tr>
+      <w:tr>
+        <w:trPr>
+          <w:cantSplit w:val="true"/>
+        </w:trPr>
+        <w:tc>
+          <w:tcPr>
+            <w:tcW w:type="dxa" w:w="2592"/>
+            <w:vAlign w:val="center"/>
+            <w:shd w:val="clear" w:color="auto" w:fill="FFF4E0"/>
+          </w:tcPr>
+          <w:p>
+            <w:pPr>
+              <w:spacing w:after="20" w:before="20"/>
+            </w:pPr>
+            <w:r/>
+            <w:r>
+              <w:rPr>
+                <w:b/>
+                <w:i w:val="0"/>
+                <w:color w:val="262626"/>
+                <w:sz w:val="19"/>
+              </w:rPr>
               <w:t>The one-browser rule is only as strong as the email-and-age check</w:t>
             </w:r>
           </w:p>
@@ -12735,7 +12894,7 @@
                 <w:color w:val="595959"/>
                 <w:sz w:val="17"/>
               </w:rPr>
-              <w:t>16</w:t>
+              <w:t>12</w:t>
             </w:r>
           </w:p>
         </w:tc>
@@ -12824,7 +12983,7 @@
                 <w:color w:val="595959"/>
                 <w:sz w:val="17"/>
               </w:rPr>
-              <w:t>33</w:t>
+              <w:t>16</w:t>
             </w:r>
           </w:p>
         </w:tc>
@@ -13714,7 +13873,7 @@
                 <w:color w:val="595959"/>
                 <w:sz w:val="17"/>
               </w:rPr>
-              <w:t>10</w:t>
+              <w:t>9</w:t>
             </w:r>
           </w:p>
         </w:tc>
@@ -13892,7 +14051,7 @@
                 <w:color w:val="595959"/>
                 <w:sz w:val="17"/>
               </w:rPr>
-              <w:t>14</w:t>
+              <w:t>8</w:t>
             </w:r>
           </w:p>
         </w:tc>
@@ -13981,7 +14140,7 @@
                 <w:color w:val="595959"/>
                 <w:sz w:val="17"/>
               </w:rPr>
-              <w:t>14</w:t>
+              <w:t>13</w:t>
             </w:r>
           </w:p>
         </w:tc>
@@ -14871,7 +15030,7 @@
                 <w:color w:val="595959"/>
                 <w:sz w:val="17"/>
               </w:rPr>
-              <w:t>32</w:t>
+              <w:t>30</w:t>
             </w:r>
           </w:p>
         </w:tc>
@@ -15117,7 +15276,7 @@
                 <w:color w:val="595959"/>
                 <w:sz w:val="17"/>
               </w:rPr>
-              <w:t>✓ built in 3.44s</w:t>
+              <w:t>✓ built in 932ms</w:t>
             </w:r>
           </w:p>
         </w:tc>
@@ -15138,7 +15297,7 @@
                 <w:color w:val="595959"/>
                 <w:sz w:val="17"/>
               </w:rPr>
-              <w:t>5</w:t>
+              <w:t>2</w:t>
             </w:r>
           </w:p>
         </w:tc>

</xml_diff>